<commit_message>
feat: Initial commit with semester 2 labs, independent works, and Qt6 Complex Calculator
</commit_message>
<xml_diff>
--- a/kurs/Нгуен_Чонг_Хай_Хоанг_ДИНРб_1_курс_КУРСОВОЙ_ПРОЕКТ_2026.docx
+++ b/kurs/Нгуен_Чонг_Хай_Хоанг_ДИНРб_1_курс_КУРСОВОЙ_ПРОЕКТ_2026.docx
@@ -317,7 +317,7 @@
       </w:tr>
       <w:tr>
         <w:trPr>
-          <w:trHeight w:hRule="exact" w:val="1800"/>
+          <w:trHeight w:hRule="exact" w:val="2367"/>
         </w:trPr>
         <w:tc>
           <w:tcPr>
@@ -417,7 +417,7 @@
       </w:tr>
       <w:tr>
         <w:trPr>
-          <w:trHeight w:hRule="exact" w:val="4108"/>
+          <w:trHeight w:hRule="exact" w:val="3683"/>
         </w:trPr>
         <w:tc>
           <w:tcPr>
@@ -487,7 +487,19 @@
               <w:rPr>
                 <w:bCs/>
               </w:rPr>
-              <w:t>Оценка, полученная на защите «____________________»</w:t>
+              <w:t>Оценка, полученная на защите</w:t>
+            </w:r>
+            <w:r>
+              <w:rPr>
+                <w:bCs/>
+              </w:rPr>
+              <w:t xml:space="preserve"> </w:t>
+            </w:r>
+            <w:r>
+              <w:rPr>
+                <w:bCs/>
+              </w:rPr>
+              <w:t>«____________________»</w:t>
             </w:r>
           </w:p>
           <w:p>
@@ -537,7 +549,31 @@
               <w:rPr>
                 <w:bCs/>
               </w:rPr>
-              <w:t>группы ДИНРб-11</w:t>
+              <w:t>группы ДИ</w:t>
+            </w:r>
+            <w:r>
+              <w:rPr>
+                <w:bCs/>
+              </w:rPr>
+              <w:t>Н</w:t>
+            </w:r>
+            <w:r>
+              <w:rPr>
+                <w:bCs/>
+              </w:rPr>
+              <w:t>Рб-</w:t>
+            </w:r>
+            <w:r>
+              <w:rPr>
+                <w:bCs/>
+              </w:rPr>
+              <w:t>1</w:t>
+            </w:r>
+            <w:r>
+              <w:rPr>
+                <w:bCs/>
+              </w:rPr>
+              <w:t>1</w:t>
             </w:r>
             <w:r>
               <w:rPr>
@@ -602,6 +638,11 @@
                 <w:bCs/>
               </w:rPr>
               <w:br/>
+            </w:r>
+            <w:r>
+              <w:rPr>
+                <w:bCs/>
+              </w:rPr>
               <w:t>ассис</w:t>
             </w:r>
             <w:r>
@@ -621,12 +662,6 @@
                 <w:bCs/>
               </w:rPr>
               <w:t xml:space="preserve"> </w:t>
-            </w:r>
-            <w:r>
-              <w:rPr>
-                <w:bCs/>
-              </w:rPr>
-              <w:t>___________________</w:t>
             </w:r>
           </w:p>
         </w:tc>
@@ -757,7 +792,6 @@
               </w:rPr>
               <w:t>_</w:t>
             </w:r>
-            <w:proofErr w:type="spellStart"/>
             <w:r>
               <w:rPr>
                 <w:u w:val="single"/>
@@ -766,6 +800,12 @@
             </w:r>
             <w:r>
               <w:rPr>
+                <w:u w:val="single"/>
+              </w:rPr>
+              <w:t xml:space="preserve"> </w:t>
+            </w:r>
+            <w:r>
+              <w:rPr>
                 <w:b/>
               </w:rPr>
               <w:t>_</w:t>
@@ -774,14 +814,7 @@
               <w:rPr>
                 <w:u w:val="single"/>
               </w:rPr>
-              <w:t>Девяткина</w:t>
-            </w:r>
-            <w:proofErr w:type="spellEnd"/>
-            <w:r>
-              <w:rPr>
-                <w:u w:val="single"/>
-              </w:rPr>
-              <w:t xml:space="preserve"> Е.П.</w:t>
+              <w:t>Девяткина Е.П.</w:t>
             </w:r>
           </w:p>
           <w:p>
@@ -832,6 +865,16 @@
           <w:color w:val="000000"/>
           <w:lang w:eastAsia="ru-RU"/>
         </w:rPr>
+        <w:sectPr>
+          <w:headerReference w:type="default" r:id="rId9"/>
+          <w:footerReference w:type="default" r:id="rId10"/>
+          <w:headerReference w:type="first" r:id="rId11"/>
+          <w:pgSz w:w="11906" w:h="16838"/>
+          <w:pgMar w:top="1418" w:right="851" w:bottom="851" w:left="1134" w:header="709" w:footer="709" w:gutter="0"/>
+          <w:cols w:space="708"/>
+          <w:titlePg/>
+          <w:docGrid w:linePitch="360"/>
+        </w:sectPr>
       </w:pPr>
       <w:r>
         <w:rPr>
@@ -839,7 +882,15 @@
           <w:color w:val="000000"/>
           <w:lang w:eastAsia="ru-RU"/>
         </w:rPr>
-        <w:t>Астрахань – 2026</w:t>
+        <w:t>Астрахань – 202</w:t>
+      </w:r>
+      <w:r>
+        <w:rPr>
+          <w:b/>
+          <w:color w:val="000000"/>
+          <w:lang w:eastAsia="ru-RU"/>
+        </w:rPr>
+        <w:t>6</w:t>
       </w:r>
     </w:p>
     <w:p>
@@ -986,7 +1037,15 @@
                 <w:color w:val="000000"/>
                 <w:lang w:eastAsia="ru-RU"/>
               </w:rPr>
-              <w:t>В.Ю. Кузнецова _</w:t>
+              <w:t xml:space="preserve">В.Ю. Кузнецова </w:t>
+            </w:r>
+            <w:r>
+              <w:rPr>
+                <w:rFonts w:ascii="Times New Roman" w:hAnsi="Times New Roman"/>
+                <w:color w:val="000000"/>
+                <w:lang w:eastAsia="ru-RU"/>
+              </w:rPr>
+              <w:t>_</w:t>
             </w:r>
             <w:r>
               <w:rPr>
@@ -1587,6 +1646,8 @@
               <w:rPr>
                 <w:rFonts w:ascii="Times New Roman" w:hAnsi="Times New Roman"/>
                 <w:bCs/>
+                <w:i/>
+                <w:iCs/>
                 <w:u w:val="single" w:color="000000"/>
                 <w:lang w:eastAsia="ru-RU"/>
               </w:rPr>
@@ -1596,7 +1657,6 @@
               <w:rPr>
                 <w:rFonts w:ascii="Times New Roman" w:hAnsi="Times New Roman"/>
                 <w:bCs/>
-                <w:u w:val="single" w:color="000000"/>
                 <w:lang w:eastAsia="ru-RU"/>
               </w:rPr>
               <w:t>______________</w:t>
@@ -1829,22 +1889,35 @@
                 <w:sz w:val="16"/>
                 <w:lang w:eastAsia="ru-RU"/>
               </w:rPr>
-              <w:t xml:space="preserve">                                                                 Подпись                      ФИО</w:t>
-            </w:r>
-          </w:p>
-          <w:p>
-            <w:pPr>
-              <w:widowControl/>
-              <w:spacing w:after="104" w:line="259" w:lineRule="auto"/>
-              <w:ind w:firstLine="0"/>
-              <w:rPr>
-                <w:b/>
-                <w:i/>
-                <w:color w:val="FF0000"/>
-                <w:u w:val="single" w:color="000000"/>
+              <w:t xml:space="preserve">                                                                 </w:t>
+            </w:r>
+            <w:r>
+              <w:rPr>
+                <w:rFonts w:ascii="Times New Roman" w:hAnsi="Times New Roman"/>
+                <w:color w:val="000000"/>
+                <w:sz w:val="16"/>
                 <w:lang w:eastAsia="ru-RU"/>
               </w:rPr>
-            </w:pPr>
+              <w:t xml:space="preserve">Подпись    </w:t>
+            </w:r>
+            <w:r>
+              <w:rPr>
+                <w:rFonts w:ascii="Times New Roman" w:hAnsi="Times New Roman"/>
+                <w:color w:val="000000"/>
+                <w:sz w:val="16"/>
+                <w:lang w:eastAsia="ru-RU"/>
+              </w:rPr>
+              <w:t xml:space="preserve">                  </w:t>
+            </w:r>
+            <w:r>
+              <w:rPr>
+                <w:rFonts w:ascii="Times New Roman" w:hAnsi="Times New Roman"/>
+                <w:color w:val="000000"/>
+                <w:sz w:val="16"/>
+                <w:lang w:eastAsia="ru-RU"/>
+              </w:rPr>
+              <w:t>ФИО</w:t>
+            </w:r>
           </w:p>
         </w:tc>
         <w:tc>
@@ -2238,6 +2311,7 @@
     <w:p>
       <w:pPr>
         <w:widowControl/>
+        <w:ind w:firstLine="0"/>
         <w:jc w:val="center"/>
         <w:rPr>
           <w:b/>
@@ -2245,18 +2319,31 @@
           <w:lang w:eastAsia="ru-RU"/>
         </w:rPr>
       </w:pPr>
-      <w:r>
+    </w:p>
+    <w:p>
+      <w:pPr>
+        <w:widowControl/>
+        <w:ind w:firstLine="0"/>
+        <w:jc w:val="center"/>
         <w:rPr>
           <w:b/>
           <w:color w:val="000000"/>
           <w:lang w:eastAsia="ru-RU"/>
         </w:rPr>
+      </w:pPr>
+      <w:r>
+        <w:rPr>
+          <w:b/>
+          <w:color w:val="000000"/>
+          <w:lang w:eastAsia="ru-RU"/>
+        </w:rPr>
         <w:t>Задачи</w:t>
       </w:r>
     </w:p>
     <w:p>
       <w:pPr>
         <w:widowControl/>
+        <w:spacing w:line="240" w:lineRule="auto"/>
         <w:rPr>
           <w:lang w:eastAsia="ru-RU"/>
         </w:rPr>
@@ -2275,18 +2362,30 @@
           <w:ilvl w:val="0"/>
           <w:numId w:val="54"/>
         </w:numPr>
+        <w:tabs>
+          <w:tab w:val="left" w:pos="993"/>
+          <w:tab w:val="left" w:pos="1134"/>
+        </w:tabs>
+        <w:spacing w:line="240" w:lineRule="auto"/>
         <w:ind w:left="0" w:firstLine="709"/>
+        <w:rPr>
+          <w:bCs/>
+          <w:lang w:eastAsia="ru-RU"/>
+        </w:rPr>
+      </w:pPr>
+      <w:r>
         <w:rPr>
           <w:bCs/>
           <w:lang w:val="ru-RU" w:eastAsia="ru-RU"/>
         </w:rPr>
-      </w:pPr>
+        <w:t>З</w:t>
+      </w:r>
       <w:r>
         <w:rPr>
           <w:bCs/>
           <w:lang w:val="ru-RU" w:eastAsia="ru-RU"/>
         </w:rPr>
-        <w:t>Запрашивает у пользователя входное строковое математическое выражение, содержащее комплексные числа в алгебраической ил полярной форме, а также встроенные функции;</w:t>
+        <w:t>апрашивает у пользователя входное строковое математическое выражение, содержащее комплексные числа в алгебраической ил полярной форме, а также встроенные функции;</w:t>
       </w:r>
     </w:p>
     <w:p>
@@ -2296,10 +2395,15 @@
           <w:ilvl w:val="0"/>
           <w:numId w:val="54"/>
         </w:numPr>
+        <w:tabs>
+          <w:tab w:val="left" w:pos="993"/>
+          <w:tab w:val="left" w:pos="1134"/>
+        </w:tabs>
+        <w:spacing w:line="240" w:lineRule="auto"/>
         <w:ind w:left="0" w:firstLine="709"/>
         <w:rPr>
           <w:bCs/>
-          <w:lang w:val="ru-RU" w:eastAsia="ru-RU"/>
+          <w:lang w:eastAsia="ru-RU"/>
         </w:rPr>
       </w:pPr>
       <w:r>
@@ -2317,31 +2421,118 @@
           <w:ilvl w:val="0"/>
           <w:numId w:val="54"/>
         </w:numPr>
+        <w:tabs>
+          <w:tab w:val="left" w:pos="993"/>
+          <w:tab w:val="left" w:pos="1134"/>
+        </w:tabs>
+        <w:spacing w:line="240" w:lineRule="auto"/>
         <w:ind w:left="0" w:firstLine="709"/>
+        <w:rPr>
+          <w:bCs/>
+          <w:lang w:eastAsia="ru-RU"/>
+        </w:rPr>
+      </w:pPr>
+      <w:r>
         <w:rPr>
           <w:bCs/>
           <w:lang w:val="ru-RU" w:eastAsia="ru-RU"/>
         </w:rPr>
-      </w:pPr>
+        <w:t>Сохраняет журнал выполненных операций и результатов вычислений в файлы форматов</w:t>
+      </w:r>
       <w:r>
         <w:rPr>
           <w:bCs/>
           <w:lang w:val="ru-RU" w:eastAsia="ru-RU"/>
         </w:rPr>
-        <w:t>Сохраняет журнал выполненных операций и результатов вычислений в файлы форматов CSV, JSON, XLSX, DOCX и TXT.</w:t>
+        <w:t xml:space="preserve"> </w:t>
+      </w:r>
+      <w:r>
+        <w:rPr>
+          <w:bCs/>
+          <w:lang w:val="en-US" w:eastAsia="ru-RU"/>
+        </w:rPr>
+        <w:t>CSV</w:t>
+      </w:r>
+      <w:r>
+        <w:rPr>
+          <w:bCs/>
+          <w:lang w:val="ru-RU" w:eastAsia="ru-RU"/>
+        </w:rPr>
+        <w:t xml:space="preserve">, </w:t>
+      </w:r>
+      <w:r>
+        <w:rPr>
+          <w:bCs/>
+          <w:lang w:val="en-US" w:eastAsia="ru-RU"/>
+        </w:rPr>
+        <w:t>JSON</w:t>
+      </w:r>
+      <w:r>
+        <w:rPr>
+          <w:bCs/>
+          <w:lang w:val="ru-RU" w:eastAsia="ru-RU"/>
+        </w:rPr>
+        <w:t xml:space="preserve">, </w:t>
+      </w:r>
+      <w:r>
+        <w:rPr>
+          <w:bCs/>
+          <w:lang w:val="en-US" w:eastAsia="ru-RU"/>
+        </w:rPr>
+        <w:t>XLSX</w:t>
+      </w:r>
+      <w:r>
+        <w:rPr>
+          <w:bCs/>
+          <w:lang w:val="ru-RU" w:eastAsia="ru-RU"/>
+        </w:rPr>
+        <w:t xml:space="preserve">, </w:t>
+      </w:r>
+      <w:r>
+        <w:rPr>
+          <w:bCs/>
+          <w:lang w:val="en-US" w:eastAsia="ru-RU"/>
+        </w:rPr>
+        <w:t>DOCX</w:t>
+      </w:r>
+      <w:r>
+        <w:rPr>
+          <w:bCs/>
+          <w:lang w:val="ru-RU" w:eastAsia="ru-RU"/>
+        </w:rPr>
+        <w:t xml:space="preserve"> </w:t>
+      </w:r>
+      <w:r>
+        <w:rPr>
+          <w:bCs/>
+          <w:lang w:val="ru-RU" w:eastAsia="ru-RU"/>
+        </w:rPr>
+        <w:t xml:space="preserve">и </w:t>
+      </w:r>
+      <w:r>
+        <w:rPr>
+          <w:bCs/>
+          <w:lang w:val="en-US" w:eastAsia="ru-RU"/>
+        </w:rPr>
+        <w:t>TXT</w:t>
+      </w:r>
+      <w:r>
+        <w:rPr>
+          <w:bCs/>
+          <w:lang w:val="ru-RU" w:eastAsia="ru-RU"/>
+        </w:rPr>
+        <w:t>.</w:t>
       </w:r>
     </w:p>
     <w:p>
       <w:pPr>
         <w:widowControl/>
-        <w:spacing w:before="240" w:after="96" w:line="264" w:lineRule="auto"/>
+        <w:spacing w:before="120" w:after="96" w:line="240" w:lineRule="auto"/>
         <w:ind w:left="11" w:right="510" w:hanging="11"/>
         <w:jc w:val="center"/>
         <w:rPr>
           <w:b/>
           <w:bCs/>
-          <w:i/>
-          <w:iCs/>
           <w:color w:val="000000"/>
           <w:lang w:eastAsia="ru-RU"/>
         </w:rPr>
@@ -2350,12 +2541,9 @@
         <w:rPr>
           <w:b/>
           <w:bCs/>
-          <w:i/>
-          <w:iCs/>
           <w:color w:val="000000"/>
           <w:lang w:eastAsia="ru-RU"/>
         </w:rPr>
-        <w:lastRenderedPageBreak/>
         <w:t>Список рекомендуемой литературы</w:t>
       </w:r>
     </w:p>
@@ -2367,20 +2555,49 @@
           <w:ilvl w:val="0"/>
           <w:numId w:val="55"/>
         </w:numPr>
+        <w:spacing w:line="240" w:lineRule="auto"/>
         <w:ind w:left="0" w:firstLine="709"/>
         <w:contextualSpacing/>
         <w:rPr>
           <w:szCs w:val="24"/>
+        </w:rPr>
+        <w:sectPr>
+          <w:pgSz w:w="11906" w:h="16838"/>
+          <w:pgMar w:top="1418" w:right="851" w:bottom="851" w:left="1134" w:header="709" w:footer="709" w:gutter="0"/>
+          <w:cols w:space="708"/>
+          <w:titlePg/>
+          <w:docGrid w:linePitch="360"/>
+        </w:sectPr>
+      </w:pPr>
+      <w:r>
+        <w:rPr>
+          <w:szCs w:val="24"/>
+        </w:rPr>
+        <w:t>Бьерн Страуструп. Язык программирования C++. – СПб.: Питер, 2012. – 369 с 2 Ландау Л.Д., Лифшиц Е.М. Теоретическая физика: Учебное пособие. Том 1. Механика. – М.: Наука, 1988.</w:t>
+      </w:r>
+      <w:r>
+        <w:rPr>
+          <w:szCs w:val="24"/>
           <w:lang w:val="ru-RU"/>
         </w:rPr>
-      </w:pPr>
-      <w:r>
-        <w:rPr>
-          <w:szCs w:val="24"/>
-          <w:lang w:val="ru-RU"/>
-        </w:rPr>
-        <w:t xml:space="preserve">Бьерн Страуструп. Язык программирования C++. – СПб.: Питер, 2012. – 369 с 2 Ландау Л.Д., Лифшиц Е.М. Теоретическая физика: Учебное пособие. Том 1. Механика. – М.: Наука, 1988. – 224 с.    </w:t>
-      </w:r>
+        <w:t> </w:t>
+      </w:r>
+      <w:r>
+        <w:rPr>
+          <w:szCs w:val="24"/>
+        </w:rPr>
+        <w:t xml:space="preserve">– 224 с.   </w:t>
+      </w:r>
+    </w:p>
+    <w:p>
+      <w:pPr>
+        <w:spacing w:line="240" w:lineRule="auto"/>
+        <w:ind w:firstLine="0"/>
+        <w:contextualSpacing/>
+        <w:rPr>
+          <w:szCs w:val="24"/>
+        </w:rPr>
+      </w:pPr>
     </w:p>
     <w:tbl>
       <w:tblPr>
@@ -2475,7 +2692,23 @@
                 <w:color w:val="000000"/>
                 <w:lang w:eastAsia="ru-RU"/>
               </w:rPr>
-              <w:t>к.т.н., доцент</w:t>
+              <w:t>к</w:t>
+            </w:r>
+            <w:r>
+              <w:rPr>
+                <w:rFonts w:ascii="Times New Roman" w:hAnsi="Times New Roman"/>
+                <w:color w:val="000000"/>
+                <w:lang w:eastAsia="ru-RU"/>
+              </w:rPr>
+              <w:t xml:space="preserve">.т.н., </w:t>
+            </w:r>
+            <w:r>
+              <w:rPr>
+                <w:rFonts w:ascii="Times New Roman" w:hAnsi="Times New Roman"/>
+                <w:color w:val="000000"/>
+                <w:lang w:eastAsia="ru-RU"/>
+              </w:rPr>
+              <w:t>доцент</w:t>
             </w:r>
           </w:p>
           <w:p>
@@ -3331,9 +3564,18 @@
                 <w:rFonts w:ascii="Times New Roman" w:hAnsi="Times New Roman"/>
                 <w:color w:val="000000"/>
                 <w:szCs w:val="24"/>
+                <w:lang w:val="en-US" w:eastAsia="ru-RU"/>
+              </w:rPr>
+            </w:pPr>
+            <w:r>
+              <w:rPr>
+                <w:rFonts w:ascii="Times New Roman" w:hAnsi="Times New Roman"/>
+                <w:color w:val="000000"/>
+                <w:szCs w:val="24"/>
                 <w:lang w:eastAsia="ru-RU"/>
               </w:rPr>
-            </w:pPr>
+              <w:t>10</w:t>
+            </w:r>
             <w:r>
               <w:rPr>
                 <w:rFonts w:ascii="Times New Roman" w:hAnsi="Times New Roman"/>
@@ -3341,23 +3583,14 @@
                 <w:szCs w:val="24"/>
                 <w:lang w:eastAsia="ru-RU"/>
               </w:rPr>
-              <w:t>10</w:t>
+              <w:t>.03.202</w:t>
             </w:r>
             <w:r>
               <w:rPr>
                 <w:rFonts w:ascii="Times New Roman" w:hAnsi="Times New Roman"/>
                 <w:color w:val="000000"/>
                 <w:szCs w:val="24"/>
-                <w:lang w:eastAsia="ru-RU"/>
-              </w:rPr>
-              <w:t>.03.202</w:t>
-            </w:r>
-            <w:r>
-              <w:rPr>
-                <w:rFonts w:ascii="Times New Roman" w:hAnsi="Times New Roman"/>
-                <w:color w:val="000000"/>
-                <w:szCs w:val="24"/>
-                <w:lang w:eastAsia="ru-RU"/>
+                <w:lang w:val="en-US" w:eastAsia="ru-RU"/>
               </w:rPr>
               <w:t>6</w:t>
             </w:r>
@@ -3567,9 +3800,18 @@
                 <w:rFonts w:ascii="Times New Roman" w:hAnsi="Times New Roman"/>
                 <w:color w:val="000000"/>
                 <w:szCs w:val="24"/>
+                <w:lang w:val="en-US" w:eastAsia="ru-RU"/>
+              </w:rPr>
+            </w:pPr>
+            <w:r>
+              <w:rPr>
+                <w:rFonts w:ascii="Times New Roman" w:hAnsi="Times New Roman"/>
+                <w:color w:val="000000"/>
+                <w:szCs w:val="24"/>
                 <w:lang w:eastAsia="ru-RU"/>
               </w:rPr>
-            </w:pPr>
+              <w:t>2</w:t>
+            </w:r>
             <w:r>
               <w:rPr>
                 <w:rFonts w:ascii="Times New Roman" w:hAnsi="Times New Roman"/>
@@ -3577,7 +3819,7 @@
                 <w:szCs w:val="24"/>
                 <w:lang w:eastAsia="ru-RU"/>
               </w:rPr>
-              <w:t>2</w:t>
+              <w:t>4</w:t>
             </w:r>
             <w:r>
               <w:rPr>
@@ -3586,23 +3828,14 @@
                 <w:szCs w:val="24"/>
                 <w:lang w:eastAsia="ru-RU"/>
               </w:rPr>
-              <w:t>4</w:t>
+              <w:t>.03.202</w:t>
             </w:r>
             <w:r>
               <w:rPr>
                 <w:rFonts w:ascii="Times New Roman" w:hAnsi="Times New Roman"/>
                 <w:color w:val="000000"/>
                 <w:szCs w:val="24"/>
-                <w:lang w:eastAsia="ru-RU"/>
-              </w:rPr>
-              <w:t>.03.202</w:t>
-            </w:r>
-            <w:r>
-              <w:rPr>
-                <w:rFonts w:ascii="Times New Roman" w:hAnsi="Times New Roman"/>
-                <w:color w:val="000000"/>
-                <w:szCs w:val="24"/>
-                <w:lang w:eastAsia="ru-RU"/>
+                <w:lang w:val="en-US" w:eastAsia="ru-RU"/>
               </w:rPr>
               <w:t>6</w:t>
             </w:r>
@@ -3787,9 +4020,18 @@
                 <w:rFonts w:ascii="Times New Roman" w:hAnsi="Times New Roman"/>
                 <w:color w:val="000000"/>
                 <w:szCs w:val="24"/>
+                <w:lang w:val="en-US" w:eastAsia="ru-RU"/>
+              </w:rPr>
+            </w:pPr>
+            <w:r>
+              <w:rPr>
+                <w:rFonts w:ascii="Times New Roman" w:hAnsi="Times New Roman"/>
+                <w:color w:val="000000"/>
+                <w:szCs w:val="24"/>
                 <w:lang w:eastAsia="ru-RU"/>
               </w:rPr>
-            </w:pPr>
+              <w:t>21</w:t>
+            </w:r>
             <w:r>
               <w:rPr>
                 <w:rFonts w:ascii="Times New Roman" w:hAnsi="Times New Roman"/>
@@ -3797,23 +4039,14 @@
                 <w:szCs w:val="24"/>
                 <w:lang w:eastAsia="ru-RU"/>
               </w:rPr>
-              <w:t>21</w:t>
+              <w:t>.04.202</w:t>
             </w:r>
             <w:r>
               <w:rPr>
                 <w:rFonts w:ascii="Times New Roman" w:hAnsi="Times New Roman"/>
                 <w:color w:val="000000"/>
                 <w:szCs w:val="24"/>
-                <w:lang w:eastAsia="ru-RU"/>
-              </w:rPr>
-              <w:t>.04.202</w:t>
-            </w:r>
-            <w:r>
-              <w:rPr>
-                <w:rFonts w:ascii="Times New Roman" w:hAnsi="Times New Roman"/>
-                <w:color w:val="000000"/>
-                <w:szCs w:val="24"/>
-                <w:lang w:eastAsia="ru-RU"/>
+                <w:lang w:val="en-US" w:eastAsia="ru-RU"/>
               </w:rPr>
               <w:t>6</w:t>
             </w:r>
@@ -4046,9 +4279,18 @@
                 <w:rFonts w:ascii="Times New Roman" w:hAnsi="Times New Roman"/>
                 <w:color w:val="000000"/>
                 <w:szCs w:val="24"/>
+                <w:lang w:val="en-US" w:eastAsia="ru-RU"/>
+              </w:rPr>
+            </w:pPr>
+            <w:r>
+              <w:rPr>
+                <w:rFonts w:ascii="Times New Roman" w:hAnsi="Times New Roman"/>
+                <w:color w:val="000000"/>
+                <w:szCs w:val="24"/>
                 <w:lang w:eastAsia="ru-RU"/>
               </w:rPr>
-            </w:pPr>
+              <w:t>02</w:t>
+            </w:r>
             <w:r>
               <w:rPr>
                 <w:rFonts w:ascii="Times New Roman" w:hAnsi="Times New Roman"/>
@@ -4056,7 +4298,7 @@
                 <w:szCs w:val="24"/>
                 <w:lang w:eastAsia="ru-RU"/>
               </w:rPr>
-              <w:t>02</w:t>
+              <w:t>.0</w:t>
             </w:r>
             <w:r>
               <w:rPr>
@@ -4065,7 +4307,7 @@
                 <w:szCs w:val="24"/>
                 <w:lang w:eastAsia="ru-RU"/>
               </w:rPr>
-              <w:t>.0</w:t>
+              <w:t>6</w:t>
             </w:r>
             <w:r>
               <w:rPr>
@@ -4074,23 +4316,14 @@
                 <w:szCs w:val="24"/>
                 <w:lang w:eastAsia="ru-RU"/>
               </w:rPr>
-              <w:t>6</w:t>
+              <w:t>.202</w:t>
             </w:r>
             <w:r>
               <w:rPr>
                 <w:rFonts w:ascii="Times New Roman" w:hAnsi="Times New Roman"/>
                 <w:color w:val="000000"/>
                 <w:szCs w:val="24"/>
-                <w:lang w:eastAsia="ru-RU"/>
-              </w:rPr>
-              <w:t>.202</w:t>
-            </w:r>
-            <w:r>
-              <w:rPr>
-                <w:rFonts w:ascii="Times New Roman" w:hAnsi="Times New Roman"/>
-                <w:color w:val="000000"/>
-                <w:szCs w:val="24"/>
-                <w:lang w:eastAsia="ru-RU"/>
+                <w:lang w:val="en-US" w:eastAsia="ru-RU"/>
               </w:rPr>
               <w:t>6</w:t>
             </w:r>
@@ -4288,7 +4521,7 @@
     <w:p>
       <w:pPr>
         <w:widowControl/>
-        <w:spacing w:after="96" w:line="265" w:lineRule="auto"/>
+        <w:spacing w:before="200" w:after="96" w:line="265" w:lineRule="auto"/>
         <w:ind w:left="-5" w:right="5" w:hanging="10"/>
         <w:rPr>
           <w:color w:val="000000"/>
@@ -4357,7 +4590,14 @@
       <w:proofErr w:type="spellEnd"/>
       <w:r>
         <w:rPr>
-          <w:b/>
+          <w:bCs/>
+          <w:lang w:eastAsia="ru-RU"/>
+        </w:rPr>
+        <w:t>__________________</w:t>
+      </w:r>
+      <w:r>
+        <w:rPr>
+          <w:bCs/>
           <w:lang w:eastAsia="ru-RU"/>
         </w:rPr>
         <w:t>,</w:t>
@@ -4394,7 +4634,7 @@
       <w:pPr>
         <w:widowControl/>
         <w:spacing w:after="411" w:line="265" w:lineRule="auto"/>
-        <w:ind w:left="-5" w:hanging="10"/>
+        <w:ind w:left="1411" w:firstLine="713"/>
         <w:jc w:val="left"/>
         <w:rPr>
           <w:color w:val="000000"/>
@@ -4430,7 +4670,6 @@
           <w:color w:val="000000"/>
           <w:lang w:eastAsia="ru-RU"/>
         </w:rPr>
-        <w:lastRenderedPageBreak/>
         <w:t>График курсового проектирования выполнен</w:t>
       </w:r>
     </w:p>
@@ -4621,6 +4860,7 @@
         <w:p>
           <w:pPr>
             <w:pStyle w:val="af6"/>
+            <w:spacing w:line="360" w:lineRule="auto"/>
             <w:jc w:val="center"/>
             <w:rPr>
               <w:rFonts w:ascii="Times New Roman" w:hAnsi="Times New Roman"/>
@@ -5229,7 +5469,16 @@
                 <w:noProof/>
                 <w:szCs w:val="24"/>
               </w:rPr>
-              <w:t>1.5.1. Аналог №1 – Microsoft math Solver</w:t>
+              <w:t xml:space="preserve">1.5.1. Аналог №1 – </w:t>
+            </w:r>
+            <w:r>
+              <w:rPr>
+                <w:rStyle w:val="a9"/>
+                <w:noProof/>
+                <w:szCs w:val="24"/>
+                <w:lang w:val="en-US"/>
+              </w:rPr>
+              <w:t>Microsoft math Solver</w:t>
             </w:r>
             <w:r>
               <w:rPr>
@@ -5310,7 +5559,16 @@
                 <w:noProof/>
                 <w:szCs w:val="24"/>
               </w:rPr>
-              <w:t>1.5.2. Аналог №2 – Wolfram Alpha</w:t>
+              <w:t>1.5.2. Аналог №2 –</w:t>
+            </w:r>
+            <w:r>
+              <w:rPr>
+                <w:rStyle w:val="a9"/>
+                <w:noProof/>
+                <w:szCs w:val="24"/>
+                <w:lang w:val="en-US"/>
+              </w:rPr>
+              <w:t xml:space="preserve"> Wolfram Alpha</w:t>
             </w:r>
             <w:r>
               <w:rPr>
@@ -5391,7 +5649,16 @@
                 <w:noProof/>
                 <w:szCs w:val="24"/>
               </w:rPr>
-              <w:t>1.5.3. Аналог №3 – GeoGebra CAS</w:t>
+              <w:t xml:space="preserve">1.5.3. Аналог №3 – </w:t>
+            </w:r>
+            <w:r>
+              <w:rPr>
+                <w:rStyle w:val="a9"/>
+                <w:noProof/>
+                <w:szCs w:val="24"/>
+                <w:lang w:val="en-US"/>
+              </w:rPr>
+              <w:t>GeoGebra CAS</w:t>
             </w:r>
             <w:r>
               <w:rPr>
@@ -6446,9 +6713,18 @@
                 <w:rStyle w:val="a9"/>
                 <w:noProof/>
                 <w:szCs w:val="24"/>
+                <w:lang w:val="en-US" w:eastAsia="ru-RU"/>
+              </w:rPr>
+              <w:t>3.3</w:t>
+            </w:r>
+            <w:r>
+              <w:rPr>
+                <w:rStyle w:val="a9"/>
+                <w:noProof/>
+                <w:szCs w:val="24"/>
                 <w:lang w:eastAsia="ru-RU"/>
               </w:rPr>
-              <w:t>3.3 Проверка корректности обработки ошибок</w:t>
+              <w:t xml:space="preserve"> Проверка корректности обработки ошибок</w:t>
             </w:r>
             <w:r>
               <w:rPr>
@@ -6528,9 +6804,18 @@
                 <w:rStyle w:val="a9"/>
                 <w:noProof/>
                 <w:szCs w:val="24"/>
+                <w:lang w:val="en-US" w:eastAsia="ru-RU"/>
+              </w:rPr>
+              <w:t>3.4</w:t>
+            </w:r>
+            <w:r>
+              <w:rPr>
+                <w:rStyle w:val="a9"/>
+                <w:noProof/>
+                <w:szCs w:val="24"/>
                 <w:lang w:eastAsia="ru-RU"/>
               </w:rPr>
-              <w:t>3.4 Проверка экспорта результатов</w:t>
+              <w:t xml:space="preserve"> Проверка экспорта результатов</w:t>
             </w:r>
             <w:r>
               <w:rPr>
@@ -6935,6 +7220,7 @@
           <w:lang w:eastAsia="ru-RU"/>
         </w:rPr>
       </w:pPr>
+      <w:bookmarkStart w:id="1" w:name="_Toc230686197"/>
       <w:r>
         <w:rPr>
           <w:rFonts w:eastAsia="Times New Roman"/>
@@ -7004,25 +7290,7 @@
           <w:szCs w:val="24"/>
           <w:lang w:eastAsia="ru-RU"/>
         </w:rPr>
-        <w:t xml:space="preserve">Цель </w:t>
-      </w:r>
-      <w:r>
-        <w:rPr>
-          <w:rFonts w:eastAsia="Times New Roman"/>
-          <w:color w:val="000000"/>
-          <w:szCs w:val="24"/>
-          <w:lang w:eastAsia="ru-RU"/>
-        </w:rPr>
-        <w:t>курсового проекта</w:t>
-      </w:r>
-      <w:r>
-        <w:rPr>
-          <w:rFonts w:eastAsia="Times New Roman"/>
-          <w:color w:val="000000"/>
-          <w:szCs w:val="24"/>
-          <w:lang w:eastAsia="ru-RU"/>
-        </w:rPr>
-        <w:t xml:space="preserve"> – углубление теоретических знаний и практических навыков в области алгоритмизации задач и разработки программных средств, развитие навыков самостоятельного изучения предметной области поставленной задачи.</w:t>
+        <w:t>Цель курсового проекта – углубление теоретических знаний и практических навыков в области алгоритмизации задач и разработки программных средств, развитие навыков самостоятельного изучения предметной области поставленной задачи.</w:t>
       </w:r>
     </w:p>
     <w:p>
@@ -7043,9 +7311,11 @@
           <w:szCs w:val="24"/>
           <w:lang w:eastAsia="ru-RU"/>
         </w:rPr>
-        <w:t>Данн</w:t>
-      </w:r>
-      <w:r>
+        <w:t>Данный курсовой проект является разработка программного калькулятора для выполнения арифметических операций с комплексными числами, а также получение практических навыков анализа предметной области, проектирования и реализации информационных систем.</w:t>
+      </w:r>
+    </w:p>
+    <w:p>
+      <w:pPr>
         <w:rPr>
           <w:rFonts w:eastAsia="Times New Roman"/>
           <w:bCs/>
@@ -7053,8 +7323,7 @@
           <w:szCs w:val="24"/>
           <w:lang w:eastAsia="ru-RU"/>
         </w:rPr>
-        <w:t>ый курсовой проект</w:t>
-      </w:r>
+      </w:pPr>
       <w:r>
         <w:rPr>
           <w:rFonts w:eastAsia="Times New Roman"/>
@@ -7063,48 +7332,7 @@
           <w:szCs w:val="24"/>
           <w:lang w:eastAsia="ru-RU"/>
         </w:rPr>
-        <w:t xml:space="preserve"> является разработка программного калькулятора для выполнения арифметических операций с комплексными числами, а также получение практических навыков анализа предметной области, проектирования и реализации информационных систем.</w:t>
-      </w:r>
-    </w:p>
-    <w:p>
-      <w:pPr>
-        <w:rPr>
-          <w:rFonts w:eastAsia="Times New Roman"/>
-          <w:bCs/>
-          <w:color w:val="000000"/>
-          <w:szCs w:val="24"/>
-          <w:lang w:eastAsia="ru-RU"/>
-        </w:rPr>
-      </w:pPr>
-      <w:r>
-        <w:rPr>
-          <w:rFonts w:eastAsia="Times New Roman"/>
-          <w:bCs/>
-          <w:color w:val="000000"/>
-          <w:szCs w:val="24"/>
-          <w:lang w:eastAsia="ru-RU"/>
-        </w:rPr>
-        <w:t xml:space="preserve">Для достижения поставленной задачи в ходе </w:t>
-      </w:r>
-      <w:r>
-        <w:rPr>
-          <w:rFonts w:eastAsia="Times New Roman"/>
-          <w:bCs/>
-          <w:color w:val="000000"/>
-          <w:szCs w:val="24"/>
-          <w:lang w:eastAsia="ru-RU"/>
-        </w:rPr>
-        <w:t>курсового проекта</w:t>
-      </w:r>
-      <w:r>
-        <w:rPr>
-          <w:rFonts w:eastAsia="Times New Roman"/>
-          <w:bCs/>
-          <w:color w:val="000000"/>
-          <w:szCs w:val="24"/>
-          <w:lang w:eastAsia="ru-RU"/>
-        </w:rPr>
-        <w:t xml:space="preserve"> необходимо решить следующие задачи:</w:t>
+        <w:t>Для достижения поставленной задачи в ходе курсового проекта необходимо решить следующие задачи:</w:t>
       </w:r>
     </w:p>
     <w:p>
@@ -7243,27 +7471,7 @@
           <w:szCs w:val="24"/>
           <w:lang w:eastAsia="ru-RU"/>
         </w:rPr>
-        <w:t>Выполнение данно</w:t>
-      </w:r>
-      <w:r>
-        <w:rPr>
-          <w:rFonts w:eastAsia="Times New Roman"/>
-          <w:bCs/>
-          <w:color w:val="000000"/>
-          <w:szCs w:val="24"/>
-          <w:lang w:eastAsia="ru-RU"/>
-        </w:rPr>
-        <w:t>го курсового проекта</w:t>
-      </w:r>
-      <w:r>
-        <w:rPr>
-          <w:rFonts w:eastAsia="Times New Roman"/>
-          <w:bCs/>
-          <w:color w:val="000000"/>
-          <w:szCs w:val="24"/>
-          <w:lang w:eastAsia="ru-RU"/>
-        </w:rPr>
-        <w:t xml:space="preserve"> направлено на формирование профессиональных компетенций в области разработки программного обеспечения, закрепление теоретических знаний и приобретение практического опыта создания прикладных информационных систем.</w:t>
+        <w:t>Выполнение данного курсового проекта направлено на формирование профессиональных компетенций в области разработки программного обеспечения, закрепление теоретических знаний и приобретение практического опыта создания прикладных информационных систем.</w:t>
       </w:r>
     </w:p>
     <w:p>
@@ -7282,10 +7490,9 @@
           <w:b/>
           <w:bCs/>
           <w:szCs w:val="24"/>
-          <w:lang w:val="ru-RU" w:eastAsia="ru-RU"/>
-        </w:rPr>
-      </w:pPr>
-      <w:bookmarkStart w:id="1" w:name="_Toc230686197"/>
+          <w:lang w:eastAsia="ru-RU"/>
+        </w:rPr>
+      </w:pPr>
       <w:r>
         <w:rPr>
           <w:b/>
@@ -7316,6 +7523,7 @@
         </w:rPr>
       </w:pPr>
       <w:bookmarkStart w:id="2" w:name="_Toc230686198"/>
+      <w:bookmarkStart w:id="3" w:name="_Toc230686208"/>
       <w:r>
         <w:rPr>
           <w:b/>
@@ -7621,21 +7829,7 @@
           <w:iCs/>
           <w:szCs w:val="24"/>
         </w:rPr>
-        <w:t xml:space="preserve"> – его аргумент. В учебной и практической деятельности часто возникает необходимость перехода от одной формы представления к другой, что также относится к задачам предметной области [</w:t>
-      </w:r>
-      <w:r>
-        <w:rPr>
-          <w:iCs/>
-          <w:szCs w:val="24"/>
-        </w:rPr>
-        <w:t>2, 6, 7</w:t>
-      </w:r>
-      <w:r>
-        <w:rPr>
-          <w:iCs/>
-          <w:szCs w:val="24"/>
-        </w:rPr>
-        <w:t>].</w:t>
+        <w:t xml:space="preserve"> – его аргумент. В учебной и практической деятельности часто возникает необходимость перехода от одной формы представления к другой, что также относится к задачам предметной области [2, 6, 7].</w:t>
       </w:r>
     </w:p>
     <w:p>
@@ -7780,15 +7974,7 @@
           <w:szCs w:val="24"/>
           <w:lang w:val="ru-RU"/>
         </w:rPr>
-        <w:t>пользователь – субъект, инициирующий ввод и интерпретацию выражений</w:t>
-      </w:r>
-      <w:r>
-        <w:rPr>
-          <w:iCs/>
-          <w:szCs w:val="24"/>
-          <w:lang w:val="ru-RU"/>
-        </w:rPr>
-        <w:t>.</w:t>
+        <w:t>пользователь – субъект, инициирующий ввод и интерпретацию выражений.</w:t>
       </w:r>
     </w:p>
     <w:p>
@@ -7883,7 +8069,7 @@
           <w:lang w:val="ru-RU" w:eastAsia="ru-RU"/>
         </w:rPr>
       </w:pPr>
-      <w:bookmarkStart w:id="3" w:name="_Toc230686199"/>
+      <w:bookmarkStart w:id="4" w:name="_Toc230686199"/>
       <w:r>
         <w:rPr>
           <w:b/>
@@ -7893,7 +8079,7 @@
         </w:rPr>
         <w:t>Макеты входных документов</w:t>
       </w:r>
-      <w:bookmarkEnd w:id="3"/>
+      <w:bookmarkEnd w:id="4"/>
     </w:p>
     <w:p>
       <w:pPr>
@@ -8217,21 +8403,7 @@
           <w:iCs/>
           <w:szCs w:val="24"/>
         </w:rPr>
-        <w:t>Некорректные или неполные данные не допускаются к обработке и должны быть отклонены системой до выполнения вычислений [</w:t>
-      </w:r>
-      <w:r>
-        <w:rPr>
-          <w:iCs/>
-          <w:szCs w:val="24"/>
-        </w:rPr>
-        <w:t>3</w:t>
-      </w:r>
-      <w:r>
-        <w:rPr>
-          <w:iCs/>
-          <w:szCs w:val="24"/>
-        </w:rPr>
-        <w:t>].</w:t>
+        <w:t>Некорректные или неполные данные не допускаются к обработке и должны быть отклонены системой до выполнения вычислений [3].</w:t>
       </w:r>
     </w:p>
     <w:p>
@@ -9116,7 +9288,7 @@
           <w:lang w:val="ru-RU" w:eastAsia="ru-RU"/>
         </w:rPr>
       </w:pPr>
-      <w:bookmarkStart w:id="4" w:name="_Toc230686200"/>
+      <w:bookmarkStart w:id="5" w:name="_Toc230686200"/>
       <w:r>
         <w:rPr>
           <w:b/>
@@ -9126,7 +9298,7 @@
         </w:rPr>
         <w:t>Макеты выходных документов</w:t>
       </w:r>
-      <w:bookmarkEnd w:id="4"/>
+      <w:bookmarkEnd w:id="5"/>
     </w:p>
     <w:p>
       <w:pPr>
@@ -9256,19 +9428,7 @@
         <w:rPr>
           <w:szCs w:val="24"/>
         </w:rPr>
-        <w:t>Каждый вид выходных данных должен содержать обязательные метаданные: дата/время выполнения, идентификатор операции, входное выражение, результат в декартовой форме, при необходимости — полярная форма, модуль, аргумент, настройки (точность, единицы аргумента), комментарий/статус выполнения [</w:t>
-      </w:r>
-      <w:r>
-        <w:rPr>
-          <w:szCs w:val="24"/>
-        </w:rPr>
-        <w:t>3, 8</w:t>
-      </w:r>
-      <w:r>
-        <w:rPr>
-          <w:szCs w:val="24"/>
-        </w:rPr>
-        <w:t>].</w:t>
+        <w:t>Каждый вид выходных данных должен содержать обязательные метаданные: дата/время выполнения, идентификатор операции, входное выражение, результат в декартовой форме, при необходимости — полярная форма, модуль, аргумент, настройки (точность, единицы аргумента), комментарий/статус выполнения [3, 8].</w:t>
       </w:r>
     </w:p>
     <w:p>
@@ -9607,25 +9767,7 @@
           <w:szCs w:val="24"/>
           <w:lang w:val="ru-RU"/>
         </w:rPr>
-        <w:t xml:space="preserve">полярная форма: r </w:t>
-      </w:r>
-      <w:proofErr w:type="gramStart"/>
-      <w:r>
-        <w:rPr>
-          <w:iCs/>
-          <w:szCs w:val="24"/>
-          <w:lang w:val="ru-RU"/>
-        </w:rPr>
-        <w:t>&lt; φ</w:t>
-      </w:r>
-      <w:proofErr w:type="gramEnd"/>
-      <w:r>
-        <w:rPr>
-          <w:iCs/>
-          <w:szCs w:val="24"/>
-          <w:lang w:val="ru-RU"/>
-        </w:rPr>
-        <w:t xml:space="preserve">° или </w:t>
+        <w:t xml:space="preserve">полярная форма: r &lt; φ° или </w:t>
       </w:r>
       <m:oMath>
         <m:r>
@@ -9737,23 +9879,7 @@
           <w:szCs w:val="24"/>
           <w:lang w:val="ru-RU"/>
         </w:rPr>
-        <w:t>аргумент: значение в выбранных единицах [</w:t>
-      </w:r>
-      <w:r>
-        <w:rPr>
-          <w:iCs/>
-          <w:szCs w:val="24"/>
-          <w:lang w:val="ru-RU"/>
-        </w:rPr>
-        <w:t>4, 5, 8, 9, 10</w:t>
-      </w:r>
-      <w:r>
-        <w:rPr>
-          <w:iCs/>
-          <w:szCs w:val="24"/>
-          <w:lang w:val="ru-RU"/>
-        </w:rPr>
-        <w:t>].</w:t>
+        <w:t>аргумент: значение в выбранных единицах [4, 5, 8, 9, 10].</w:t>
       </w:r>
     </w:p>
     <w:p>
@@ -10557,7 +10683,7 @@
           <w:lang w:val="ru-RU" w:eastAsia="ru-RU"/>
         </w:rPr>
       </w:pPr>
-      <w:bookmarkStart w:id="5" w:name="_Toc230686201"/>
+      <w:bookmarkStart w:id="6" w:name="_Toc230686201"/>
       <w:r>
         <w:rPr>
           <w:b/>
@@ -10567,7 +10693,7 @@
         </w:rPr>
         <w:t>Требования к функциям информационной системы</w:t>
       </w:r>
-      <w:bookmarkEnd w:id="5"/>
+      <w:bookmarkEnd w:id="6"/>
     </w:p>
     <w:p>
       <w:pPr>
@@ -11335,7 +11461,7 @@
           <w:lang w:val="ru-RU" w:eastAsia="ru-RU"/>
         </w:rPr>
       </w:pPr>
-      <w:bookmarkStart w:id="6" w:name="_Toc230686202"/>
+      <w:bookmarkStart w:id="7" w:name="_Toc230686202"/>
       <w:r>
         <w:rPr>
           <w:b/>
@@ -11345,7 +11471,7 @@
         </w:rPr>
         <w:t>Обзор аналоговых информационных систем (программ)</w:t>
       </w:r>
-      <w:bookmarkEnd w:id="6"/>
+      <w:bookmarkEnd w:id="7"/>
     </w:p>
     <w:p>
       <w:pPr>
@@ -11377,7 +11503,7 @@
           <w:lang w:val="ru-RU"/>
         </w:rPr>
       </w:pPr>
-      <w:bookmarkStart w:id="7" w:name="_Toc230686203"/>
+      <w:bookmarkStart w:id="8" w:name="_Toc230686203"/>
       <w:r>
         <w:rPr>
           <w:b/>
@@ -11385,8 +11511,9 @@
           <w:szCs w:val="24"/>
           <w:lang w:val="ru-RU"/>
         </w:rPr>
-        <w:t>Аналог</w:t>
-      </w:r>
+        <w:t xml:space="preserve">Аналог №1 – Microsoft </w:t>
+      </w:r>
+      <w:proofErr w:type="spellStart"/>
       <w:r>
         <w:rPr>
           <w:b/>
@@ -11394,9 +11521,9 @@
           <w:szCs w:val="24"/>
           <w:lang w:val="ru-RU"/>
         </w:rPr>
-        <w:t xml:space="preserve"> №1 – Microsoft </w:t>
-      </w:r>
-      <w:proofErr w:type="spellStart"/>
+        <w:t>math</w:t>
+      </w:r>
+      <w:proofErr w:type="spellEnd"/>
       <w:r>
         <w:rPr>
           <w:b/>
@@ -11404,9 +11531,9 @@
           <w:szCs w:val="24"/>
           <w:lang w:val="ru-RU"/>
         </w:rPr>
-        <w:t>math</w:t>
-      </w:r>
-      <w:proofErr w:type="spellEnd"/>
+        <w:t xml:space="preserve"> </w:t>
+      </w:r>
+      <w:proofErr w:type="spellStart"/>
       <w:r>
         <w:rPr>
           <w:b/>
@@ -11414,19 +11541,9 @@
           <w:szCs w:val="24"/>
           <w:lang w:val="ru-RU"/>
         </w:rPr>
-        <w:t xml:space="preserve"> </w:t>
-      </w:r>
-      <w:proofErr w:type="spellStart"/>
-      <w:r>
-        <w:rPr>
-          <w:b/>
-          <w:bCs/>
-          <w:szCs w:val="24"/>
-          <w:lang w:val="ru-RU"/>
-        </w:rPr>
         <w:t>Solver</w:t>
       </w:r>
-      <w:bookmarkEnd w:id="7"/>
+      <w:bookmarkEnd w:id="8"/>
       <w:proofErr w:type="spellEnd"/>
     </w:p>
     <w:p>
@@ -11728,21 +11845,7 @@
           <w:szCs w:val="24"/>
           <w:lang w:val="ru-RU"/>
         </w:rPr>
-        <w:t>невозможность настройки точности вычислений [</w:t>
-      </w:r>
-      <w:r>
-        <w:rPr>
-          <w:szCs w:val="24"/>
-          <w:lang w:val="ru-RU"/>
-        </w:rPr>
-        <w:t>11</w:t>
-      </w:r>
-      <w:r>
-        <w:rPr>
-          <w:szCs w:val="24"/>
-          <w:lang w:val="ru-RU"/>
-        </w:rPr>
-        <w:t>].</w:t>
+        <w:t>невозможность настройки точности вычислений [11].</w:t>
       </w:r>
     </w:p>
     <w:p>
@@ -11778,7 +11881,7 @@
           <w:lang w:val="ru-RU"/>
         </w:rPr>
       </w:pPr>
-      <w:bookmarkStart w:id="8" w:name="_Toc230686204"/>
+      <w:bookmarkStart w:id="9" w:name="_Toc230686204"/>
       <w:r>
         <w:rPr>
           <w:b/>
@@ -11809,7 +11912,7 @@
         </w:rPr>
         <w:t xml:space="preserve"> Alpha</w:t>
       </w:r>
-      <w:bookmarkEnd w:id="8"/>
+      <w:bookmarkEnd w:id="9"/>
     </w:p>
     <w:p>
       <w:pPr>
@@ -12169,21 +12272,7 @@
           <w:szCs w:val="24"/>
           <w:lang w:val="ru-RU"/>
         </w:rPr>
-        <w:t>отсутствует журнал вычислений в виде таблицы [1</w:t>
-      </w:r>
-      <w:r>
-        <w:rPr>
-          <w:szCs w:val="24"/>
-          <w:lang w:val="ru-RU"/>
-        </w:rPr>
-        <w:t>1</w:t>
-      </w:r>
-      <w:r>
-        <w:rPr>
-          <w:szCs w:val="24"/>
-          <w:lang w:val="ru-RU"/>
-        </w:rPr>
-        <w:t>].</w:t>
+        <w:t>отсутствует журнал вычислений в виде таблицы [11].</w:t>
       </w:r>
     </w:p>
     <w:p>
@@ -12203,7 +12292,7 @@
           <w:lang w:val="ru-RU"/>
         </w:rPr>
       </w:pPr>
-      <w:bookmarkStart w:id="9" w:name="_Toc230686205"/>
+      <w:bookmarkStart w:id="10" w:name="_Toc230686205"/>
       <w:r>
         <w:rPr>
           <w:b/>
@@ -12233,7 +12322,7 @@
         </w:rPr>
         <w:t xml:space="preserve"> CAS</w:t>
       </w:r>
-      <w:bookmarkEnd w:id="9"/>
+      <w:bookmarkEnd w:id="10"/>
     </w:p>
     <w:p>
       <w:pPr>
@@ -12535,30 +12624,8 @@
           <w:szCs w:val="24"/>
           <w:lang w:val="ru-RU"/>
         </w:rPr>
-        <w:t>ограниченные возможности настройки формата вывода [1</w:t>
-      </w:r>
-      <w:r>
-        <w:rPr>
-          <w:szCs w:val="24"/>
-          <w:lang w:val="ru-RU"/>
-        </w:rPr>
-        <w:t>2</w:t>
-      </w:r>
-      <w:r>
-        <w:rPr>
-          <w:szCs w:val="24"/>
-          <w:lang w:val="ru-RU"/>
-        </w:rPr>
-        <w:t>].</w:t>
-      </w:r>
-    </w:p>
-    <w:p>
-      <w:pPr>
-        <w:contextualSpacing/>
-        <w:rPr>
-          <w:szCs w:val="24"/>
-        </w:rPr>
-      </w:pPr>
+        <w:t>ограниченные возможности настройки формата вывода [12].</w:t>
+      </w:r>
     </w:p>
     <w:p>
       <w:pPr>
@@ -12604,40 +12671,7 @@
           <w:sz w:val="24"/>
           <w:szCs w:val="24"/>
         </w:rPr>
-        <w:t>Сравнительная таблица ана</w:t>
-      </w:r>
-      <w:r>
-        <w:rPr>
-          <w:b/>
-          <w:i w:val="0"/>
-          <w:iCs w:val="0"/>
-          <w:color w:val="auto"/>
-          <w:sz w:val="24"/>
-          <w:szCs w:val="24"/>
-        </w:rPr>
-        <w:t>л</w:t>
-      </w:r>
-      <w:r>
-        <w:rPr>
-          <w:b/>
-          <w:i w:val="0"/>
-          <w:iCs w:val="0"/>
-          <w:color w:val="auto"/>
-          <w:sz w:val="24"/>
-          <w:szCs w:val="24"/>
-        </w:rPr>
-        <w:t>ого</w:t>
-      </w:r>
-      <w:r>
-        <w:rPr>
-          <w:b/>
-          <w:i w:val="0"/>
-          <w:iCs w:val="0"/>
-          <w:color w:val="auto"/>
-          <w:sz w:val="24"/>
-          <w:szCs w:val="24"/>
-        </w:rPr>
-        <w:t>в</w:t>
+        <w:t>Сравнительная таблица аналогов</w:t>
       </w:r>
     </w:p>
     <w:tbl>
@@ -13471,7 +13505,7 @@
           <w:lang w:val="ru-RU"/>
         </w:rPr>
       </w:pPr>
-      <w:bookmarkStart w:id="10" w:name="_Toc230686206"/>
+      <w:bookmarkStart w:id="11" w:name="_Toc230686206"/>
       <w:r>
         <w:rPr>
           <w:b/>
@@ -13481,7 +13515,7 @@
         </w:rPr>
         <w:t>Достоинства и недостатки аналогов</w:t>
       </w:r>
-      <w:bookmarkEnd w:id="10"/>
+      <w:bookmarkEnd w:id="11"/>
     </w:p>
     <w:p>
       <w:pPr>
@@ -13641,7 +13675,7 @@
           <w:lang w:val="ru-RU" w:eastAsia="ru-RU"/>
         </w:rPr>
       </w:pPr>
-      <w:bookmarkStart w:id="11" w:name="_Toc230686207"/>
+      <w:bookmarkStart w:id="12" w:name="_Toc230686207"/>
       <w:r>
         <w:rPr>
           <w:b/>
@@ -13651,7 +13685,7 @@
         </w:rPr>
         <w:t>Требования к техническому и программному обеспечению</w:t>
       </w:r>
-      <w:bookmarkEnd w:id="11"/>
+      <w:bookmarkEnd w:id="12"/>
     </w:p>
     <w:p>
       <w:pPr>
@@ -13693,7 +13727,6 @@
         <w:rPr>
           <w:szCs w:val="24"/>
         </w:rPr>
-        <w:lastRenderedPageBreak/>
         <w:t>Технические требования:</w:t>
       </w:r>
     </w:p>
@@ -13756,6 +13789,7 @@
           <w:szCs w:val="24"/>
           <w:lang w:val="ru-RU"/>
         </w:rPr>
+        <w:lastRenderedPageBreak/>
         <w:t>оперативная память: не менее 1 ГБ;</w:t>
       </w:r>
     </w:p>
@@ -13828,15 +13862,15 @@
           <w:ilvl w:val="0"/>
           <w:numId w:val="68"/>
         </w:numPr>
-        <w:spacing w:line="360" w:lineRule="auto"/>
-        <w:ind w:left="0" w:firstLine="0"/>
-      </w:pPr>
-      <w:bookmarkStart w:id="12" w:name="_Toc230686208"/>
+      </w:pPr>
       <w:r>
         <w:lastRenderedPageBreak/>
-        <w:t>РАБОЧИЙ ПРОЕКТ</w:t>
-      </w:r>
-      <w:bookmarkEnd w:id="12"/>
+        <w:t>РАБОЧИЙ</w:t>
+      </w:r>
+      <w:r>
+        <w:t xml:space="preserve"> ПРОЕКТ</w:t>
+      </w:r>
+      <w:bookmarkEnd w:id="3"/>
     </w:p>
     <w:p>
       <w:pPr>
@@ -13856,6 +13890,7 @@
         </w:rPr>
       </w:pPr>
       <w:bookmarkStart w:id="13" w:name="_Toc230686209"/>
+      <w:bookmarkStart w:id="14" w:name="_Toc230686215"/>
       <w:r>
         <w:rPr>
           <w:b/>
@@ -13961,7 +13996,7 @@
           <w:lang w:val="ru-RU" w:eastAsia="ru-RU"/>
         </w:rPr>
       </w:pPr>
-      <w:bookmarkStart w:id="14" w:name="_Toc230686210"/>
+      <w:bookmarkStart w:id="15" w:name="_Toc230686210"/>
       <w:r>
         <w:rPr>
           <w:b/>
@@ -13971,7 +14006,7 @@
         </w:rPr>
         <w:t>Функциональное назначение программного продукта</w:t>
       </w:r>
-      <w:bookmarkEnd w:id="14"/>
+      <w:bookmarkEnd w:id="15"/>
     </w:p>
     <w:p>
       <w:pPr>
@@ -14081,7 +14116,7 @@
           <w:lang w:val="ru-RU" w:eastAsia="ru-RU"/>
         </w:rPr>
       </w:pPr>
-      <w:bookmarkStart w:id="15" w:name="_Toc230686211"/>
+      <w:bookmarkStart w:id="16" w:name="_Toc230686211"/>
       <w:r>
         <w:rPr>
           <w:b/>
@@ -14092,7 +14127,7 @@
         <w:lastRenderedPageBreak/>
         <w:t>Инсталляция и выполнение программного продукта</w:t>
       </w:r>
-      <w:bookmarkEnd w:id="15"/>
+      <w:bookmarkEnd w:id="16"/>
     </w:p>
     <w:p>
       <w:pPr>
@@ -14206,7 +14241,7 @@
           <w:lang w:val="ru-RU" w:eastAsia="ru-RU"/>
         </w:rPr>
       </w:pPr>
-      <w:bookmarkStart w:id="16" w:name="_Toc230686212"/>
+      <w:bookmarkStart w:id="17" w:name="_Toc230686212"/>
       <w:r>
         <w:rPr>
           <w:b/>
@@ -14216,7 +14251,7 @@
         </w:rPr>
         <w:t>Описание программы</w:t>
       </w:r>
-      <w:bookmarkEnd w:id="16"/>
+      <w:bookmarkEnd w:id="17"/>
     </w:p>
     <w:p>
       <w:pPr>
@@ -16034,7 +16069,7 @@
           <w:lang w:val="ru-RU" w:eastAsia="ru-RU"/>
         </w:rPr>
       </w:pPr>
-      <w:bookmarkStart w:id="17" w:name="_Toc230686213"/>
+      <w:bookmarkStart w:id="18" w:name="_Toc230686213"/>
       <w:r>
         <w:rPr>
           <w:b/>
@@ -16044,7 +16079,7 @@
         </w:rPr>
         <w:t>Разработанные меню и интерфейсы</w:t>
       </w:r>
-      <w:bookmarkEnd w:id="17"/>
+      <w:bookmarkEnd w:id="18"/>
     </w:p>
     <w:p>
       <w:pPr>
@@ -16079,7 +16114,7 @@
         <mc:AlternateContent>
           <mc:Choice Requires="wps">
             <w:drawing>
-              <wp:anchor distT="0" distB="0" distL="114300" distR="114300" simplePos="0" relativeHeight="251674624" behindDoc="0" locked="0" layoutInCell="1" allowOverlap="1" wp14:anchorId="3F238B03" wp14:editId="3D64B65C">
+              <wp:anchor distT="0" distB="0" distL="114300" distR="114300" simplePos="0" relativeHeight="251667456" behindDoc="0" locked="0" layoutInCell="1" allowOverlap="1" wp14:anchorId="548540BE" wp14:editId="1711AA65">
                 <wp:simplePos x="0" y="0"/>
                 <wp:positionH relativeFrom="column">
                   <wp:posOffset>5614527</wp:posOffset>
@@ -16147,11 +16182,11 @@
           </mc:Choice>
           <mc:Fallback>
             <w:pict>
-              <v:shapetype w14:anchorId="3F238B03" id="_x0000_t202" coordsize="21600,21600" o:spt="202" path="m,l,21600r21600,l21600,xe">
+              <v:shapetype w14:anchorId="548540BE" id="_x0000_t202" coordsize="21600,21600" o:spt="202" path="m,l,21600r21600,l21600,xe">
                 <v:stroke joinstyle="miter"/>
                 <v:path gradientshapeok="t" o:connecttype="rect"/>
               </v:shapetype>
-              <v:shape id="Надпись 5" o:spid="_x0000_s1026" type="#_x0000_t202" style="position:absolute;left:0;text-align:left;margin-left:442.1pt;margin-top:44.2pt;width:19.35pt;height:22.55pt;z-index:251674624;visibility:visible;mso-wrap-style:square;mso-width-percent:0;mso-height-percent:0;mso-wrap-distance-left:9pt;mso-wrap-distance-top:0;mso-wrap-distance-right:9pt;mso-wrap-distance-bottom:0;mso-position-horizontal:absolute;mso-position-horizontal-relative:text;mso-position-vertical:absolute;mso-position-vertical-relative:text;mso-width-percent:0;mso-height-percent:0;mso-width-relative:margin;mso-height-relative:margin;v-text-anchor:top" o:gfxdata="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" filled="f" stroked="f" strokeweight=".5pt">
+              <v:shape id="Надпись 5" o:spid="_x0000_s1026" type="#_x0000_t202" style="position:absolute;left:0;text-align:left;margin-left:442.1pt;margin-top:44.2pt;width:19.35pt;height:22.55pt;z-index:251667456;visibility:visible;mso-wrap-style:square;mso-width-percent:0;mso-height-percent:0;mso-wrap-distance-left:9pt;mso-wrap-distance-top:0;mso-wrap-distance-right:9pt;mso-wrap-distance-bottom:0;mso-position-horizontal:absolute;mso-position-horizontal-relative:text;mso-position-vertical:absolute;mso-position-vertical-relative:text;mso-width-percent:0;mso-height-percent:0;mso-width-relative:margin;mso-height-relative:margin;v-text-anchor:top" o:gfxdata="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" filled="f" stroked="f" strokeweight=".5pt">
                 <v:textbox>
                   <w:txbxContent>
                     <w:p>
@@ -16184,7 +16219,7 @@
         <mc:AlternateContent>
           <mc:Choice Requires="wps">
             <w:drawing>
-              <wp:anchor distT="0" distB="0" distL="114300" distR="114300" simplePos="0" relativeHeight="251672576" behindDoc="0" locked="0" layoutInCell="1" allowOverlap="1" wp14:anchorId="0E73FCF7" wp14:editId="1C764169">
+              <wp:anchor distT="0" distB="0" distL="114300" distR="114300" simplePos="0" relativeHeight="251666432" behindDoc="0" locked="0" layoutInCell="1" allowOverlap="1" wp14:anchorId="1BC2915A" wp14:editId="124EE711">
                 <wp:simplePos x="0" y="0"/>
                 <wp:positionH relativeFrom="column">
                   <wp:posOffset>5459502</wp:posOffset>
@@ -16245,11 +16280,11 @@
           </mc:Choice>
           <mc:Fallback>
             <w:pict>
-              <v:shapetype w14:anchorId="4FCDA8B0" id="_x0000_t32" coordsize="21600,21600" o:spt="32" o:oned="t" path="m,l21600,21600e" filled="f">
+              <v:shapetype w14:anchorId="60A4A2AC" id="_x0000_t32" coordsize="21600,21600" o:spt="32" o:oned="t" path="m,l21600,21600e" filled="f">
                 <v:path arrowok="t" fillok="f" o:connecttype="none"/>
                 <o:lock v:ext="edit" shapetype="t"/>
               </v:shapetype>
-              <v:shape id="Прямая со стрелкой 2" o:spid="_x0000_s1026" type="#_x0000_t32" style="position:absolute;margin-left:429.9pt;margin-top:52.95pt;width:44.8pt;height:20.65pt;flip:x y;z-index:251672576;visibility:visible;mso-wrap-style:square;mso-width-percent:0;mso-height-percent:0;mso-wrap-distance-left:9pt;mso-wrap-distance-top:0;mso-wrap-distance-right:9pt;mso-wrap-distance-bottom:0;mso-position-horizontal:absolute;mso-position-horizontal-relative:text;mso-position-vertical:absolute;mso-position-vertical-relative:text;mso-width-percent:0;mso-height-percent:0;mso-width-relative:margin;mso-height-relative:margin" o:gfxdata="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" strokecolor="white [3212]" strokeweight="1.5pt">
+              <v:shape id="Прямая со стрелкой 2" o:spid="_x0000_s1026" type="#_x0000_t32" style="position:absolute;margin-left:429.9pt;margin-top:52.95pt;width:44.8pt;height:20.65pt;flip:x y;z-index:251666432;visibility:visible;mso-wrap-style:square;mso-width-percent:0;mso-height-percent:0;mso-wrap-distance-left:9pt;mso-wrap-distance-top:0;mso-wrap-distance-right:9pt;mso-wrap-distance-bottom:0;mso-position-horizontal:absolute;mso-position-horizontal-relative:text;mso-position-vertical:absolute;mso-position-vertical-relative:text;mso-width-percent:0;mso-height-percent:0;mso-width-relative:margin;mso-height-relative:margin" o:gfxdata="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" strokecolor="white [3212]" strokeweight="1.5pt">
                 <v:stroke endarrow="block" joinstyle="miter"/>
               </v:shape>
             </w:pict>
@@ -16265,7 +16300,7 @@
         <mc:AlternateContent>
           <mc:Choice Requires="wps">
             <w:drawing>
-              <wp:anchor distT="0" distB="0" distL="114300" distR="114300" simplePos="0" relativeHeight="251668480" behindDoc="0" locked="0" layoutInCell="1" allowOverlap="1" wp14:anchorId="018544F0" wp14:editId="7FF4708D">
+              <wp:anchor distT="0" distB="0" distL="114300" distR="114300" simplePos="0" relativeHeight="251664384" behindDoc="0" locked="0" layoutInCell="1" allowOverlap="1" wp14:anchorId="78032195" wp14:editId="2B2C49FD">
                 <wp:simplePos x="0" y="0"/>
                 <wp:positionH relativeFrom="column">
                   <wp:posOffset>4024479</wp:posOffset>
@@ -16333,7 +16368,7 @@
           </mc:Choice>
           <mc:Fallback>
             <w:pict>
-              <v:shape w14:anchorId="018544F0" id="_x0000_s1027" type="#_x0000_t202" style="position:absolute;left:0;text-align:left;margin-left:316.9pt;margin-top:111.85pt;width:19.35pt;height:22.55pt;z-index:251668480;visibility:visible;mso-wrap-style:square;mso-width-percent:0;mso-height-percent:0;mso-wrap-distance-left:9pt;mso-wrap-distance-top:0;mso-wrap-distance-right:9pt;mso-wrap-distance-bottom:0;mso-position-horizontal:absolute;mso-position-horizontal-relative:text;mso-position-vertical:absolute;mso-position-vertical-relative:text;mso-width-percent:0;mso-height-percent:0;mso-width-relative:margin;mso-height-relative:margin;v-text-anchor:top" o:gfxdata="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" filled="f" stroked="f" strokeweight=".5pt">
+              <v:shape w14:anchorId="78032195" id="_x0000_s1027" type="#_x0000_t202" style="position:absolute;left:0;text-align:left;margin-left:316.9pt;margin-top:111.85pt;width:19.35pt;height:22.55pt;z-index:251664384;visibility:visible;mso-wrap-style:square;mso-width-percent:0;mso-height-percent:0;mso-wrap-distance-left:9pt;mso-wrap-distance-top:0;mso-wrap-distance-right:9pt;mso-wrap-distance-bottom:0;mso-position-horizontal:absolute;mso-position-horizontal-relative:text;mso-position-vertical:absolute;mso-position-vertical-relative:text;mso-width-percent:0;mso-height-percent:0;mso-width-relative:margin;mso-height-relative:margin;v-text-anchor:top" o:gfxdata="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" filled="f" stroked="f" strokeweight=".5pt">
                 <v:textbox>
                   <w:txbxContent>
                     <w:p>
@@ -16366,7 +16401,7 @@
         <mc:AlternateContent>
           <mc:Choice Requires="wps">
             <w:drawing>
-              <wp:anchor distT="0" distB="0" distL="114300" distR="114300" simplePos="0" relativeHeight="251666432" behindDoc="0" locked="0" layoutInCell="1" allowOverlap="1" wp14:anchorId="444164C5" wp14:editId="3032E0D7">
+              <wp:anchor distT="0" distB="0" distL="114300" distR="114300" simplePos="0" relativeHeight="251663360" behindDoc="0" locked="0" layoutInCell="1" allowOverlap="1" wp14:anchorId="5D1F484C" wp14:editId="14258033">
                 <wp:simplePos x="0" y="0"/>
                 <wp:positionH relativeFrom="column">
                   <wp:posOffset>3733060</wp:posOffset>
@@ -16427,7 +16462,7 @@
           </mc:Choice>
           <mc:Fallback>
             <w:pict>
-              <v:shape w14:anchorId="1BD2394B" id="Прямая со стрелкой 2" o:spid="_x0000_s1026" type="#_x0000_t32" style="position:absolute;margin-left:293.95pt;margin-top:123.8pt;width:73.85pt;height:19.7pt;flip:x y;z-index:251666432;visibility:visible;mso-wrap-style:square;mso-width-percent:0;mso-height-percent:0;mso-wrap-distance-left:9pt;mso-wrap-distance-top:0;mso-wrap-distance-right:9pt;mso-wrap-distance-bottom:0;mso-position-horizontal:absolute;mso-position-horizontal-relative:text;mso-position-vertical:absolute;mso-position-vertical-relative:text;mso-width-percent:0;mso-height-percent:0;mso-width-relative:margin;mso-height-relative:margin" o:gfxdata="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" strokecolor="white [3212]" strokeweight="1.5pt">
+              <v:shape w14:anchorId="391BD6FA" id="Прямая со стрелкой 2" o:spid="_x0000_s1026" type="#_x0000_t32" style="position:absolute;margin-left:293.95pt;margin-top:123.8pt;width:73.85pt;height:19.7pt;flip:x y;z-index:251663360;visibility:visible;mso-wrap-style:square;mso-width-percent:0;mso-height-percent:0;mso-wrap-distance-left:9pt;mso-wrap-distance-top:0;mso-wrap-distance-right:9pt;mso-wrap-distance-bottom:0;mso-position-horizontal:absolute;mso-position-horizontal-relative:text;mso-position-vertical:absolute;mso-position-vertical-relative:text;mso-width-percent:0;mso-height-percent:0;mso-width-relative:margin;mso-height-relative:margin" o:gfxdata="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" strokecolor="white [3212]" strokeweight="1.5pt">
                 <v:stroke endarrow="block" joinstyle="miter"/>
               </v:shape>
             </w:pict>
@@ -16443,7 +16478,7 @@
         <mc:AlternateContent>
           <mc:Choice Requires="wps">
             <w:drawing>
-              <wp:anchor distT="0" distB="0" distL="114300" distR="114300" simplePos="0" relativeHeight="251662336" behindDoc="0" locked="0" layoutInCell="1" allowOverlap="1" wp14:anchorId="5F63DCEF" wp14:editId="458F3147">
+              <wp:anchor distT="0" distB="0" distL="114300" distR="114300" simplePos="0" relativeHeight="251661312" behindDoc="0" locked="0" layoutInCell="1" allowOverlap="1" wp14:anchorId="7DB3F047" wp14:editId="7B15C621">
                 <wp:simplePos x="0" y="0"/>
                 <wp:positionH relativeFrom="column">
                   <wp:posOffset>4015683</wp:posOffset>
@@ -16504,7 +16539,7 @@
           </mc:Choice>
           <mc:Fallback>
             <w:pict>
-              <v:shape w14:anchorId="65C327D2" id="Прямая со стрелкой 2" o:spid="_x0000_s1026" type="#_x0000_t32" style="position:absolute;margin-left:316.2pt;margin-top:96.2pt;width:92.7pt;height:28.75pt;flip:x y;z-index:251662336;visibility:visible;mso-wrap-style:square;mso-width-percent:0;mso-height-percent:0;mso-wrap-distance-left:9pt;mso-wrap-distance-top:0;mso-wrap-distance-right:9pt;mso-wrap-distance-bottom:0;mso-position-horizontal:absolute;mso-position-horizontal-relative:text;mso-position-vertical:absolute;mso-position-vertical-relative:text;mso-width-percent:0;mso-height-percent:0;mso-width-relative:margin;mso-height-relative:margin" o:gfxdata="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" strokecolor="white [3212]" strokeweight="1.5pt">
+              <v:shape w14:anchorId="00A63FBB" id="Прямая со стрелкой 2" o:spid="_x0000_s1026" type="#_x0000_t32" style="position:absolute;margin-left:316.2pt;margin-top:96.2pt;width:92.7pt;height:28.75pt;flip:x y;z-index:251661312;visibility:visible;mso-wrap-style:square;mso-width-percent:0;mso-height-percent:0;mso-wrap-distance-left:9pt;mso-wrap-distance-top:0;mso-wrap-distance-right:9pt;mso-wrap-distance-bottom:0;mso-position-horizontal:absolute;mso-position-horizontal-relative:text;mso-position-vertical:absolute;mso-position-vertical-relative:text;mso-width-percent:0;mso-height-percent:0;mso-width-relative:margin;mso-height-relative:margin" o:gfxdata="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" strokecolor="white [3212]" strokeweight="1.5pt">
                 <v:stroke endarrow="block" joinstyle="miter"/>
               </v:shape>
             </w:pict>
@@ -16520,7 +16555,7 @@
         <mc:AlternateContent>
           <mc:Choice Requires="wps">
             <w:drawing>
-              <wp:anchor distT="0" distB="0" distL="114300" distR="114300" simplePos="0" relativeHeight="251664384" behindDoc="0" locked="0" layoutInCell="1" allowOverlap="1" wp14:anchorId="48E86A51" wp14:editId="702A18AB">
+              <wp:anchor distT="0" distB="0" distL="114300" distR="114300" simplePos="0" relativeHeight="251662336" behindDoc="0" locked="0" layoutInCell="1" allowOverlap="1" wp14:anchorId="0D5EE763" wp14:editId="0CDF7D23">
                 <wp:simplePos x="0" y="0"/>
                 <wp:positionH relativeFrom="column">
                   <wp:posOffset>4438365</wp:posOffset>
@@ -16588,7 +16623,7 @@
           </mc:Choice>
           <mc:Fallback>
             <w:pict>
-              <v:shape w14:anchorId="48E86A51" id="_x0000_s1028" type="#_x0000_t202" style="position:absolute;left:0;text-align:left;margin-left:349.5pt;margin-top:89.3pt;width:19.35pt;height:22.55pt;z-index:251664384;visibility:visible;mso-wrap-style:square;mso-width-percent:0;mso-height-percent:0;mso-wrap-distance-left:9pt;mso-wrap-distance-top:0;mso-wrap-distance-right:9pt;mso-wrap-distance-bottom:0;mso-position-horizontal:absolute;mso-position-horizontal-relative:text;mso-position-vertical:absolute;mso-position-vertical-relative:text;mso-width-percent:0;mso-height-percent:0;mso-width-relative:margin;mso-height-relative:margin;v-text-anchor:top" o:gfxdata="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" filled="f" stroked="f" strokeweight=".5pt">
+              <v:shape w14:anchorId="0D5EE763" id="_x0000_s1028" type="#_x0000_t202" style="position:absolute;left:0;text-align:left;margin-left:349.5pt;margin-top:89.3pt;width:19.35pt;height:22.55pt;z-index:251662336;visibility:visible;mso-wrap-style:square;mso-width-percent:0;mso-height-percent:0;mso-wrap-distance-left:9pt;mso-wrap-distance-top:0;mso-wrap-distance-right:9pt;mso-wrap-distance-bottom:0;mso-position-horizontal:absolute;mso-position-horizontal-relative:text;mso-position-vertical:absolute;mso-position-vertical-relative:text;mso-width-percent:0;mso-height-percent:0;mso-width-relative:margin;mso-height-relative:margin;v-text-anchor:top" o:gfxdata="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" filled="f" stroked="f" strokeweight=".5pt">
                 <v:textbox>
                   <w:txbxContent>
                     <w:p>
@@ -16621,7 +16656,7 @@
         <mc:AlternateContent>
           <mc:Choice Requires="wps">
             <w:drawing>
-              <wp:anchor distT="0" distB="0" distL="114300" distR="114300" simplePos="0" relativeHeight="251660288" behindDoc="0" locked="0" layoutInCell="1" allowOverlap="1" wp14:anchorId="66365F30" wp14:editId="77AB49A9">
+              <wp:anchor distT="0" distB="0" distL="114300" distR="114300" simplePos="0" relativeHeight="251660288" behindDoc="0" locked="0" layoutInCell="1" allowOverlap="1" wp14:anchorId="74D055B8" wp14:editId="777561E9">
                 <wp:simplePos x="0" y="0"/>
                 <wp:positionH relativeFrom="column">
                   <wp:posOffset>6423053</wp:posOffset>
@@ -16689,7 +16724,7 @@
           </mc:Choice>
           <mc:Fallback>
             <w:pict>
-              <v:shape w14:anchorId="66365F30" id="_x0000_s1029" type="#_x0000_t202" style="position:absolute;left:0;text-align:left;margin-left:505.75pt;margin-top:31.15pt;width:19.35pt;height:22.55pt;z-index:251660288;visibility:visible;mso-wrap-style:square;mso-width-percent:0;mso-height-percent:0;mso-wrap-distance-left:9pt;mso-wrap-distance-top:0;mso-wrap-distance-right:9pt;mso-wrap-distance-bottom:0;mso-position-horizontal:absolute;mso-position-horizontal-relative:text;mso-position-vertical:absolute;mso-position-vertical-relative:text;mso-width-percent:0;mso-height-percent:0;mso-width-relative:margin;mso-height-relative:margin;v-text-anchor:top" o:gfxdata="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" filled="f" stroked="f" strokeweight=".5pt">
+              <v:shape w14:anchorId="74D055B8" id="_x0000_s1029" type="#_x0000_t202" style="position:absolute;left:0;text-align:left;margin-left:505.75pt;margin-top:31.15pt;width:19.35pt;height:22.55pt;z-index:251660288;visibility:visible;mso-wrap-style:square;mso-width-percent:0;mso-height-percent:0;mso-wrap-distance-left:9pt;mso-wrap-distance-top:0;mso-wrap-distance-right:9pt;mso-wrap-distance-bottom:0;mso-position-horizontal:absolute;mso-position-horizontal-relative:text;mso-position-vertical:absolute;mso-position-vertical-relative:text;mso-width-percent:0;mso-height-percent:0;mso-width-relative:margin;mso-height-relative:margin;v-text-anchor:top" o:gfxdata="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" filled="f" stroked="f" strokeweight=".5pt">
                 <v:textbox>
                   <w:txbxContent>
                     <w:p>
@@ -16722,7 +16757,7 @@
         <mc:AlternateContent>
           <mc:Choice Requires="wps">
             <w:drawing>
-              <wp:anchor distT="0" distB="0" distL="114300" distR="114300" simplePos="0" relativeHeight="251659264" behindDoc="0" locked="0" layoutInCell="1" allowOverlap="1" wp14:anchorId="160DF612" wp14:editId="0A749A53">
+              <wp:anchor distT="0" distB="0" distL="114300" distR="114300" simplePos="0" relativeHeight="251659264" behindDoc="0" locked="0" layoutInCell="1" allowOverlap="1" wp14:anchorId="6D3A2167" wp14:editId="6A204CB3">
                 <wp:simplePos x="0" y="0"/>
                 <wp:positionH relativeFrom="column">
                   <wp:posOffset>6408922</wp:posOffset>
@@ -16783,7 +16818,7 @@
           </mc:Choice>
           <mc:Fallback>
             <w:pict>
-              <v:shape w14:anchorId="0B769F40" id="Прямая со стрелкой 2" o:spid="_x0000_s1026" type="#_x0000_t32" style="position:absolute;margin-left:504.65pt;margin-top:34pt;width:24.85pt;height:72.4pt;flip:x y;z-index:251659264;visibility:visible;mso-wrap-style:square;mso-width-percent:0;mso-height-percent:0;mso-wrap-distance-left:9pt;mso-wrap-distance-top:0;mso-wrap-distance-right:9pt;mso-wrap-distance-bottom:0;mso-position-horizontal:absolute;mso-position-horizontal-relative:text;mso-position-vertical:absolute;mso-position-vertical-relative:text;mso-width-percent:0;mso-height-percent:0;mso-width-relative:margin;mso-height-relative:margin" o:gfxdata="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" strokecolor="white [3212]" strokeweight="1.5pt">
+              <v:shape w14:anchorId="6E5699FB" id="Прямая со стрелкой 2" o:spid="_x0000_s1026" type="#_x0000_t32" style="position:absolute;margin-left:504.65pt;margin-top:34pt;width:24.85pt;height:72.4pt;flip:x y;z-index:251659264;visibility:visible;mso-wrap-style:square;mso-width-percent:0;mso-height-percent:0;mso-wrap-distance-left:9pt;mso-wrap-distance-top:0;mso-wrap-distance-right:9pt;mso-wrap-distance-bottom:0;mso-position-horizontal:absolute;mso-position-horizontal-relative:text;mso-position-vertical:absolute;mso-position-vertical-relative:text;mso-width-percent:0;mso-height-percent:0;mso-width-relative:margin;mso-height-relative:margin" o:gfxdata="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" strokecolor="white [3212]" strokeweight="1.5pt">
                 <v:stroke endarrow="block" joinstyle="miter"/>
               </v:shape>
             </w:pict>
@@ -16797,7 +16832,7 @@
           <w:lang w:eastAsia="ru-RU"/>
         </w:rPr>
         <w:drawing>
-          <wp:inline distT="0" distB="0" distL="0" distR="0" wp14:anchorId="1035D04F" wp14:editId="58516636">
+          <wp:inline distT="0" distB="0" distL="0" distR="0" wp14:anchorId="742B5899" wp14:editId="3DF2E32A">
             <wp:extent cx="6297295" cy="4986020"/>
             <wp:effectExtent l="0" t="0" r="8255" b="5080"/>
             <wp:docPr id="274574062" name="Рисунок 1"/>
@@ -16814,7 +16849,7 @@
                     </pic:cNvPicPr>
                   </pic:nvPicPr>
                   <pic:blipFill>
-                    <a:blip r:embed="rId9">
+                    <a:blip r:embed="rId12">
                       <a:extLst>
                         <a:ext uri="{28A0092B-C50C-407E-A947-70E740481C1C}">
                           <a14:useLocalDpi xmlns:a14="http://schemas.microsoft.com/office/drawing/2010/main" val="0"/>
@@ -16868,17 +16903,7 @@
           <w:sz w:val="20"/>
           <w:szCs w:val="20"/>
         </w:rPr>
-        <w:t>Рисунок 2</w:t>
-      </w:r>
-      <w:r>
-        <w:rPr>
-          <w:i w:val="0"/>
-          <w:iCs w:val="0"/>
-          <w:color w:val="auto"/>
-          <w:sz w:val="20"/>
-          <w:szCs w:val="20"/>
-        </w:rPr>
-        <w:t>.</w:t>
+        <w:t>Рисунок 2.</w:t>
       </w:r>
       <w:r>
         <w:rPr>
@@ -16980,9 +17005,9 @@
       <w:r>
         <w:rPr>
           <w:szCs w:val="24"/>
-          <w:lang w:val="ru-RU" w:eastAsia="ru-RU"/>
-        </w:rPr>
-        <w:t>;</w:t>
+          <w:lang w:val="en-US" w:eastAsia="ru-RU"/>
+        </w:rPr>
+        <w:t>.</w:t>
       </w:r>
     </w:p>
     <w:p>
@@ -17008,9 +17033,9 @@
       <w:r>
         <w:rPr>
           <w:szCs w:val="24"/>
-          <w:lang w:val="ru-RU" w:eastAsia="ru-RU"/>
-        </w:rPr>
-        <w:t>;</w:t>
+          <w:lang w:val="en-US" w:eastAsia="ru-RU"/>
+        </w:rPr>
+        <w:t>.</w:t>
       </w:r>
     </w:p>
     <w:p>
@@ -17036,9 +17061,9 @@
       <w:r>
         <w:rPr>
           <w:szCs w:val="24"/>
-          <w:lang w:val="ru-RU" w:eastAsia="ru-RU"/>
-        </w:rPr>
-        <w:t>;</w:t>
+          <w:lang w:val="en-US" w:eastAsia="ru-RU"/>
+        </w:rPr>
+        <w:t>.</w:t>
       </w:r>
     </w:p>
     <w:p>
@@ -17078,7 +17103,7 @@
         </w:rPr>
         <w:lastRenderedPageBreak/>
         <w:drawing>
-          <wp:inline distT="0" distB="0" distL="0" distR="0" wp14:anchorId="21E3A677" wp14:editId="37504788">
+          <wp:inline distT="0" distB="0" distL="0" distR="0" wp14:anchorId="2A018638" wp14:editId="6E2AC677">
             <wp:extent cx="6298565" cy="3862070"/>
             <wp:effectExtent l="0" t="0" r="6985" b="5080"/>
             <wp:docPr id="1841066022" name="Рисунок 8"/>
@@ -17095,7 +17120,7 @@
                     </pic:cNvPicPr>
                   </pic:nvPicPr>
                   <pic:blipFill>
-                    <a:blip r:embed="rId10" cstate="print">
+                    <a:blip r:embed="rId13" cstate="print">
                       <a:extLst>
                         <a:ext uri="{28A0092B-C50C-407E-A947-70E740481C1C}">
                           <a14:useLocalDpi xmlns:a14="http://schemas.microsoft.com/office/drawing/2010/main" val="0"/>
@@ -17226,21 +17251,7 @@
           <w:szCs w:val="24"/>
           <w:lang w:eastAsia="ru-RU"/>
         </w:rPr>
-        <w:t>После вычисления заданного выражения программа выводит результат, тригонометрическую форму, подробные сведения о результате и сохраняет вычисление в истории вычислений (рисунок 2.3).</w:t>
-      </w:r>
-      <w:r>
-        <w:rPr>
-          <w:szCs w:val="24"/>
-          <w:lang w:eastAsia="ru-RU"/>
-        </w:rPr>
-        <w:t xml:space="preserve"> После выполнения вычислений можно экспортировать все вычисления в удобном формате (CSV, JSON, Excel (XLSX), Word (DOCX), TXT)</w:t>
-      </w:r>
-      <w:r>
-        <w:rPr>
-          <w:szCs w:val="24"/>
-          <w:lang w:eastAsia="ru-RU"/>
-        </w:rPr>
-        <w:t>.</w:t>
+        <w:t>После вычисления заданного выражения программа выводит результат, тригонометрическую форму, подробные сведения о результате и сохраняет вычисление в истории вычислений (рисунок 2.3). После выполнения вычислений можно экспортировать все вычисления в удобном формате (CSV, JSON, Excel (XLSX), Word (DOCX), TXT).</w:t>
       </w:r>
     </w:p>
     <w:p>
@@ -17261,7 +17272,7 @@
         <mc:AlternateContent>
           <mc:Choice Requires="wps">
             <w:drawing>
-              <wp:anchor distT="0" distB="0" distL="114300" distR="114300" simplePos="0" relativeHeight="251693056" behindDoc="0" locked="0" layoutInCell="1" allowOverlap="1" wp14:anchorId="02AE802A" wp14:editId="52691E64">
+              <wp:anchor distT="0" distB="0" distL="114300" distR="114300" simplePos="0" relativeHeight="251676672" behindDoc="0" locked="0" layoutInCell="1" allowOverlap="1" wp14:anchorId="2CACC96E" wp14:editId="7BB854E1">
                 <wp:simplePos x="0" y="0"/>
                 <wp:positionH relativeFrom="column">
                   <wp:posOffset>5887123</wp:posOffset>
@@ -17329,7 +17340,7 @@
           </mc:Choice>
           <mc:Fallback>
             <w:pict>
-              <v:shape w14:anchorId="02AE802A" id="_x0000_s1030" type="#_x0000_t202" style="position:absolute;left:0;text-align:left;margin-left:463.55pt;margin-top:360.3pt;width:19.35pt;height:22.55pt;z-index:251693056;visibility:visible;mso-wrap-style:square;mso-width-percent:0;mso-height-percent:0;mso-wrap-distance-left:9pt;mso-wrap-distance-top:0;mso-wrap-distance-right:9pt;mso-wrap-distance-bottom:0;mso-position-horizontal:absolute;mso-position-horizontal-relative:text;mso-position-vertical:absolute;mso-position-vertical-relative:text;mso-width-percent:0;mso-height-percent:0;mso-width-relative:margin;mso-height-relative:margin;v-text-anchor:top" o:gfxdata="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" filled="f" stroked="f" strokeweight=".5pt">
+              <v:shape w14:anchorId="2CACC96E" id="_x0000_s1030" type="#_x0000_t202" style="position:absolute;left:0;text-align:left;margin-left:463.55pt;margin-top:360.3pt;width:19.35pt;height:22.55pt;z-index:251676672;visibility:visible;mso-wrap-style:square;mso-width-percent:0;mso-height-percent:0;mso-wrap-distance-left:9pt;mso-wrap-distance-top:0;mso-wrap-distance-right:9pt;mso-wrap-distance-bottom:0;mso-position-horizontal:absolute;mso-position-horizontal-relative:text;mso-position-vertical:absolute;mso-position-vertical-relative:text;mso-width-percent:0;mso-height-percent:0;mso-width-relative:margin;mso-height-relative:margin;v-text-anchor:top" o:gfxdata="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" filled="f" stroked="f" strokeweight=".5pt">
                 <v:textbox>
                   <w:txbxContent>
                     <w:p>
@@ -17362,7 +17373,7 @@
         <mc:AlternateContent>
           <mc:Choice Requires="wps">
             <w:drawing>
-              <wp:anchor distT="0" distB="0" distL="114300" distR="114300" simplePos="0" relativeHeight="251691008" behindDoc="0" locked="0" layoutInCell="1" allowOverlap="1" wp14:anchorId="3CE55AD8" wp14:editId="5D93A8EF">
+              <wp:anchor distT="0" distB="0" distL="114300" distR="114300" simplePos="0" relativeHeight="251675648" behindDoc="0" locked="0" layoutInCell="1" allowOverlap="1" wp14:anchorId="699D265C" wp14:editId="4CD5838B">
                 <wp:simplePos x="0" y="0"/>
                 <wp:positionH relativeFrom="column">
                   <wp:posOffset>5595980</wp:posOffset>
@@ -17423,7 +17434,7 @@
           </mc:Choice>
           <mc:Fallback>
             <w:pict>
-              <v:shape w14:anchorId="3D9CD4C5" id="Прямая со стрелкой 2" o:spid="_x0000_s1026" type="#_x0000_t32" style="position:absolute;margin-left:440.65pt;margin-top:378.05pt;width:79.2pt;height:9.45pt;flip:x y;z-index:251691008;visibility:visible;mso-wrap-style:square;mso-width-percent:0;mso-height-percent:0;mso-wrap-distance-left:9pt;mso-wrap-distance-top:0;mso-wrap-distance-right:9pt;mso-wrap-distance-bottom:0;mso-position-horizontal:absolute;mso-position-horizontal-relative:text;mso-position-vertical:absolute;mso-position-vertical-relative:text;mso-width-percent:0;mso-height-percent:0;mso-width-relative:margin;mso-height-relative:margin" o:gfxdata="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" strokecolor="white [3212]" strokeweight="1.5pt">
+              <v:shape w14:anchorId="697703B8" id="Прямая со стрелкой 2" o:spid="_x0000_s1026" type="#_x0000_t32" style="position:absolute;margin-left:440.65pt;margin-top:378.05pt;width:79.2pt;height:9.45pt;flip:x y;z-index:251675648;visibility:visible;mso-wrap-style:square;mso-width-percent:0;mso-height-percent:0;mso-wrap-distance-left:9pt;mso-wrap-distance-top:0;mso-wrap-distance-right:9pt;mso-wrap-distance-bottom:0;mso-position-horizontal:absolute;mso-position-horizontal-relative:text;mso-position-vertical:absolute;mso-position-vertical-relative:text;mso-width-percent:0;mso-height-percent:0;mso-width-relative:margin;mso-height-relative:margin" o:gfxdata="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" strokecolor="white [3212]" strokeweight="1.5pt">
                 <v:stroke endarrow="block" joinstyle="miter"/>
               </v:shape>
             </w:pict>
@@ -17439,7 +17450,7 @@
         <mc:AlternateContent>
           <mc:Choice Requires="wps">
             <w:drawing>
-              <wp:anchor distT="0" distB="0" distL="114300" distR="114300" simplePos="0" relativeHeight="251688960" behindDoc="0" locked="0" layoutInCell="1" allowOverlap="1" wp14:anchorId="6BAB0ADB" wp14:editId="1E35828E">
+              <wp:anchor distT="0" distB="0" distL="114300" distR="114300" simplePos="0" relativeHeight="251674624" behindDoc="0" locked="0" layoutInCell="1" allowOverlap="1" wp14:anchorId="36244975" wp14:editId="2922DECE">
                 <wp:simplePos x="0" y="0"/>
                 <wp:positionH relativeFrom="column">
                   <wp:posOffset>5389074</wp:posOffset>
@@ -17507,7 +17518,7 @@
           </mc:Choice>
           <mc:Fallback>
             <w:pict>
-              <v:shape w14:anchorId="6BAB0ADB" id="_x0000_s1031" type="#_x0000_t202" style="position:absolute;left:0;text-align:left;margin-left:424.35pt;margin-top:142.1pt;width:19.35pt;height:22.55pt;z-index:251688960;visibility:visible;mso-wrap-style:square;mso-width-percent:0;mso-height-percent:0;mso-wrap-distance-left:9pt;mso-wrap-distance-top:0;mso-wrap-distance-right:9pt;mso-wrap-distance-bottom:0;mso-position-horizontal:absolute;mso-position-horizontal-relative:text;mso-position-vertical:absolute;mso-position-vertical-relative:text;mso-width-percent:0;mso-height-percent:0;mso-width-relative:margin;mso-height-relative:margin;v-text-anchor:top" o:gfxdata="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" filled="f" stroked="f" strokeweight=".5pt">
+              <v:shape w14:anchorId="36244975" id="_x0000_s1031" type="#_x0000_t202" style="position:absolute;left:0;text-align:left;margin-left:424.35pt;margin-top:142.1pt;width:19.35pt;height:22.55pt;z-index:251674624;visibility:visible;mso-wrap-style:square;mso-width-percent:0;mso-height-percent:0;mso-wrap-distance-left:9pt;mso-wrap-distance-top:0;mso-wrap-distance-right:9pt;mso-wrap-distance-bottom:0;mso-position-horizontal:absolute;mso-position-horizontal-relative:text;mso-position-vertical:absolute;mso-position-vertical-relative:text;mso-width-percent:0;mso-height-percent:0;mso-width-relative:margin;mso-height-relative:margin;v-text-anchor:top" o:gfxdata="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" filled="f" stroked="f" strokeweight=".5pt">
                 <v:textbox>
                   <w:txbxContent>
                     <w:p>
@@ -17540,7 +17551,7 @@
         <mc:AlternateContent>
           <mc:Choice Requires="wps">
             <w:drawing>
-              <wp:anchor distT="0" distB="0" distL="114300" distR="114300" simplePos="0" relativeHeight="251686912" behindDoc="0" locked="0" layoutInCell="1" allowOverlap="1" wp14:anchorId="328D368B" wp14:editId="21E3E938">
+              <wp:anchor distT="0" distB="0" distL="114300" distR="114300" simplePos="0" relativeHeight="251673600" behindDoc="0" locked="0" layoutInCell="1" allowOverlap="1" wp14:anchorId="39CA3B62" wp14:editId="1E55016F">
                 <wp:simplePos x="0" y="0"/>
                 <wp:positionH relativeFrom="column">
                   <wp:posOffset>5311386</wp:posOffset>
@@ -17601,7 +17612,7 @@
           </mc:Choice>
           <mc:Fallback>
             <w:pict>
-              <v:shape w14:anchorId="65391BA1" id="Прямая со стрелкой 2" o:spid="_x0000_s1026" type="#_x0000_t32" style="position:absolute;margin-left:418.2pt;margin-top:157.9pt;width:83.45pt;height:20.95pt;flip:x y;z-index:251686912;visibility:visible;mso-wrap-style:square;mso-width-percent:0;mso-height-percent:0;mso-wrap-distance-left:9pt;mso-wrap-distance-top:0;mso-wrap-distance-right:9pt;mso-wrap-distance-bottom:0;mso-position-horizontal:absolute;mso-position-horizontal-relative:text;mso-position-vertical:absolute;mso-position-vertical-relative:text;mso-width-percent:0;mso-height-percent:0;mso-width-relative:margin;mso-height-relative:margin" o:gfxdata="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" strokecolor="white [3212]" strokeweight="1.5pt">
+              <v:shape w14:anchorId="44C3B404" id="Прямая со стрелкой 2" o:spid="_x0000_s1026" type="#_x0000_t32" style="position:absolute;margin-left:418.2pt;margin-top:157.9pt;width:83.45pt;height:20.95pt;flip:x y;z-index:251673600;visibility:visible;mso-wrap-style:square;mso-width-percent:0;mso-height-percent:0;mso-wrap-distance-left:9pt;mso-wrap-distance-top:0;mso-wrap-distance-right:9pt;mso-wrap-distance-bottom:0;mso-position-horizontal:absolute;mso-position-horizontal-relative:text;mso-position-vertical:absolute;mso-position-vertical-relative:text;mso-width-percent:0;mso-height-percent:0;mso-width-relative:margin;mso-height-relative:margin" o:gfxdata="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" strokecolor="white [3212]" strokeweight="1.5pt">
                 <v:stroke endarrow="block" joinstyle="miter"/>
               </v:shape>
             </w:pict>
@@ -17617,7 +17628,7 @@
         <mc:AlternateContent>
           <mc:Choice Requires="wps">
             <w:drawing>
-              <wp:anchor distT="0" distB="0" distL="114300" distR="114300" simplePos="0" relativeHeight="251682816" behindDoc="0" locked="0" layoutInCell="1" allowOverlap="1" wp14:anchorId="677A118C" wp14:editId="2051CB66">
+              <wp:anchor distT="0" distB="0" distL="114300" distR="114300" simplePos="0" relativeHeight="251671552" behindDoc="0" locked="0" layoutInCell="1" allowOverlap="1" wp14:anchorId="3E24C934" wp14:editId="2447AD7A">
                 <wp:simplePos x="0" y="0"/>
                 <wp:positionH relativeFrom="column">
                   <wp:posOffset>1847101</wp:posOffset>
@@ -17685,7 +17696,7 @@
           </mc:Choice>
           <mc:Fallback>
             <w:pict>
-              <v:shape w14:anchorId="677A118C" id="_x0000_s1032" type="#_x0000_t202" style="position:absolute;left:0;text-align:left;margin-left:145.45pt;margin-top:312.45pt;width:19.35pt;height:22.55pt;z-index:251682816;visibility:visible;mso-wrap-style:square;mso-width-percent:0;mso-height-percent:0;mso-wrap-distance-left:9pt;mso-wrap-distance-top:0;mso-wrap-distance-right:9pt;mso-wrap-distance-bottom:0;mso-position-horizontal:absolute;mso-position-horizontal-relative:text;mso-position-vertical:absolute;mso-position-vertical-relative:text;mso-width-percent:0;mso-height-percent:0;mso-width-relative:margin;mso-height-relative:margin;v-text-anchor:top" o:gfxdata="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" filled="f" stroked="f" strokeweight=".5pt">
+              <v:shape w14:anchorId="3E24C934" id="_x0000_s1032" type="#_x0000_t202" style="position:absolute;left:0;text-align:left;margin-left:145.45pt;margin-top:312.45pt;width:19.35pt;height:22.55pt;z-index:251671552;visibility:visible;mso-wrap-style:square;mso-width-percent:0;mso-height-percent:0;mso-wrap-distance-left:9pt;mso-wrap-distance-top:0;mso-wrap-distance-right:9pt;mso-wrap-distance-bottom:0;mso-position-horizontal:absolute;mso-position-horizontal-relative:text;mso-position-vertical:absolute;mso-position-vertical-relative:text;mso-width-percent:0;mso-height-percent:0;mso-width-relative:margin;mso-height-relative:margin;v-text-anchor:top" o:gfxdata="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" filled="f" stroked="f" strokeweight=".5pt">
                 <v:textbox>
                   <w:txbxContent>
                     <w:p>
@@ -17718,7 +17729,7 @@
         <mc:AlternateContent>
           <mc:Choice Requires="wps">
             <w:drawing>
-              <wp:anchor distT="0" distB="0" distL="114300" distR="114300" simplePos="0" relativeHeight="251684864" behindDoc="0" locked="0" layoutInCell="1" allowOverlap="1" wp14:anchorId="2AEC8F9A" wp14:editId="74AE256B">
+              <wp:anchor distT="0" distB="0" distL="114300" distR="114300" simplePos="0" relativeHeight="251672576" behindDoc="0" locked="0" layoutInCell="1" allowOverlap="1" wp14:anchorId="6CD6F623" wp14:editId="0DAD8E3C">
                 <wp:simplePos x="0" y="0"/>
                 <wp:positionH relativeFrom="column">
                   <wp:posOffset>1756751</wp:posOffset>
@@ -17779,7 +17790,7 @@
           </mc:Choice>
           <mc:Fallback>
             <w:pict>
-              <v:shape w14:anchorId="0B430264" id="Прямая со стрелкой 2" o:spid="_x0000_s1026" type="#_x0000_t32" style="position:absolute;margin-left:138.35pt;margin-top:330pt;width:83.45pt;height:20.95pt;flip:x y;z-index:251684864;visibility:visible;mso-wrap-style:square;mso-width-percent:0;mso-height-percent:0;mso-wrap-distance-left:9pt;mso-wrap-distance-top:0;mso-wrap-distance-right:9pt;mso-wrap-distance-bottom:0;mso-position-horizontal:absolute;mso-position-horizontal-relative:text;mso-position-vertical:absolute;mso-position-vertical-relative:text;mso-width-percent:0;mso-height-percent:0;mso-width-relative:margin;mso-height-relative:margin" o:gfxdata="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" strokecolor="white [3212]" strokeweight="1.5pt">
+              <v:shape w14:anchorId="0125EE74" id="Прямая со стрелкой 2" o:spid="_x0000_s1026" type="#_x0000_t32" style="position:absolute;margin-left:138.35pt;margin-top:330pt;width:83.45pt;height:20.95pt;flip:x y;z-index:251672576;visibility:visible;mso-wrap-style:square;mso-width-percent:0;mso-height-percent:0;mso-wrap-distance-left:9pt;mso-wrap-distance-top:0;mso-wrap-distance-right:9pt;mso-wrap-distance-bottom:0;mso-position-horizontal:absolute;mso-position-horizontal-relative:text;mso-position-vertical:absolute;mso-position-vertical-relative:text;mso-width-percent:0;mso-height-percent:0;mso-width-relative:margin;mso-height-relative:margin" o:gfxdata="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" strokecolor="white [3212]" strokeweight="1.5pt">
                 <v:stroke endarrow="block" joinstyle="miter"/>
               </v:shape>
             </w:pict>
@@ -17795,7 +17806,7 @@
         <mc:AlternateContent>
           <mc:Choice Requires="wps">
             <w:drawing>
-              <wp:anchor distT="0" distB="0" distL="114300" distR="114300" simplePos="0" relativeHeight="251680768" behindDoc="0" locked="0" layoutInCell="1" allowOverlap="1" wp14:anchorId="44D690EB" wp14:editId="2065887F">
+              <wp:anchor distT="0" distB="0" distL="114300" distR="114300" simplePos="0" relativeHeight="251670528" behindDoc="0" locked="0" layoutInCell="1" allowOverlap="1" wp14:anchorId="56364E77" wp14:editId="7C6D0DAF">
                 <wp:simplePos x="0" y="0"/>
                 <wp:positionH relativeFrom="column">
                   <wp:posOffset>2687254</wp:posOffset>
@@ -17863,7 +17874,7 @@
           </mc:Choice>
           <mc:Fallback>
             <w:pict>
-              <v:shape w14:anchorId="44D690EB" id="_x0000_s1033" type="#_x0000_t202" style="position:absolute;left:0;text-align:left;margin-left:211.6pt;margin-top:249.05pt;width:19.35pt;height:22.55pt;z-index:251680768;visibility:visible;mso-wrap-style:square;mso-width-percent:0;mso-height-percent:0;mso-wrap-distance-left:9pt;mso-wrap-distance-top:0;mso-wrap-distance-right:9pt;mso-wrap-distance-bottom:0;mso-position-horizontal:absolute;mso-position-horizontal-relative:text;mso-position-vertical:absolute;mso-position-vertical-relative:text;mso-width-percent:0;mso-height-percent:0;mso-width-relative:margin;mso-height-relative:margin;v-text-anchor:top" o:gfxdata="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" filled="f" stroked="f" strokeweight=".5pt">
+              <v:shape w14:anchorId="56364E77" id="_x0000_s1033" type="#_x0000_t202" style="position:absolute;left:0;text-align:left;margin-left:211.6pt;margin-top:249.05pt;width:19.35pt;height:22.55pt;z-index:251670528;visibility:visible;mso-wrap-style:square;mso-width-percent:0;mso-height-percent:0;mso-wrap-distance-left:9pt;mso-wrap-distance-top:0;mso-wrap-distance-right:9pt;mso-wrap-distance-bottom:0;mso-position-horizontal:absolute;mso-position-horizontal-relative:text;mso-position-vertical:absolute;mso-position-vertical-relative:text;mso-width-percent:0;mso-height-percent:0;mso-width-relative:margin;mso-height-relative:margin;v-text-anchor:top" o:gfxdata="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" filled="f" stroked="f" strokeweight=".5pt">
                 <v:textbox>
                   <w:txbxContent>
                     <w:p>
@@ -17896,7 +17907,7 @@
         <mc:AlternateContent>
           <mc:Choice Requires="wps">
             <w:drawing>
-              <wp:anchor distT="0" distB="0" distL="114300" distR="114300" simplePos="0" relativeHeight="251678720" behindDoc="0" locked="0" layoutInCell="1" allowOverlap="1" wp14:anchorId="26CA7334" wp14:editId="7220B942">
+              <wp:anchor distT="0" distB="0" distL="114300" distR="114300" simplePos="0" relativeHeight="251669504" behindDoc="0" locked="0" layoutInCell="1" allowOverlap="1" wp14:anchorId="7EB2E656" wp14:editId="303B6382">
                 <wp:simplePos x="0" y="0"/>
                 <wp:positionH relativeFrom="column">
                   <wp:posOffset>2532058</wp:posOffset>
@@ -17957,7 +17968,7 @@
           </mc:Choice>
           <mc:Fallback>
             <w:pict>
-              <v:shape w14:anchorId="4476A111" id="Прямая со стрелкой 2" o:spid="_x0000_s1026" type="#_x0000_t32" style="position:absolute;margin-left:199.35pt;margin-top:265.75pt;width:75.45pt;height:7.85pt;flip:x y;z-index:251678720;visibility:visible;mso-wrap-style:square;mso-width-percent:0;mso-height-percent:0;mso-wrap-distance-left:9pt;mso-wrap-distance-top:0;mso-wrap-distance-right:9pt;mso-wrap-distance-bottom:0;mso-position-horizontal:absolute;mso-position-horizontal-relative:text;mso-position-vertical:absolute;mso-position-vertical-relative:text;mso-width-percent:0;mso-height-percent:0;mso-width-relative:margin;mso-height-relative:margin" o:gfxdata="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" strokecolor="white [3212]" strokeweight="1.5pt">
+              <v:shape w14:anchorId="6985B674" id="Прямая со стрелкой 2" o:spid="_x0000_s1026" type="#_x0000_t32" style="position:absolute;margin-left:199.35pt;margin-top:265.75pt;width:75.45pt;height:7.85pt;flip:x y;z-index:251669504;visibility:visible;mso-wrap-style:square;mso-width-percent:0;mso-height-percent:0;mso-wrap-distance-left:9pt;mso-wrap-distance-top:0;mso-wrap-distance-right:9pt;mso-wrap-distance-bottom:0;mso-position-horizontal:absolute;mso-position-horizontal-relative:text;mso-position-vertical:absolute;mso-position-vertical-relative:text;mso-width-percent:0;mso-height-percent:0;mso-width-relative:margin;mso-height-relative:margin" o:gfxdata="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" strokecolor="white [3212]" strokeweight="1.5pt">
                 <v:stroke endarrow="block" joinstyle="miter"/>
               </v:shape>
             </w:pict>
@@ -17973,7 +17984,7 @@
         <mc:AlternateContent>
           <mc:Choice Requires="wps">
             <w:drawing>
-              <wp:anchor distT="0" distB="0" distL="114300" distR="114300" simplePos="0" relativeHeight="251676672" behindDoc="0" locked="0" layoutInCell="1" allowOverlap="1" wp14:anchorId="5B35A3AC" wp14:editId="27185604">
+              <wp:anchor distT="0" distB="0" distL="114300" distR="114300" simplePos="0" relativeHeight="251668480" behindDoc="0" locked="0" layoutInCell="1" allowOverlap="1" wp14:anchorId="71654C36" wp14:editId="5629B997">
                 <wp:simplePos x="0" y="0"/>
                 <wp:positionH relativeFrom="column">
                   <wp:posOffset>1429830</wp:posOffset>
@@ -18041,7 +18052,7 @@
           </mc:Choice>
           <mc:Fallback>
             <w:pict>
-              <v:shape w14:anchorId="5B35A3AC" id="_x0000_s1034" type="#_x0000_t202" style="position:absolute;left:0;text-align:left;margin-left:112.6pt;margin-top:194.7pt;width:19.35pt;height:22.55pt;z-index:251676672;visibility:visible;mso-wrap-style:square;mso-width-percent:0;mso-height-percent:0;mso-wrap-distance-left:9pt;mso-wrap-distance-top:0;mso-wrap-distance-right:9pt;mso-wrap-distance-bottom:0;mso-position-horizontal:absolute;mso-position-horizontal-relative:text;mso-position-vertical:absolute;mso-position-vertical-relative:text;mso-width-percent:0;mso-height-percent:0;mso-width-relative:margin;mso-height-relative:margin;v-text-anchor:top" o:gfxdata="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" filled="f" stroked="f" strokeweight=".5pt">
+              <v:shape w14:anchorId="71654C36" id="_x0000_s1034" type="#_x0000_t202" style="position:absolute;left:0;text-align:left;margin-left:112.6pt;margin-top:194.7pt;width:19.35pt;height:22.55pt;z-index:251668480;visibility:visible;mso-wrap-style:square;mso-width-percent:0;mso-height-percent:0;mso-wrap-distance-left:9pt;mso-wrap-distance-top:0;mso-wrap-distance-right:9pt;mso-wrap-distance-bottom:0;mso-position-horizontal:absolute;mso-position-horizontal-relative:text;mso-position-vertical:absolute;mso-position-vertical-relative:text;mso-width-percent:0;mso-height-percent:0;mso-width-relative:margin;mso-height-relative:margin;v-text-anchor:top" o:gfxdata="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" filled="f" stroked="f" strokeweight=".5pt">
                 <v:textbox>
                   <w:txbxContent>
                     <w:p>
@@ -18074,7 +18085,7 @@
         <mc:AlternateContent>
           <mc:Choice Requires="wps">
             <w:drawing>
-              <wp:anchor distT="0" distB="0" distL="114300" distR="114300" simplePos="0" relativeHeight="251670528" behindDoc="0" locked="0" layoutInCell="1" allowOverlap="1" wp14:anchorId="417EDA50" wp14:editId="5D7176E0">
+              <wp:anchor distT="0" distB="0" distL="114300" distR="114300" simplePos="0" relativeHeight="251665408" behindDoc="0" locked="0" layoutInCell="1" allowOverlap="1" wp14:anchorId="19C1A701" wp14:editId="3530A057">
                 <wp:simplePos x="0" y="0"/>
                 <wp:positionH relativeFrom="column">
                   <wp:posOffset>1332354</wp:posOffset>
@@ -18135,7 +18146,7 @@
           </mc:Choice>
           <mc:Fallback>
             <w:pict>
-              <v:shape w14:anchorId="5D3F0A8F" id="Прямая со стрелкой 2" o:spid="_x0000_s1026" type="#_x0000_t32" style="position:absolute;margin-left:104.9pt;margin-top:209.9pt;width:73.85pt;height:19.7pt;flip:x y;z-index:251670528;visibility:visible;mso-wrap-style:square;mso-width-percent:0;mso-height-percent:0;mso-wrap-distance-left:9pt;mso-wrap-distance-top:0;mso-wrap-distance-right:9pt;mso-wrap-distance-bottom:0;mso-position-horizontal:absolute;mso-position-horizontal-relative:text;mso-position-vertical:absolute;mso-position-vertical-relative:text;mso-width-percent:0;mso-height-percent:0;mso-width-relative:margin;mso-height-relative:margin" o:gfxdata="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" strokecolor="white [3212]" strokeweight="1.5pt">
+              <v:shape w14:anchorId="1C0A081E" id="Прямая со стрелкой 2" o:spid="_x0000_s1026" type="#_x0000_t32" style="position:absolute;margin-left:104.9pt;margin-top:209.9pt;width:73.85pt;height:19.7pt;flip:x y;z-index:251665408;visibility:visible;mso-wrap-style:square;mso-width-percent:0;mso-height-percent:0;mso-wrap-distance-left:9pt;mso-wrap-distance-top:0;mso-wrap-distance-right:9pt;mso-wrap-distance-bottom:0;mso-position-horizontal:absolute;mso-position-horizontal-relative:text;mso-position-vertical:absolute;mso-position-vertical-relative:text;mso-width-percent:0;mso-height-percent:0;mso-width-relative:margin;mso-height-relative:margin" o:gfxdata="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" strokecolor="white [3212]" strokeweight="1.5pt">
                 <v:stroke endarrow="block" joinstyle="miter"/>
               </v:shape>
             </w:pict>
@@ -18149,7 +18160,7 @@
           <w:lang w:eastAsia="ru-RU"/>
         </w:rPr>
         <w:drawing>
-          <wp:inline distT="0" distB="0" distL="0" distR="0" wp14:anchorId="538661B0" wp14:editId="1244A72A">
+          <wp:inline distT="0" distB="0" distL="0" distR="0" wp14:anchorId="2583EE51" wp14:editId="515A628E">
             <wp:extent cx="6298565" cy="4988560"/>
             <wp:effectExtent l="0" t="0" r="6985" b="2540"/>
             <wp:docPr id="1374187795" name="Рисунок 6"/>
@@ -18166,7 +18177,7 @@
                     </pic:cNvPicPr>
                   </pic:nvPicPr>
                   <pic:blipFill>
-                    <a:blip r:embed="rId11">
+                    <a:blip r:embed="rId14">
                       <a:extLst>
                         <a:ext uri="{28A0092B-C50C-407E-A947-70E740481C1C}">
                           <a14:useLocalDpi xmlns:a14="http://schemas.microsoft.com/office/drawing/2010/main" val="0"/>
@@ -18327,7 +18338,14 @@
           <w:szCs w:val="24"/>
           <w:lang w:val="ru-RU" w:eastAsia="ru-RU"/>
         </w:rPr>
-        <w:t>Вывод результата;</w:t>
+        <w:t>Вывод результата</w:t>
+      </w:r>
+      <w:r>
+        <w:rPr>
+          <w:szCs w:val="24"/>
+          <w:lang w:val="en-US" w:eastAsia="ru-RU"/>
+        </w:rPr>
+        <w:t>.</w:t>
       </w:r>
     </w:p>
     <w:p>
@@ -18348,7 +18366,14 @@
           <w:szCs w:val="24"/>
           <w:lang w:val="ru-RU" w:eastAsia="ru-RU"/>
         </w:rPr>
-        <w:t>Вывод тригонометрической формы;</w:t>
+        <w:t>Вывод тригонометрической формы</w:t>
+      </w:r>
+      <w:r>
+        <w:rPr>
+          <w:szCs w:val="24"/>
+          <w:lang w:val="en-US" w:eastAsia="ru-RU"/>
+        </w:rPr>
+        <w:t>.</w:t>
       </w:r>
     </w:p>
     <w:p>
@@ -18369,7 +18394,14 @@
           <w:szCs w:val="24"/>
           <w:lang w:val="ru-RU" w:eastAsia="ru-RU"/>
         </w:rPr>
-        <w:t>Вывод подробных сведений о результате;</w:t>
+        <w:t>Вывод подробных сведений о результате</w:t>
+      </w:r>
+      <w:r>
+        <w:rPr>
+          <w:szCs w:val="24"/>
+          <w:lang w:val="ru-RU" w:eastAsia="ru-RU"/>
+        </w:rPr>
+        <w:t>.</w:t>
       </w:r>
     </w:p>
     <w:p>
@@ -18390,7 +18422,14 @@
           <w:szCs w:val="24"/>
           <w:lang w:val="ru-RU" w:eastAsia="ru-RU"/>
         </w:rPr>
-        <w:t>Сохранение в истории вычислений;</w:t>
+        <w:t>Сохранение в истории вычислений</w:t>
+      </w:r>
+      <w:r>
+        <w:rPr>
+          <w:szCs w:val="24"/>
+          <w:lang w:val="en-US" w:eastAsia="ru-RU"/>
+        </w:rPr>
+        <w:t>.</w:t>
       </w:r>
     </w:p>
     <w:p>
@@ -18431,7 +18470,7 @@
           <w:lang w:val="ru-RU" w:eastAsia="ru-RU"/>
         </w:rPr>
       </w:pPr>
-      <w:bookmarkStart w:id="18" w:name="_Toc230686214"/>
+      <w:bookmarkStart w:id="19" w:name="_Toc230686214"/>
       <w:r>
         <w:rPr>
           <w:b/>
@@ -18441,7 +18480,7 @@
         </w:rPr>
         <w:t>Сообщения системы</w:t>
       </w:r>
-      <w:bookmarkEnd w:id="18"/>
+      <w:bookmarkEnd w:id="19"/>
     </w:p>
     <w:p>
       <w:pPr>
@@ -18690,21 +18729,7 @@
           <w:szCs w:val="24"/>
           <w:lang w:val="ru-RU" w:eastAsia="ru-RU"/>
         </w:rPr>
-        <w:t>Сообщение: «</w:t>
-      </w:r>
-      <w:r>
-        <w:rPr>
-          <w:szCs w:val="24"/>
-          <w:lang w:val="ru-RU" w:eastAsia="ru-RU"/>
-        </w:rPr>
-        <w:t>Неизвестная функция</w:t>
-      </w:r>
-      <w:r>
-        <w:rPr>
-          <w:szCs w:val="24"/>
-          <w:lang w:val="ru-RU" w:eastAsia="ru-RU"/>
-        </w:rPr>
-        <w:t>».</w:t>
+        <w:t>Сообщение: «Неизвестная функция».</w:t>
       </w:r>
     </w:p>
     <w:p>
@@ -18725,14 +18750,7 @@
           <w:szCs w:val="24"/>
           <w:lang w:val="ru-RU" w:eastAsia="ru-RU"/>
         </w:rPr>
-        <w:t xml:space="preserve">Действие пользователя: проверить </w:t>
-      </w:r>
-      <w:r>
-        <w:rPr>
-          <w:szCs w:val="24"/>
-          <w:lang w:val="ru-RU" w:eastAsia="ru-RU"/>
-        </w:rPr>
-        <w:t>имя функции.</w:t>
+        <w:t>Действие пользователя: проверить имя функции.</w:t>
       </w:r>
     </w:p>
     <w:p>
@@ -18865,10 +18883,9 @@
           <w:b/>
           <w:bCs/>
           <w:szCs w:val="24"/>
-          <w:lang w:val="ru-RU" w:eastAsia="ru-RU"/>
-        </w:rPr>
-      </w:pPr>
-      <w:bookmarkStart w:id="19" w:name="_Toc230686215"/>
+          <w:lang w:eastAsia="ru-RU"/>
+        </w:rPr>
+      </w:pPr>
       <w:r>
         <w:rPr>
           <w:b/>
@@ -18879,7 +18896,7 @@
         <w:lastRenderedPageBreak/>
         <w:t>ПРОГРАММА И МЕТОДИКА ИСПЫТАНИЙ</w:t>
       </w:r>
-      <w:bookmarkEnd w:id="19"/>
+      <w:bookmarkEnd w:id="14"/>
     </w:p>
     <w:p>
       <w:pPr>
@@ -18928,21 +18945,7 @@
           <w:szCs w:val="24"/>
           <w:lang w:val="ru-RU" w:eastAsia="ru-RU"/>
         </w:rPr>
-        <w:t>Запустить программу «ComplexCalculator.exe»</w:t>
-      </w:r>
-      <w:r>
-        <w:rPr>
-          <w:szCs w:val="24"/>
-          <w:lang w:val="ru-RU" w:eastAsia="ru-RU"/>
-        </w:rPr>
-        <w:t xml:space="preserve"> (рис.2.1)</w:t>
-      </w:r>
-      <w:r>
-        <w:rPr>
-          <w:szCs w:val="24"/>
-          <w:lang w:val="ru-RU" w:eastAsia="ru-RU"/>
-        </w:rPr>
-        <w:t>.</w:t>
+        <w:t>Запустить программу «ComplexCalculator.exe» (рис.2.1).</w:t>
       </w:r>
     </w:p>
     <w:p>
@@ -18963,14 +18966,7 @@
           <w:szCs w:val="24"/>
           <w:lang w:val="ru-RU" w:eastAsia="ru-RU"/>
         </w:rPr>
-        <w:t>Убедиться, что после запуска появляется главное окно программы</w:t>
-      </w:r>
-      <w:r>
-        <w:rPr>
-          <w:szCs w:val="24"/>
-          <w:lang w:val="ru-RU" w:eastAsia="ru-RU"/>
-        </w:rPr>
-        <w:t xml:space="preserve"> (рис.2.1).</w:t>
+        <w:t>Убедиться, что после запуска появляется главное окно программы (рис.2.1).</w:t>
       </w:r>
     </w:p>
     <w:p>
@@ -19515,6 +19511,7 @@
     <w:p>
       <w:pPr>
         <w:keepNext/>
+        <w:ind w:firstLine="0"/>
         <w:jc w:val="center"/>
         <w:rPr>
           <w:sz w:val="20"/>
@@ -19526,10 +19523,11 @@
           <w:noProof/>
           <w:sz w:val="20"/>
           <w:szCs w:val="20"/>
+          <w:lang w:eastAsia="ru-RU"/>
         </w:rPr>
         <w:lastRenderedPageBreak/>
         <w:drawing>
-          <wp:inline distT="0" distB="0" distL="0" distR="0" wp14:anchorId="2C488683" wp14:editId="6E8414BC">
+          <wp:inline distT="0" distB="0" distL="0" distR="0" wp14:anchorId="4F38D490" wp14:editId="523F82C9">
             <wp:extent cx="6297295" cy="4831080"/>
             <wp:effectExtent l="0" t="0" r="8255" b="7620"/>
             <wp:docPr id="1557934156" name="Рисунок 20"/>
@@ -19546,7 +19544,7 @@
                     </pic:cNvPicPr>
                   </pic:nvPicPr>
                   <pic:blipFill>
-                    <a:blip r:embed="rId12">
+                    <a:blip r:embed="rId15">
                       <a:extLst>
                         <a:ext uri="{28A0092B-C50C-407E-A947-70E740481C1C}">
                           <a14:useLocalDpi xmlns:a14="http://schemas.microsoft.com/office/drawing/2010/main" val="0"/>
@@ -19639,6 +19637,7 @@
     <w:p>
       <w:pPr>
         <w:keepNext/>
+        <w:ind w:firstLine="0"/>
         <w:jc w:val="center"/>
         <w:rPr>
           <w:sz w:val="20"/>
@@ -19650,11 +19649,11 @@
           <w:noProof/>
           <w:sz w:val="20"/>
           <w:szCs w:val="20"/>
-          <w:lang w:val="en-US" w:eastAsia="ru-RU"/>
+          <w:lang w:eastAsia="ru-RU"/>
         </w:rPr>
         <w:lastRenderedPageBreak/>
         <w:drawing>
-          <wp:inline distT="0" distB="0" distL="0" distR="0" wp14:anchorId="12973AB5" wp14:editId="466D7A4E">
+          <wp:inline distT="0" distB="0" distL="0" distR="0" wp14:anchorId="69893721" wp14:editId="5014CC39">
             <wp:extent cx="6288405" cy="4408170"/>
             <wp:effectExtent l="0" t="0" r="0" b="0"/>
             <wp:docPr id="8279807" name="Рисунок 21"/>
@@ -19671,7 +19670,7 @@
                     </pic:cNvPicPr>
                   </pic:nvPicPr>
                   <pic:blipFill>
-                    <a:blip r:embed="rId13">
+                    <a:blip r:embed="rId16">
                       <a:extLst>
                         <a:ext uri="{28A0092B-C50C-407E-A947-70E740481C1C}">
                           <a14:useLocalDpi xmlns:a14="http://schemas.microsoft.com/office/drawing/2010/main" val="0"/>
@@ -19780,14 +19779,15 @@
     <w:p>
       <w:pPr>
         <w:keepNext/>
+        <w:ind w:firstLine="0"/>
       </w:pPr>
       <w:r>
         <w:rPr>
           <w:noProof/>
-          <w:lang w:val="en-US" w:eastAsia="ru-RU"/>
+          <w:lang w:eastAsia="ru-RU"/>
         </w:rPr>
         <w:drawing>
-          <wp:inline distT="0" distB="0" distL="0" distR="0" wp14:anchorId="08FEA1ED" wp14:editId="1EF457C5">
+          <wp:inline distT="0" distB="0" distL="0" distR="0" wp14:anchorId="48EB7B60" wp14:editId="0CE8F575">
             <wp:extent cx="6297295" cy="3855720"/>
             <wp:effectExtent l="0" t="0" r="8255" b="0"/>
             <wp:docPr id="1992801265" name="Рисунок 22"/>
@@ -19804,7 +19804,7 @@
                     </pic:cNvPicPr>
                   </pic:nvPicPr>
                   <pic:blipFill>
-                    <a:blip r:embed="rId14">
+                    <a:blip r:embed="rId17">
                       <a:extLst>
                         <a:ext uri="{28A0092B-C50C-407E-A947-70E740481C1C}">
                           <a14:useLocalDpi xmlns:a14="http://schemas.microsoft.com/office/drawing/2010/main" val="0"/>
@@ -19912,11 +19912,11 @@
       <w:r>
         <w:rPr>
           <w:noProof/>
-          <w:lang w:val="en-US" w:eastAsia="ru-RU"/>
+          <w:lang w:eastAsia="ru-RU"/>
         </w:rPr>
         <w:lastRenderedPageBreak/>
         <w:drawing>
-          <wp:inline distT="0" distB="0" distL="0" distR="0" wp14:anchorId="7BC75621" wp14:editId="54A3EB28">
+          <wp:inline distT="0" distB="0" distL="0" distR="0" wp14:anchorId="601D4C57" wp14:editId="5F068058">
             <wp:extent cx="5374005" cy="3269615"/>
             <wp:effectExtent l="0" t="0" r="0" b="6985"/>
             <wp:docPr id="1748259834" name="Рисунок 23"/>
@@ -19933,7 +19933,7 @@
                     </pic:cNvPicPr>
                   </pic:nvPicPr>
                   <pic:blipFill>
-                    <a:blip r:embed="rId15">
+                    <a:blip r:embed="rId18">
                       <a:extLst>
                         <a:ext uri="{28A0092B-C50C-407E-A947-70E740481C1C}">
                           <a14:useLocalDpi xmlns:a14="http://schemas.microsoft.com/office/drawing/2010/main" val="0"/>
@@ -20056,14 +20056,15 @@
     <w:p>
       <w:pPr>
         <w:keepNext/>
+        <w:ind w:firstLine="0"/>
       </w:pPr>
       <w:r>
         <w:rPr>
           <w:noProof/>
-          <w:lang w:val="en-US" w:eastAsia="ru-RU"/>
+          <w:lang w:eastAsia="ru-RU"/>
         </w:rPr>
         <w:drawing>
-          <wp:inline distT="0" distB="0" distL="0" distR="0" wp14:anchorId="0CEC1A86" wp14:editId="32E7940B">
+          <wp:inline distT="0" distB="0" distL="0" distR="0" wp14:anchorId="17768889" wp14:editId="3960BE12">
             <wp:extent cx="6297295" cy="3390265"/>
             <wp:effectExtent l="0" t="0" r="8255" b="635"/>
             <wp:docPr id="23876702" name="Рисунок 24"/>
@@ -20080,7 +20081,7 @@
                     </pic:cNvPicPr>
                   </pic:nvPicPr>
                   <pic:blipFill>
-                    <a:blip r:embed="rId16">
+                    <a:blip r:embed="rId19">
                       <a:extLst>
                         <a:ext uri="{28A0092B-C50C-407E-A947-70E740481C1C}">
                           <a14:useLocalDpi xmlns:a14="http://schemas.microsoft.com/office/drawing/2010/main" val="0"/>
@@ -20159,15 +20160,16 @@
     <w:p>
       <w:pPr>
         <w:keepNext/>
+        <w:ind w:firstLine="0"/>
       </w:pPr>
       <w:r>
         <w:rPr>
           <w:noProof/>
-          <w:lang w:val="en-US" w:eastAsia="ru-RU"/>
+          <w:lang w:eastAsia="ru-RU"/>
         </w:rPr>
         <w:lastRenderedPageBreak/>
         <w:drawing>
-          <wp:inline distT="0" distB="0" distL="0" distR="0" wp14:anchorId="47D7CA07" wp14:editId="4112D981">
+          <wp:inline distT="0" distB="0" distL="0" distR="0" wp14:anchorId="4F688B42" wp14:editId="78B35131">
             <wp:extent cx="6297295" cy="4425315"/>
             <wp:effectExtent l="0" t="0" r="8255" b="0"/>
             <wp:docPr id="369573653" name="Рисунок 25"/>
@@ -20184,7 +20186,7 @@
                     </pic:cNvPicPr>
                   </pic:nvPicPr>
                   <pic:blipFill>
-                    <a:blip r:embed="rId17">
+                    <a:blip r:embed="rId20">
                       <a:extLst>
                         <a:ext uri="{28A0092B-C50C-407E-A947-70E740481C1C}">
                           <a14:useLocalDpi xmlns:a14="http://schemas.microsoft.com/office/drawing/2010/main" val="0"/>
@@ -20329,16 +20331,7 @@
           <w:szCs w:val="24"/>
           <w:lang w:val="ru-RU" w:eastAsia="ru-RU"/>
         </w:rPr>
-        <w:t xml:space="preserve">Проверка работоспособности программы при использовании </w:t>
-      </w:r>
-      <w:r>
-        <w:rPr>
-          <w:b/>
-          <w:bCs/>
-          <w:szCs w:val="24"/>
-          <w:lang w:val="ru-RU" w:eastAsia="ru-RU"/>
-        </w:rPr>
-        <w:t>встроенных функций</w:t>
+        <w:t>Проверка работоспособности программы при использовании встроенных функций</w:t>
       </w:r>
       <w:bookmarkEnd w:id="21"/>
     </w:p>
@@ -20406,21 +20399,33 @@
           <w:lang w:eastAsia="ru-RU"/>
         </w:rPr>
       </w:pPr>
-      <w:proofErr w:type="gramStart"/>
       <w:r>
         <w:rPr>
           <w:szCs w:val="24"/>
           <w:lang w:eastAsia="ru-RU"/>
         </w:rPr>
-        <w:t>полярная(</w:t>
-      </w:r>
-      <w:proofErr w:type="gramEnd"/>
+        <w:t>П</w:t>
+      </w:r>
       <w:r>
         <w:rPr>
           <w:szCs w:val="24"/>
           <w:lang w:eastAsia="ru-RU"/>
         </w:rPr>
-        <w:t>5;45)</w:t>
+        <w:t>олярная</w:t>
+      </w:r>
+      <w:r>
+        <w:rPr>
+          <w:szCs w:val="24"/>
+          <w:lang w:eastAsia="ru-RU"/>
+        </w:rPr>
+        <w:t xml:space="preserve"> </w:t>
+      </w:r>
+      <w:r>
+        <w:rPr>
+          <w:szCs w:val="24"/>
+          <w:lang w:eastAsia="ru-RU"/>
+        </w:rPr>
+        <w:t>(5;45)</w:t>
       </w:r>
     </w:p>
     <w:p>
@@ -20654,6 +20659,7 @@
     <w:p>
       <w:pPr>
         <w:keepNext/>
+        <w:ind w:firstLine="0"/>
       </w:pPr>
       <w:r>
         <w:rPr>
@@ -20663,7 +20669,7 @@
         </w:rPr>
         <w:lastRenderedPageBreak/>
         <w:drawing>
-          <wp:inline distT="0" distB="0" distL="0" distR="0" wp14:anchorId="34AE920A" wp14:editId="26428517">
+          <wp:inline distT="0" distB="0" distL="0" distR="0" wp14:anchorId="123ECC6D" wp14:editId="0E351C63">
             <wp:extent cx="6297295" cy="4831080"/>
             <wp:effectExtent l="0" t="0" r="8255" b="7620"/>
             <wp:docPr id="436627167" name="Рисунок 26"/>
@@ -20680,7 +20686,7 @@
                     </pic:cNvPicPr>
                   </pic:nvPicPr>
                   <pic:blipFill>
-                    <a:blip r:embed="rId18">
+                    <a:blip r:embed="rId21">
                       <a:extLst>
                         <a:ext uri="{28A0092B-C50C-407E-A947-70E740481C1C}">
                           <a14:useLocalDpi xmlns:a14="http://schemas.microsoft.com/office/drawing/2010/main" val="0"/>
@@ -20742,23 +20748,29 @@
         </w:rPr>
         <w:t xml:space="preserve"> – Интерфейс после вычисления </w:t>
       </w:r>
-      <w:proofErr w:type="gramStart"/>
       <w:r>
         <w:rPr>
           <w:sz w:val="20"/>
           <w:szCs w:val="20"/>
           <w:lang w:eastAsia="ru-RU"/>
         </w:rPr>
-        <w:t>полярная(</w:t>
-      </w:r>
-      <w:proofErr w:type="gramEnd"/>
+        <w:t>полярная</w:t>
+      </w:r>
       <w:r>
         <w:rPr>
           <w:sz w:val="20"/>
           <w:szCs w:val="20"/>
           <w:lang w:eastAsia="ru-RU"/>
         </w:rPr>
-        <w:t>5;45)</w:t>
+        <w:t xml:space="preserve"> </w:t>
+      </w:r>
+      <w:r>
+        <w:rPr>
+          <w:sz w:val="20"/>
+          <w:szCs w:val="20"/>
+          <w:lang w:eastAsia="ru-RU"/>
+        </w:rPr>
+        <w:t>(5;45)</w:t>
       </w:r>
     </w:p>
     <w:p>
@@ -21254,6 +21266,7 @@
     <w:p>
       <w:pPr>
         <w:keepNext/>
+        <w:ind w:firstLine="0"/>
       </w:pPr>
       <w:r>
         <w:rPr>
@@ -21262,7 +21275,7 @@
           <w:lang w:eastAsia="ru-RU"/>
         </w:rPr>
         <w:drawing>
-          <wp:inline distT="0" distB="0" distL="0" distR="0" wp14:anchorId="24DE4AF1" wp14:editId="0EDC781E">
+          <wp:inline distT="0" distB="0" distL="0" distR="0" wp14:anchorId="268EAA94" wp14:editId="4A32B479">
             <wp:extent cx="6297295" cy="4831080"/>
             <wp:effectExtent l="0" t="0" r="8255" b="7620"/>
             <wp:docPr id="1235970985" name="Рисунок 30"/>
@@ -21279,7 +21292,7 @@
                     </pic:cNvPicPr>
                   </pic:nvPicPr>
                   <pic:blipFill>
-                    <a:blip r:embed="rId19">
+                    <a:blip r:embed="rId22">
                       <a:extLst>
                         <a:ext uri="{28A0092B-C50C-407E-A947-70E740481C1C}">
                           <a14:useLocalDpi xmlns:a14="http://schemas.microsoft.com/office/drawing/2010/main" val="0"/>
@@ -21358,6 +21371,7 @@
     <w:p>
       <w:pPr>
         <w:keepNext/>
+        <w:ind w:firstLine="0"/>
       </w:pPr>
       <w:r>
         <w:rPr>
@@ -21367,7 +21381,7 @@
         </w:rPr>
         <w:lastRenderedPageBreak/>
         <w:drawing>
-          <wp:inline distT="0" distB="0" distL="0" distR="0" wp14:anchorId="3958358D" wp14:editId="6D46F191">
+          <wp:inline distT="0" distB="0" distL="0" distR="0" wp14:anchorId="16427574" wp14:editId="0EA0A169">
             <wp:extent cx="6296025" cy="4252823"/>
             <wp:effectExtent l="0" t="0" r="0" b="0"/>
             <wp:docPr id="37649312" name="Рисунок 28"/>
@@ -21384,7 +21398,7 @@
                     </pic:cNvPicPr>
                   </pic:nvPicPr>
                   <pic:blipFill>
-                    <a:blip r:embed="rId20">
+                    <a:blip r:embed="rId23">
                       <a:extLst>
                         <a:ext uri="{28A0092B-C50C-407E-A947-70E740481C1C}">
                           <a14:useLocalDpi xmlns:a14="http://schemas.microsoft.com/office/drawing/2010/main" val="0"/>
@@ -21462,6 +21476,7 @@
     <w:p>
       <w:pPr>
         <w:keepNext/>
+        <w:ind w:firstLine="0"/>
       </w:pPr>
       <w:r>
         <w:rPr>
@@ -21469,7 +21484,7 @@
           <w:lang w:eastAsia="ru-RU"/>
         </w:rPr>
         <w:drawing>
-          <wp:inline distT="0" distB="0" distL="0" distR="0" wp14:anchorId="7BA31555" wp14:editId="0631E83B">
+          <wp:inline distT="0" distB="0" distL="0" distR="0" wp14:anchorId="435CEA73" wp14:editId="5E9B052F">
             <wp:extent cx="6295334" cy="4175185"/>
             <wp:effectExtent l="0" t="0" r="0" b="0"/>
             <wp:docPr id="548904026" name="Рисунок 29"/>
@@ -21486,7 +21501,7 @@
                     </pic:cNvPicPr>
                   </pic:nvPicPr>
                   <pic:blipFill>
-                    <a:blip r:embed="rId21">
+                    <a:blip r:embed="rId24">
                       <a:extLst>
                         <a:ext uri="{28A0092B-C50C-407E-A947-70E740481C1C}">
                           <a14:useLocalDpi xmlns:a14="http://schemas.microsoft.com/office/drawing/2010/main" val="0"/>
@@ -21570,18 +21585,7 @@
           <w:szCs w:val="20"/>
           <w:lang w:eastAsia="ru-RU"/>
         </w:rPr>
-        <w:t xml:space="preserve"> </w:t>
-      </w:r>
-      <w:r>
-        <w:rPr>
-          <w:i w:val="0"/>
-          <w:iCs w:val="0"/>
-          <w:color w:val="auto"/>
-          <w:sz w:val="20"/>
-          <w:szCs w:val="20"/>
-          <w:lang w:eastAsia="ru-RU"/>
-        </w:rPr>
-        <w:t>Отсутствует зарывающая скобка ')'</w:t>
+        <w:t xml:space="preserve"> Отсутствует зарывающая скобка ')'</w:t>
       </w:r>
       <w:r>
         <w:rPr>
@@ -21845,63 +21849,12 @@
           <w:szCs w:val="24"/>
           <w:lang w:val="ru-RU" w:eastAsia="ru-RU"/>
         </w:rPr>
-        <w:t xml:space="preserve"> (</w:t>
-      </w:r>
-      <w:r>
-        <w:rPr>
-          <w:szCs w:val="24"/>
-          <w:lang w:val="ru-RU" w:eastAsia="ru-RU"/>
-        </w:rPr>
-        <w:t>рис. 3.2, 3.3, 3.4,</w:t>
-      </w:r>
-      <w:r>
-        <w:rPr>
-          <w:szCs w:val="24"/>
-          <w:lang w:val="ru-RU" w:eastAsia="ru-RU"/>
-        </w:rPr>
-        <w:t> </w:t>
-      </w:r>
-      <w:r>
-        <w:rPr>
-          <w:szCs w:val="24"/>
-          <w:lang w:val="ru-RU" w:eastAsia="ru-RU"/>
-        </w:rPr>
-        <w:t>3.5,</w:t>
-      </w:r>
-      <w:r>
-        <w:rPr>
-          <w:szCs w:val="24"/>
-          <w:lang w:val="ru-RU" w:eastAsia="ru-RU"/>
-        </w:rPr>
-        <w:t> </w:t>
-      </w:r>
-      <w:r>
-        <w:rPr>
-          <w:szCs w:val="24"/>
-          <w:lang w:val="ru-RU" w:eastAsia="ru-RU"/>
-        </w:rPr>
-        <w:t>3.6</w:t>
-      </w:r>
-      <w:r>
-        <w:rPr>
-          <w:szCs w:val="24"/>
-          <w:lang w:val="ru-RU" w:eastAsia="ru-RU"/>
-        </w:rPr>
-        <w:t>).</w:t>
-      </w:r>
-    </w:p>
-    <w:p>
-      <w:pPr>
-        <w:rPr>
-          <w:szCs w:val="24"/>
-          <w:lang w:eastAsia="ru-RU"/>
-        </w:rPr>
-      </w:pPr>
+        <w:t xml:space="preserve"> (рис. 3.2, 3.3, 3.4, 3.5, 3.6).</w:t>
+      </w:r>
     </w:p>
     <w:p>
       <w:pPr>
         <w:pStyle w:val="10"/>
-        <w:spacing w:line="360" w:lineRule="auto"/>
       </w:pPr>
       <w:bookmarkStart w:id="24" w:name="_Toc230686220"/>
       <w:r>
@@ -21917,6 +21870,7 @@
           <w:lang w:eastAsia="ru-RU"/>
         </w:rPr>
       </w:pPr>
+      <w:bookmarkStart w:id="25" w:name="_Toc230686221"/>
       <w:r>
         <w:rPr>
           <w:szCs w:val="24"/>
@@ -22085,7 +22039,7 @@
         <w:pStyle w:val="ad"/>
         <w:numPr>
           <w:ilvl w:val="0"/>
-          <w:numId w:val="70"/>
+          <w:numId w:val="71"/>
         </w:numPr>
         <w:ind w:left="0" w:firstLine="709"/>
         <w:rPr>
@@ -22106,7 +22060,7 @@
         <w:pStyle w:val="ad"/>
         <w:numPr>
           <w:ilvl w:val="0"/>
-          <w:numId w:val="70"/>
+          <w:numId w:val="71"/>
         </w:numPr>
         <w:ind w:left="0" w:firstLine="709"/>
         <w:rPr>
@@ -22158,12 +22112,10 @@
     <w:p>
       <w:pPr>
         <w:pStyle w:val="10"/>
-        <w:spacing w:line="360" w:lineRule="auto"/>
-        <w:rPr>
-          <w:szCs w:val="24"/>
-        </w:rPr>
-      </w:pPr>
-      <w:bookmarkStart w:id="25" w:name="_Toc230686221"/>
+        <w:rPr>
+          <w:szCs w:val="24"/>
+        </w:rPr>
+      </w:pPr>
       <w:r>
         <w:rPr>
           <w:szCs w:val="24"/>
@@ -22340,7 +22292,17 @@
           <w:szCs w:val="24"/>
           <w:lang w:val="ru-RU"/>
         </w:rPr>
-        <w:t>. Комплексное число – URL: ru.wikipedia.org/wiki/%D0%9A%D0%BE%D0%BC%D0%BF%D0%BB%D0%B5%D0%BA%D1%81%D0%BD%D0%BE%D0%B5_%D1%87%D0%B8%D1%81%D0%BB%D0%BE (дата обращения: 30.01.2026).</w:t>
+        <w:t xml:space="preserve">. Комплексное число </w:t>
+      </w:r>
+      <w:r>
+        <w:t xml:space="preserve">[Электронный ресурс] </w:t>
+      </w:r>
+      <w:r>
+        <w:rPr>
+          <w:szCs w:val="24"/>
+          <w:lang w:val="ru-RU"/>
+        </w:rPr>
+        <w:t>– URL: ru.wikipedia.org/wiki/%D0%9A%D0%BE%D0%BC%D0%BF%D0%BB%D0%B5%D0%BA%D1%81%D0%BD%D0%BE%D0%B5_%D1%87%D0%B8%D1%81%D0%BB%D0%BE (дата обращения: 30.01.2026).</w:t>
       </w:r>
     </w:p>
     <w:p>
@@ -22379,7 +22341,17 @@
           <w:szCs w:val="24"/>
           <w:lang w:val="ru-RU"/>
         </w:rPr>
-        <w:t>. Комплексные числа для чайников – URL: mathprofi.ru/kompleksnye_chisla_dlya_chainikov.html (дата обращения: 30.01.2026).</w:t>
+        <w:t xml:space="preserve">. Комплексные числа для чайников </w:t>
+      </w:r>
+      <w:r>
+        <w:t xml:space="preserve">[Электронный ресурс] </w:t>
+      </w:r>
+      <w:r>
+        <w:rPr>
+          <w:szCs w:val="24"/>
+          <w:lang w:val="ru-RU"/>
+        </w:rPr>
+        <w:t>– URL: mathprofi.ru/kompleksnye_chisla_dlya_chainikov.html (дата обращения: 30.01.2026).</w:t>
       </w:r>
     </w:p>
     <w:p>
@@ -22418,7 +22390,17 @@
           <w:szCs w:val="24"/>
           <w:lang w:val="ru-RU"/>
         </w:rPr>
-        <w:t>. Входные и выходные данные. – URL: https://studbooks.net/2271978/informatika/vhodnye_vyhodnye_dannye (дата обращения: 30.01.2026).</w:t>
+        <w:t xml:space="preserve">. Входные и выходные данные. </w:t>
+      </w:r>
+      <w:r>
+        <w:t xml:space="preserve">[Электронный ресурс] </w:t>
+      </w:r>
+      <w:r>
+        <w:rPr>
+          <w:szCs w:val="24"/>
+          <w:lang w:val="ru-RU"/>
+        </w:rPr>
+        <w:t>– URL: https://studbooks.net/2271978/informatika/vhodnye_vyhodnye_dannye (дата обращения: 30.01.2026).</w:t>
       </w:r>
     </w:p>
     <w:p>
@@ -22457,7 +22439,17 @@
           <w:szCs w:val="24"/>
           <w:lang w:val="ru-RU"/>
         </w:rPr>
-        <w:t>. Операции над комплексными числами – URL: studfile.net/</w:t>
+        <w:t xml:space="preserve">. Операции над комплексными числами </w:t>
+      </w:r>
+      <w:r>
+        <w:t xml:space="preserve">[Электронный ресурс] </w:t>
+      </w:r>
+      <w:r>
+        <w:rPr>
+          <w:szCs w:val="24"/>
+          <w:lang w:val="ru-RU"/>
+        </w:rPr>
+        <w:t>– URL: studfile.net/</w:t>
       </w:r>
       <w:proofErr w:type="spellStart"/>
       <w:r>
@@ -22544,7 +22536,17 @@
           <w:szCs w:val="24"/>
           <w:lang w:val="ru-RU"/>
         </w:rPr>
-        <w:t xml:space="preserve"> – URL: en.wikipedia.org/</w:t>
+        <w:t xml:space="preserve"> </w:t>
+      </w:r>
+      <w:r>
+        <w:t xml:space="preserve">[Электронный ресурс] </w:t>
+      </w:r>
+      <w:r>
+        <w:rPr>
+          <w:szCs w:val="24"/>
+          <w:lang w:val="ru-RU"/>
+        </w:rPr>
+        <w:t>– URL: en.wikipedia.org/</w:t>
       </w:r>
       <w:proofErr w:type="spellStart"/>
       <w:r>
@@ -22631,7 +22633,17 @@
           <w:szCs w:val="24"/>
           <w:lang w:val="ru-RU"/>
         </w:rPr>
-        <w:t xml:space="preserve"> – URL: https://ru.wikipedia.org/wiki/WolframAlpha (дата обращения: 30.01.2026).</w:t>
+        <w:t xml:space="preserve"> </w:t>
+      </w:r>
+      <w:r>
+        <w:t xml:space="preserve">[Электронный ресурс] </w:t>
+      </w:r>
+      <w:r>
+        <w:rPr>
+          <w:szCs w:val="24"/>
+          <w:lang w:val="ru-RU"/>
+        </w:rPr>
+        <w:t>– URL: https://ru.wikipedia.org/wiki/WolframAlpha (дата обращения: 30.01.2026).</w:t>
       </w:r>
     </w:p>
     <w:p>
@@ -22686,12 +22698,21 @@
           <w:szCs w:val="24"/>
           <w:lang w:val="ru-RU"/>
         </w:rPr>
-        <w:t xml:space="preserve"> – URL: https://ru.wikipedia.org/wiki/GeoGebra (дата обращения: 30.01.2026).</w:t>
+        <w:t xml:space="preserve"> </w:t>
+      </w:r>
+      <w:r>
+        <w:t xml:space="preserve">[Электронный ресурс] </w:t>
       </w:r>
       <w:r>
         <w:rPr>
           <w:szCs w:val="24"/>
           <w:lang w:val="ru-RU"/>
+        </w:rPr>
+        <w:t>– URL: https://ru.wikipedia.org/wiki/GeoGebra (дата обращения: 30.01.2026).</w:t>
+      </w:r>
+      <w:r>
+        <w:rPr>
+          <w:szCs w:val="24"/>
         </w:rPr>
         <w:br w:type="page"/>
       </w:r>
@@ -22852,13 +22873,10 @@
     </w:p>
     <w:p>
       <w:pPr>
-        <w:tabs>
-          <w:tab w:val="left" w:pos="7996"/>
-        </w:tabs>
         <w:autoSpaceDE w:val="0"/>
         <w:autoSpaceDN w:val="0"/>
         <w:spacing w:before="132"/>
-        <w:ind w:left="1815" w:right="1930" w:hanging="4"/>
+        <w:ind w:right="-2" w:hanging="4"/>
         <w:jc w:val="center"/>
         <w:rPr>
           <w:rFonts w:eastAsia="Times New Roman"/>
@@ -22996,7 +23014,25 @@
           <w:spacing w:val="-4"/>
           <w:szCs w:val="24"/>
         </w:rPr>
-        <w:t>Разработка калькулятора для выполнения арифметических операций с комплексными числами</w:t>
+        <w:t>Разработка калькулятора для выполнения арифметических операций с комплексными</w:t>
+      </w:r>
+      <w:r>
+        <w:rPr>
+          <w:b/>
+          <w:bCs/>
+          <w:spacing w:val="-4"/>
+          <w:szCs w:val="24"/>
+        </w:rPr>
+        <w:t> </w:t>
+      </w:r>
+      <w:r>
+        <w:rPr>
+          <w:b/>
+          <w:bCs/>
+          <w:spacing w:val="-4"/>
+          <w:szCs w:val="24"/>
+        </w:rPr>
+        <w:t>числами</w:t>
       </w:r>
     </w:p>
     <w:p>
@@ -23009,15 +23045,19 @@
         <w:spacing w:before="120" w:line="312" w:lineRule="auto"/>
         <w:rPr>
           <w:b/>
-          <w:lang w:val="ru-RU"/>
         </w:rPr>
       </w:pPr>
       <w:r>
         <w:rPr>
           <w:b/>
-          <w:lang w:val="ru-RU"/>
-        </w:rPr>
-        <w:t>Цель и задачи разработки</w:t>
+        </w:rPr>
+        <w:t xml:space="preserve">Цель </w:t>
+      </w:r>
+      <w:r>
+        <w:rPr>
+          <w:b/>
+        </w:rPr>
+        <w:t>и задачи разработки</w:t>
       </w:r>
     </w:p>
     <w:p>
@@ -23101,13 +23141,11 @@
         <w:ind w:left="0" w:firstLine="709"/>
         <w:rPr>
           <w:rFonts w:eastAsia="Calibri"/>
-          <w:lang w:val="ru-RU"/>
         </w:rPr>
       </w:pPr>
       <w:r>
         <w:rPr>
           <w:rFonts w:eastAsia="Calibri"/>
-          <w:lang w:val="ru-RU"/>
         </w:rPr>
         <w:t>Провести анализ предметной области и изучить методы выполнения операций над комплексными числами.</w:t>
       </w:r>
@@ -23123,13 +23161,11 @@
         <w:ind w:left="0" w:firstLine="709"/>
         <w:rPr>
           <w:rFonts w:eastAsia="Calibri"/>
-          <w:lang w:val="ru-RU"/>
         </w:rPr>
       </w:pPr>
       <w:r>
         <w:rPr>
           <w:rFonts w:eastAsia="Calibri"/>
-          <w:lang w:val="ru-RU"/>
         </w:rPr>
         <w:t>Разработать структуру программного продукта и реализовать алгоритмы обработки математических выражений.</w:t>
       </w:r>
@@ -23145,13 +23181,11 @@
         <w:ind w:left="0" w:firstLine="709"/>
         <w:rPr>
           <w:rFonts w:eastAsia="Calibri"/>
-          <w:lang w:val="ru-RU"/>
         </w:rPr>
       </w:pPr>
       <w:r>
         <w:rPr>
           <w:rFonts w:eastAsia="Calibri"/>
-          <w:lang w:val="ru-RU"/>
         </w:rPr>
         <w:t>Реализовать программный продукт для выполнения вычислений над комплексными числами с графическим интерфейсом пользователя.</w:t>
       </w:r>
@@ -23167,13 +23201,11 @@
         <w:ind w:left="0" w:firstLine="709"/>
         <w:rPr>
           <w:rFonts w:eastAsia="Calibri"/>
-          <w:lang w:val="ru-RU"/>
         </w:rPr>
       </w:pPr>
       <w:r>
         <w:rPr>
           <w:rFonts w:eastAsia="Calibri"/>
-          <w:lang w:val="ru-RU"/>
         </w:rPr>
         <w:t>Выполнить тестирование, отладку и подготовить программную документацию.</w:t>
       </w:r>
@@ -23192,14 +23224,10 @@
         <w:autoSpaceDN w:val="0"/>
         <w:spacing w:before="140" w:line="240" w:lineRule="auto"/>
         <w:jc w:val="left"/>
-        <w:rPr>
-          <w:lang w:val="ru-RU"/>
-        </w:rPr>
       </w:pPr>
       <w:r>
         <w:rPr>
           <w:b/>
-          <w:lang w:val="ru-RU"/>
         </w:rPr>
         <w:t>Характер</w:t>
       </w:r>
@@ -23207,14 +23235,12 @@
         <w:rPr>
           <w:b/>
           <w:spacing w:val="-6"/>
-          <w:lang w:val="ru-RU"/>
         </w:rPr>
         <w:t xml:space="preserve"> </w:t>
       </w:r>
       <w:r>
         <w:rPr>
           <w:b/>
-          <w:lang w:val="ru-RU"/>
         </w:rPr>
         <w:t>разработки:</w:t>
       </w:r>
@@ -23222,40 +23248,28 @@
         <w:rPr>
           <w:b/>
           <w:spacing w:val="-3"/>
-          <w:lang w:val="ru-RU"/>
         </w:rPr>
         <w:t xml:space="preserve"> </w:t>
       </w:r>
       <w:r>
-        <w:rPr>
-          <w:lang w:val="ru-RU"/>
-        </w:rPr>
         <w:t>прикладная</w:t>
       </w:r>
       <w:r>
         <w:rPr>
           <w:spacing w:val="-4"/>
-          <w:lang w:val="ru-RU"/>
         </w:rPr>
         <w:t xml:space="preserve"> </w:t>
       </w:r>
       <w:r>
-        <w:rPr>
-          <w:lang w:val="ru-RU"/>
-        </w:rPr>
         <w:t>квалификационная</w:t>
       </w:r>
       <w:r>
         <w:rPr>
           <w:spacing w:val="-3"/>
-          <w:lang w:val="ru-RU"/>
         </w:rPr>
         <w:t xml:space="preserve"> </w:t>
       </w:r>
       <w:r>
-        <w:rPr>
-          <w:lang w:val="ru-RU"/>
-        </w:rPr>
         <w:t>работа.</w:t>
       </w:r>
     </w:p>
@@ -23269,13 +23283,11 @@
         <w:spacing w:before="140" w:line="312" w:lineRule="auto"/>
         <w:rPr>
           <w:b/>
-          <w:lang w:val="ru-RU"/>
         </w:rPr>
       </w:pPr>
       <w:r>
         <w:rPr>
           <w:b/>
-          <w:lang w:val="ru-RU"/>
         </w:rPr>
         <w:t>Основания для разработки</w:t>
       </w:r>
@@ -23336,7 +23348,10 @@
         <w:ind w:left="709" w:firstLine="284"/>
       </w:pPr>
       <w:r>
-        <w:t xml:space="preserve">Распоряжение по кафедре </w:t>
+        <w:t>Распоряжение по</w:t>
+      </w:r>
+      <w:r>
+        <w:t xml:space="preserve"> кафедре </w:t>
       </w:r>
       <w:proofErr w:type="spellStart"/>
       <w:r>
@@ -23344,21 +23359,33 @@
       </w:r>
       <w:proofErr w:type="spellEnd"/>
       <w:r>
-        <w:t xml:space="preserve"> №  </w:t>
+        <w:t xml:space="preserve"> №</w:t>
+      </w:r>
+      <w:r>
+        <w:t xml:space="preserve">  </w:t>
       </w:r>
       <w:r>
         <w:rPr>
           <w:u w:val="single"/>
         </w:rPr>
-        <w:t xml:space="preserve">   </w:t>
-      </w:r>
-      <w:r>
-        <w:t>от ____</w:t>
+        <w:t xml:space="preserve"> </w:t>
       </w:r>
       <w:r>
         <w:rPr>
           <w:u w:val="single"/>
         </w:rPr>
+        <w:t xml:space="preserve">  </w:t>
+      </w:r>
+      <w:r>
+        <w:t>от</w:t>
+      </w:r>
+      <w:r>
+        <w:t xml:space="preserve"> ____</w:t>
+      </w:r>
+      <w:r>
+        <w:rPr>
+          <w:u w:val="single"/>
+        </w:rPr>
         <w:t>.</w:t>
       </w:r>
       <w:r>
@@ -23368,7 +23395,13 @@
         <w:rPr>
           <w:u w:val="single"/>
         </w:rPr>
-        <w:t>26</w:t>
+        <w:t>2</w:t>
+      </w:r>
+      <w:r>
+        <w:rPr>
+          <w:u w:val="single"/>
+        </w:rPr>
+        <w:t>6</w:t>
       </w:r>
       <w:r>
         <w:t xml:space="preserve"> г.</w:t>
@@ -23382,48 +23415,39 @@
           <w:numId w:val="21"/>
         </w:numPr>
         <w:spacing w:before="140" w:line="240" w:lineRule="auto"/>
-        <w:rPr>
-          <w:lang w:val="ru-RU"/>
-        </w:rPr>
       </w:pPr>
       <w:r>
         <w:rPr>
           <w:b/>
-          <w:lang w:val="ru-RU"/>
         </w:rPr>
         <w:t xml:space="preserve">Плановые сроки выполнения – </w:t>
       </w:r>
       <w:r>
-        <w:rPr>
-          <w:lang w:val="ru-RU"/>
-        </w:rPr>
-        <w:t>весенний семестр 20</w:t>
+        <w:t>весенний</w:t>
+      </w:r>
+      <w:r>
+        <w:t xml:space="preserve"> семестр 20</w:t>
       </w:r>
       <w:r>
         <w:rPr>
           <w:u w:val="single"/>
-          <w:lang w:val="ru-RU"/>
         </w:rPr>
         <w:t>25</w:t>
       </w:r>
       <w:r>
-        <w:rPr>
-          <w:lang w:val="ru-RU"/>
-        </w:rPr>
         <w:t>/</w:t>
       </w:r>
       <w:r>
         <w:rPr>
           <w:u w:val="single"/>
-          <w:lang w:val="ru-RU"/>
         </w:rPr>
         <w:t>26</w:t>
       </w:r>
       <w:r>
-        <w:rPr>
-          <w:lang w:val="ru-RU"/>
-        </w:rPr>
-        <w:t xml:space="preserve"> учебного года:</w:t>
+        <w:t xml:space="preserve"> </w:t>
+      </w:r>
+      <w:r>
+        <w:t>учебного года:</w:t>
       </w:r>
     </w:p>
     <w:p>
@@ -23455,7 +23479,25 @@
         <w:rPr>
           <w:u w:val="single"/>
         </w:rPr>
-        <w:t>17.02.</w:t>
+        <w:t>17</w:t>
+      </w:r>
+      <w:r>
+        <w:rPr>
+          <w:u w:val="single"/>
+        </w:rPr>
+        <w:t>.0</w:t>
+      </w:r>
+      <w:r>
+        <w:rPr>
+          <w:u w:val="single"/>
+        </w:rPr>
+        <w:t>2</w:t>
+      </w:r>
+      <w:r>
+        <w:rPr>
+          <w:u w:val="single"/>
+        </w:rPr>
+        <w:t>.</w:t>
       </w:r>
       <w:r>
         <w:t xml:space="preserve"> 20</w:t>
@@ -23464,7 +23506,13 @@
         <w:rPr>
           <w:u w:val="single"/>
         </w:rPr>
-        <w:t>26</w:t>
+        <w:t>2</w:t>
+      </w:r>
+      <w:r>
+        <w:rPr>
+          <w:u w:val="single"/>
+        </w:rPr>
+        <w:t>6</w:t>
       </w:r>
       <w:r>
         <w:t xml:space="preserve"> г.</w:t>
@@ -23505,7 +23553,19 @@
         <w:rPr>
           <w:u w:val="single"/>
         </w:rPr>
-        <w:t xml:space="preserve">26 </w:t>
+        <w:t>2</w:t>
+      </w:r>
+      <w:r>
+        <w:rPr>
+          <w:u w:val="single"/>
+        </w:rPr>
+        <w:t>6</w:t>
+      </w:r>
+      <w:r>
+        <w:rPr>
+          <w:u w:val="single"/>
+        </w:rPr>
+        <w:t xml:space="preserve"> </w:t>
       </w:r>
       <w:r>
         <w:t>г.</w:t>
@@ -23523,15 +23583,12 @@
         <w:spacing w:before="140" w:line="240" w:lineRule="auto"/>
         <w:rPr>
           <w:b/>
-          <w:lang w:val="ru-RU"/>
         </w:rPr>
       </w:pPr>
       <w:r>
         <w:rPr>
           <w:b/>
-          <w:lang w:val="ru-RU"/>
-        </w:rPr>
-        <w:lastRenderedPageBreak/>
+        </w:rPr>
         <w:t>Требования к проектируемой системе</w:t>
       </w:r>
     </w:p>
@@ -23545,7 +23602,7 @@
           <w:numId w:val="5"/>
         </w:numPr>
         <w:spacing w:before="100" w:line="240" w:lineRule="auto"/>
-        <w:ind w:left="3823" w:firstLine="0"/>
+        <w:ind w:firstLine="0"/>
         <w:rPr>
           <w:b/>
         </w:rPr>
@@ -23554,7 +23611,19 @@
         <w:rPr>
           <w:b/>
         </w:rPr>
-        <w:t xml:space="preserve">       5.1 Требования к функциональным характеристикам</w:t>
+        <w:t xml:space="preserve"> </w:t>
+      </w:r>
+      <w:r>
+        <w:rPr>
+          <w:b/>
+        </w:rPr>
+        <w:t xml:space="preserve">      5.1 </w:t>
+      </w:r>
+      <w:r>
+        <w:rPr>
+          <w:b/>
+        </w:rPr>
+        <w:t>Требования к функциональным характеристикам</w:t>
       </w:r>
     </w:p>
     <w:p>
@@ -23583,13 +23652,11 @@
         <w:ind w:left="0" w:firstLine="709"/>
         <w:rPr>
           <w:bCs/>
-          <w:lang w:val="ru-RU"/>
         </w:rPr>
       </w:pPr>
       <w:r>
         <w:rPr>
           <w:bCs/>
-          <w:lang w:val="ru-RU"/>
         </w:rPr>
         <w:t>ввод и обработку математических выражений с комплексными числами;</w:t>
       </w:r>
@@ -23605,14 +23672,13 @@
         <w:ind w:left="0" w:firstLine="709"/>
         <w:rPr>
           <w:bCs/>
-          <w:lang w:val="ru-RU"/>
         </w:rPr>
       </w:pPr>
       <w:r>
         <w:rPr>
           <w:bCs/>
-          <w:lang w:val="ru-RU"/>
-        </w:rPr>
+        </w:rPr>
+        <w:lastRenderedPageBreak/>
         <w:t>выполнение арифметических операций (сложение, вычитание, умножение, деление) и дополнительных вычислений (модуль, аргумент, сопряжённое число, преобразование в тригонометрическую форму);</w:t>
       </w:r>
     </w:p>
@@ -23627,13 +23693,11 @@
         <w:ind w:left="0" w:firstLine="709"/>
         <w:rPr>
           <w:bCs/>
-          <w:lang w:val="ru-RU"/>
         </w:rPr>
       </w:pPr>
       <w:r>
         <w:rPr>
           <w:bCs/>
-          <w:lang w:val="ru-RU"/>
         </w:rPr>
         <w:t>отображение, сохранение истории вычислений и экспорт результатов в форматы CSV, JSON, XLSX и TXT.</w:t>
       </w:r>
@@ -23646,7 +23710,7 @@
           <w:numId w:val="5"/>
         </w:numPr>
         <w:spacing w:before="100" w:line="240" w:lineRule="auto"/>
-        <w:ind w:left="2383" w:firstLine="0"/>
+        <w:ind w:firstLine="0"/>
         <w:rPr>
           <w:b/>
         </w:rPr>
@@ -23655,7 +23719,13 @@
         <w:rPr>
           <w:b/>
         </w:rPr>
-        <w:t xml:space="preserve">       5.2 Требования к эксплуатационным характеристикам</w:t>
+        <w:t xml:space="preserve">       5.2 </w:t>
+      </w:r>
+      <w:r>
+        <w:rPr>
+          <w:b/>
+        </w:rPr>
+        <w:t>Требования к эксплуатационным характеристикам</w:t>
       </w:r>
     </w:p>
     <w:p>
@@ -23683,7 +23753,10 @@
         <w:ind w:firstLine="426"/>
       </w:pPr>
       <w:r>
-        <w:t>расширяемость.</w:t>
+        <w:t>расширяемость</w:t>
+      </w:r>
+      <w:r>
+        <w:t>.</w:t>
       </w:r>
     </w:p>
     <w:p>
@@ -23693,7 +23766,12 @@
           <w:ilvl w:val="1"/>
           <w:numId w:val="5"/>
         </w:numPr>
+        <w:tabs>
+          <w:tab w:val="clear" w:pos="360"/>
+          <w:tab w:val="num" w:pos="142"/>
+        </w:tabs>
         <w:spacing w:before="100" w:line="240" w:lineRule="auto"/>
+        <w:ind w:firstLine="142"/>
         <w:rPr>
           <w:b/>
           <w:color w:val="FF0000"/>
@@ -23713,32 +23791,88 @@
         <w:t xml:space="preserve"> </w:t>
       </w:r>
       <w:r>
-        <w:t xml:space="preserve">среда разработки – MS Visual </w:t>
-      </w:r>
-      <w:r>
-        <w:t xml:space="preserve">Studio Code, язык программирования C++ 17, фреймворк </w:t>
+        <w:t xml:space="preserve">среда разработки – </w:t>
+      </w:r>
+      <w:r>
+        <w:rPr>
+          <w:lang w:val="en-US"/>
+        </w:rPr>
+        <w:t>MS</w:t>
+      </w:r>
+      <w:r>
+        <w:t xml:space="preserve"> </w:t>
+      </w:r>
+      <w:r>
+        <w:rPr>
+          <w:lang w:val="en-US"/>
+        </w:rPr>
+        <w:t>Visual</w:t>
+      </w:r>
+      <w:r>
+        <w:t xml:space="preserve"> </w:t>
+      </w:r>
+      <w:r>
+        <w:rPr>
+          <w:lang w:val="en-US"/>
+        </w:rPr>
+        <w:t>Studio</w:t>
+      </w:r>
+      <w:r>
+        <w:t xml:space="preserve"> </w:t>
+      </w:r>
+      <w:r>
+        <w:rPr>
+          <w:lang w:val="en-US"/>
+        </w:rPr>
+        <w:t>Code</w:t>
+      </w:r>
+      <w:r>
+        <w:t xml:space="preserve">, </w:t>
+      </w:r>
+      <w:r>
+        <w:t xml:space="preserve">язык программирования </w:t>
+      </w:r>
+      <w:r>
+        <w:rPr>
+          <w:lang w:val="en-US"/>
+        </w:rPr>
+        <w:t>C</w:t>
+      </w:r>
+      <w:r>
+        <w:t xml:space="preserve">++ 17, </w:t>
+      </w:r>
+      <w:r>
+        <w:t xml:space="preserve">фреймворк </w:t>
+      </w:r>
+      <w:r>
+        <w:rPr>
+          <w:lang w:val="en-US"/>
+        </w:rPr>
+        <w:t>Qt</w:t>
+      </w:r>
+      <w:r>
+        <w:t xml:space="preserve"> 6, </w:t>
+      </w:r>
+      <w:r>
+        <w:t xml:space="preserve">система сборки </w:t>
       </w:r>
       <w:proofErr w:type="spellStart"/>
       <w:r>
-        <w:t>Qt</w:t>
+        <w:rPr>
+          <w:lang w:val="en-US"/>
+        </w:rPr>
+        <w:t>CMake</w:t>
       </w:r>
       <w:proofErr w:type="spellEnd"/>
       <w:r>
-        <w:t xml:space="preserve"> 6, система сборки </w:t>
-      </w:r>
-      <w:proofErr w:type="spellStart"/>
-      <w:r>
-        <w:t>CMake</w:t>
-      </w:r>
-      <w:proofErr w:type="spellEnd"/>
-      <w:r>
         <w:t xml:space="preserve">, компилятор </w:t>
       </w:r>
-      <w:proofErr w:type="spellStart"/>
-      <w:r>
+      <w:r>
+        <w:rPr>
+          <w:lang w:val="en-US"/>
+        </w:rPr>
         <w:t>MinGW</w:t>
       </w:r>
-      <w:proofErr w:type="spellEnd"/>
       <w:r>
         <w:t>.</w:t>
       </w:r>
@@ -23841,13 +23975,11 @@
         <w:spacing w:line="312" w:lineRule="auto"/>
         <w:rPr>
           <w:b/>
-          <w:lang w:val="ru-RU"/>
         </w:rPr>
       </w:pPr>
       <w:r>
         <w:rPr>
           <w:b/>
-          <w:lang w:val="ru-RU"/>
         </w:rPr>
         <w:t>Стадии и этапы разработки</w:t>
       </w:r>
@@ -23909,7 +24041,13 @@
         <w:ind w:firstLine="285"/>
       </w:pPr>
       <w:r>
-        <w:t>Обзор приложений задачи поиска в глубину и ширину;</w:t>
+        <w:t>Обзор приложени</w:t>
+      </w:r>
+      <w:r>
+        <w:t>й задачи поиска в глубину и ширину</w:t>
+      </w:r>
+      <w:r>
+        <w:t>;</w:t>
       </w:r>
     </w:p>
     <w:p>
@@ -23926,7 +24064,13 @@
         <w:ind w:firstLine="285"/>
       </w:pPr>
       <w:r>
-        <w:t>Описание алгоритмов поиска в глубину и ширину;</w:t>
+        <w:t xml:space="preserve">Описание алгоритмов </w:t>
+      </w:r>
+      <w:r>
+        <w:t>поиска в глубину и ширину</w:t>
+      </w:r>
+      <w:r>
+        <w:t>;</w:t>
       </w:r>
     </w:p>
     <w:p>
@@ -24045,7 +24189,13 @@
         <w:ind w:firstLine="285"/>
       </w:pPr>
       <w:r>
-        <w:t>Подготовка пояснительной записки.</w:t>
+        <w:t xml:space="preserve">Подготовка </w:t>
+      </w:r>
+      <w:r>
+        <w:t>пояснительной записки</w:t>
+      </w:r>
+      <w:r>
+        <w:t>.</w:t>
       </w:r>
     </w:p>
     <w:p>
@@ -24194,13 +24344,11 @@
         <w:spacing w:before="60" w:after="60" w:line="240" w:lineRule="auto"/>
         <w:rPr>
           <w:b/>
-          <w:lang w:val="ru-RU"/>
         </w:rPr>
       </w:pPr>
       <w:r>
         <w:rPr>
           <w:b/>
-          <w:lang w:val="ru-RU"/>
         </w:rPr>
         <w:t>Требования к документированию проекта</w:t>
       </w:r>
@@ -24247,7 +24395,6 @@
         <w:rPr>
           <w:i/>
         </w:rPr>
-        <w:lastRenderedPageBreak/>
         <w:t>Опись альбома</w:t>
       </w:r>
     </w:p>
@@ -24399,6 +24546,7 @@
         <w:ind w:left="0" w:firstLine="1134"/>
       </w:pPr>
       <w:r>
+        <w:lastRenderedPageBreak/>
         <w:t>Выводы по результатам проведенного анализа</w:t>
       </w:r>
     </w:p>
@@ -24552,7 +24700,6 @@
           <w:b/>
           <w:bCs/>
           <w:color w:val="000000"/>
-          <w:lang w:val="ru-RU"/>
         </w:rPr>
       </w:pPr>
       <w:r>
@@ -24560,7 +24707,6 @@
           <w:b/>
           <w:bCs/>
           <w:color w:val="000000"/>
-          <w:lang w:val="ru-RU"/>
         </w:rPr>
         <w:t>Порядок контроля и приемки</w:t>
       </w:r>
@@ -24795,7 +24941,10 @@
       <w:bookmarkStart w:id="36" w:name="_Toc230686223"/>
       <w:r>
         <w:lastRenderedPageBreak/>
-        <w:t>ПРИЛОЖЕНИЕ 2</w:t>
+        <w:t xml:space="preserve">ПРИЛОЖЕНИЕ </w:t>
+      </w:r>
+      <w:r>
+        <w:t>2</w:t>
       </w:r>
       <w:bookmarkEnd w:id="35"/>
       <w:bookmarkEnd w:id="36"/>
@@ -24820,9 +24969,6 @@
       </w:r>
     </w:p>
     <w:sectPr>
-      <w:headerReference w:type="default" r:id="rId22"/>
-      <w:footerReference w:type="default" r:id="rId23"/>
-      <w:headerReference w:type="first" r:id="rId24"/>
       <w:pgSz w:w="11906" w:h="16838"/>
       <w:pgMar w:top="1418" w:right="851" w:bottom="851" w:left="1134" w:header="709" w:footer="709" w:gutter="0"/>
       <w:cols w:space="708"/>
@@ -24932,7 +25078,7 @@
         <w:noProof/>
         <w:sz w:val="22"/>
       </w:rPr>
-      <w:t>8</w:t>
+      <w:t>5</w:t>
     </w:r>
     <w:r>
       <w:rPr>
@@ -24972,7 +25118,57 @@
         <w:szCs w:val="20"/>
         <w:u w:val="single"/>
       </w:rPr>
-      <w:t xml:space="preserve">           </w:t>
+      <w:t xml:space="preserve">         </w:t>
+    </w:r>
+    <w:r>
+      <w:rPr>
+        <w:i/>
+        <w:kern w:val="24"/>
+        <w:sz w:val="20"/>
+        <w:szCs w:val="20"/>
+        <w:u w:val="single"/>
+      </w:rPr>
+      <w:tab/>
+    </w:r>
+    <w:r>
+      <w:rPr>
+        <w:i/>
+        <w:kern w:val="24"/>
+        <w:sz w:val="20"/>
+        <w:szCs w:val="20"/>
+        <w:u w:val="single"/>
+      </w:rPr>
+      <w:tab/>
+    </w:r>
+    <w:r>
+      <w:rPr>
+        <w:i/>
+        <w:kern w:val="24"/>
+        <w:sz w:val="20"/>
+        <w:szCs w:val="20"/>
+        <w:u w:val="single"/>
+      </w:rPr>
+      <w:tab/>
+    </w:r>
+    <w:r>
+      <w:rPr>
+        <w:i/>
+        <w:kern w:val="24"/>
+        <w:sz w:val="20"/>
+        <w:szCs w:val="20"/>
+        <w:u w:val="single"/>
+      </w:rPr>
+      <w:t xml:space="preserve">        </w:t>
+    </w:r>
+    <w:r>
+      <w:rPr>
+        <w:i/>
+        <w:kern w:val="24"/>
+        <w:sz w:val="20"/>
+        <w:szCs w:val="20"/>
+        <w:u w:val="single"/>
+      </w:rPr>
+      <w:t xml:space="preserve"> </w:t>
     </w:r>
     <w:r>
       <w:rPr>
@@ -29233,6 +29429,95 @@
     </w:lvl>
   </w:abstractNum>
   <w:abstractNum w:abstractNumId="38" w15:restartNumberingAfterBreak="0">
+    <w:nsid w:val="4CBD2DB0"/>
+    <w:multiLevelType w:val="hybridMultilevel"/>
+    <w:tmpl w:val="5714EC4E"/>
+    <w:lvl w:ilvl="0" w:tplc="1CB0CB9A">
+      <w:start w:val="1"/>
+      <w:numFmt w:val="decimal"/>
+      <w:lvlText w:val="%1."/>
+      <w:lvlJc w:val="left"/>
+      <w:pPr>
+        <w:ind w:left="1069" w:hanging="360"/>
+      </w:pPr>
+      <w:rPr>
+        <w:rFonts w:hint="default"/>
+      </w:rPr>
+    </w:lvl>
+    <w:lvl w:ilvl="1" w:tplc="04190019" w:tentative="1">
+      <w:start w:val="1"/>
+      <w:numFmt w:val="lowerLetter"/>
+      <w:lvlText w:val="%2."/>
+      <w:lvlJc w:val="left"/>
+      <w:pPr>
+        <w:ind w:left="1789" w:hanging="360"/>
+      </w:pPr>
+    </w:lvl>
+    <w:lvl w:ilvl="2" w:tplc="0419001B" w:tentative="1">
+      <w:start w:val="1"/>
+      <w:numFmt w:val="lowerRoman"/>
+      <w:lvlText w:val="%3."/>
+      <w:lvlJc w:val="right"/>
+      <w:pPr>
+        <w:ind w:left="2509" w:hanging="180"/>
+      </w:pPr>
+    </w:lvl>
+    <w:lvl w:ilvl="3" w:tplc="0419000F" w:tentative="1">
+      <w:start w:val="1"/>
+      <w:numFmt w:val="decimal"/>
+      <w:lvlText w:val="%4."/>
+      <w:lvlJc w:val="left"/>
+      <w:pPr>
+        <w:ind w:left="3229" w:hanging="360"/>
+      </w:pPr>
+    </w:lvl>
+    <w:lvl w:ilvl="4" w:tplc="04190019" w:tentative="1">
+      <w:start w:val="1"/>
+      <w:numFmt w:val="lowerLetter"/>
+      <w:lvlText w:val="%5."/>
+      <w:lvlJc w:val="left"/>
+      <w:pPr>
+        <w:ind w:left="3949" w:hanging="360"/>
+      </w:pPr>
+    </w:lvl>
+    <w:lvl w:ilvl="5" w:tplc="0419001B" w:tentative="1">
+      <w:start w:val="1"/>
+      <w:numFmt w:val="lowerRoman"/>
+      <w:lvlText w:val="%6."/>
+      <w:lvlJc w:val="right"/>
+      <w:pPr>
+        <w:ind w:left="4669" w:hanging="180"/>
+      </w:pPr>
+    </w:lvl>
+    <w:lvl w:ilvl="6" w:tplc="0419000F" w:tentative="1">
+      <w:start w:val="1"/>
+      <w:numFmt w:val="decimal"/>
+      <w:lvlText w:val="%7."/>
+      <w:lvlJc w:val="left"/>
+      <w:pPr>
+        <w:ind w:left="5389" w:hanging="360"/>
+      </w:pPr>
+    </w:lvl>
+    <w:lvl w:ilvl="7" w:tplc="04190019" w:tentative="1">
+      <w:start w:val="1"/>
+      <w:numFmt w:val="lowerLetter"/>
+      <w:lvlText w:val="%8."/>
+      <w:lvlJc w:val="left"/>
+      <w:pPr>
+        <w:ind w:left="6109" w:hanging="360"/>
+      </w:pPr>
+    </w:lvl>
+    <w:lvl w:ilvl="8" w:tplc="0419001B" w:tentative="1">
+      <w:start w:val="1"/>
+      <w:numFmt w:val="lowerRoman"/>
+      <w:lvlText w:val="%9."/>
+      <w:lvlJc w:val="right"/>
+      <w:pPr>
+        <w:ind w:left="6829" w:hanging="180"/>
+      </w:pPr>
+    </w:lvl>
+  </w:abstractNum>
+  <w:abstractNum w:abstractNumId="39" w15:restartNumberingAfterBreak="0">
     <w:nsid w:val="4EED251D"/>
     <w:multiLevelType w:val="hybridMultilevel"/>
     <w:tmpl w:val="062627A2"/>
@@ -29346,7 +29631,7 @@
       </w:rPr>
     </w:lvl>
   </w:abstractNum>
-  <w:abstractNum w:abstractNumId="39" w15:restartNumberingAfterBreak="0">
+  <w:abstractNum w:abstractNumId="40" w15:restartNumberingAfterBreak="0">
     <w:nsid w:val="51236853"/>
     <w:multiLevelType w:val="hybridMultilevel"/>
     <w:tmpl w:val="CF22F4BA"/>
@@ -29436,7 +29721,7 @@
       </w:pPr>
     </w:lvl>
   </w:abstractNum>
-  <w:abstractNum w:abstractNumId="40" w15:restartNumberingAfterBreak="0">
+  <w:abstractNum w:abstractNumId="41" w15:restartNumberingAfterBreak="0">
     <w:nsid w:val="513818DF"/>
     <w:multiLevelType w:val="hybridMultilevel"/>
     <w:tmpl w:val="DEDC4522"/>
@@ -29526,7 +29811,7 @@
       </w:pPr>
     </w:lvl>
   </w:abstractNum>
-  <w:abstractNum w:abstractNumId="41" w15:restartNumberingAfterBreak="0">
+  <w:abstractNum w:abstractNumId="42" w15:restartNumberingAfterBreak="0">
     <w:nsid w:val="516A28A1"/>
     <w:multiLevelType w:val="hybridMultilevel"/>
     <w:tmpl w:val="EF74D3A6"/>
@@ -29623,7 +29908,7 @@
       </w:pPr>
     </w:lvl>
   </w:abstractNum>
-  <w:abstractNum w:abstractNumId="42" w15:restartNumberingAfterBreak="0">
+  <w:abstractNum w:abstractNumId="43" w15:restartNumberingAfterBreak="0">
     <w:nsid w:val="52A83207"/>
     <w:multiLevelType w:val="hybridMultilevel"/>
     <w:tmpl w:val="ECFE766E"/>
@@ -29737,7 +30022,7 @@
       </w:rPr>
     </w:lvl>
   </w:abstractNum>
-  <w:abstractNum w:abstractNumId="43" w15:restartNumberingAfterBreak="0">
+  <w:abstractNum w:abstractNumId="44" w15:restartNumberingAfterBreak="0">
     <w:nsid w:val="556B1FC6"/>
     <w:multiLevelType w:val="hybridMultilevel"/>
     <w:tmpl w:val="CEE0FECE"/>
@@ -29829,7 +30114,7 @@
       </w:pPr>
     </w:lvl>
   </w:abstractNum>
-  <w:abstractNum w:abstractNumId="44" w15:restartNumberingAfterBreak="0">
+  <w:abstractNum w:abstractNumId="45" w15:restartNumberingAfterBreak="0">
     <w:nsid w:val="57300835"/>
     <w:multiLevelType w:val="hybridMultilevel"/>
     <w:tmpl w:val="D1E8712A"/>
@@ -29943,7 +30228,7 @@
       </w:rPr>
     </w:lvl>
   </w:abstractNum>
-  <w:abstractNum w:abstractNumId="45" w15:restartNumberingAfterBreak="0">
+  <w:abstractNum w:abstractNumId="46" w15:restartNumberingAfterBreak="0">
     <w:nsid w:val="57EE0203"/>
     <w:multiLevelType w:val="hybridMultilevel"/>
     <w:tmpl w:val="AA2AA364"/>
@@ -30033,7 +30318,7 @@
       </w:pPr>
     </w:lvl>
   </w:abstractNum>
-  <w:abstractNum w:abstractNumId="46" w15:restartNumberingAfterBreak="0">
+  <w:abstractNum w:abstractNumId="47" w15:restartNumberingAfterBreak="0">
     <w:nsid w:val="5AC32EFF"/>
     <w:multiLevelType w:val="hybridMultilevel"/>
     <w:tmpl w:val="7D8CF230"/>
@@ -30147,7 +30432,7 @@
       </w:rPr>
     </w:lvl>
   </w:abstractNum>
-  <w:abstractNum w:abstractNumId="47" w15:restartNumberingAfterBreak="0">
+  <w:abstractNum w:abstractNumId="48" w15:restartNumberingAfterBreak="0">
     <w:nsid w:val="5BD1322B"/>
     <w:multiLevelType w:val="hybridMultilevel"/>
     <w:tmpl w:val="A98AC7DC"/>
@@ -30251,7 +30536,7 @@
       </w:pPr>
     </w:lvl>
   </w:abstractNum>
-  <w:abstractNum w:abstractNumId="48" w15:restartNumberingAfterBreak="0">
+  <w:abstractNum w:abstractNumId="49" w15:restartNumberingAfterBreak="0">
     <w:nsid w:val="5DBB1EA9"/>
     <w:multiLevelType w:val="hybridMultilevel"/>
     <w:tmpl w:val="EEB8BB3A"/>
@@ -30355,7 +30640,7 @@
       </w:pPr>
     </w:lvl>
   </w:abstractNum>
-  <w:abstractNum w:abstractNumId="49" w15:restartNumberingAfterBreak="0">
+  <w:abstractNum w:abstractNumId="50" w15:restartNumberingAfterBreak="0">
     <w:nsid w:val="61553ABD"/>
     <w:multiLevelType w:val="hybridMultilevel"/>
     <w:tmpl w:val="6DF839D0"/>
@@ -30470,7 +30755,7 @@
       </w:rPr>
     </w:lvl>
   </w:abstractNum>
-  <w:abstractNum w:abstractNumId="50" w15:restartNumberingAfterBreak="0">
+  <w:abstractNum w:abstractNumId="51" w15:restartNumberingAfterBreak="0">
     <w:nsid w:val="61B35168"/>
     <w:multiLevelType w:val="hybridMultilevel"/>
     <w:tmpl w:val="3DF677FC"/>
@@ -30584,7 +30869,7 @@
       </w:rPr>
     </w:lvl>
   </w:abstractNum>
-  <w:abstractNum w:abstractNumId="51" w15:restartNumberingAfterBreak="0">
+  <w:abstractNum w:abstractNumId="52" w15:restartNumberingAfterBreak="0">
     <w:nsid w:val="645C7BAA"/>
     <w:multiLevelType w:val="hybridMultilevel"/>
     <w:tmpl w:val="9DE04044"/>
@@ -30674,7 +30959,7 @@
       </w:pPr>
     </w:lvl>
   </w:abstractNum>
-  <w:abstractNum w:abstractNumId="52" w15:restartNumberingAfterBreak="0">
+  <w:abstractNum w:abstractNumId="53" w15:restartNumberingAfterBreak="0">
     <w:nsid w:val="6724105F"/>
     <w:multiLevelType w:val="hybridMultilevel"/>
     <w:tmpl w:val="923ED116"/>
@@ -30764,7 +31049,7 @@
       </w:pPr>
     </w:lvl>
   </w:abstractNum>
-  <w:abstractNum w:abstractNumId="53" w15:restartNumberingAfterBreak="0">
+  <w:abstractNum w:abstractNumId="54" w15:restartNumberingAfterBreak="0">
     <w:nsid w:val="699B23F0"/>
     <w:multiLevelType w:val="hybridMultilevel"/>
     <w:tmpl w:val="A0E27230"/>
@@ -30854,10 +31139,10 @@
       </w:pPr>
     </w:lvl>
   </w:abstractNum>
-  <w:abstractNum w:abstractNumId="54" w15:restartNumberingAfterBreak="0">
+  <w:abstractNum w:abstractNumId="55" w15:restartNumberingAfterBreak="0">
     <w:nsid w:val="6A580ED8"/>
     <w:multiLevelType w:val="multilevel"/>
-    <w:tmpl w:val="A5D2EBEE"/>
+    <w:tmpl w:val="79DA09AC"/>
     <w:lvl w:ilvl="0">
       <w:start w:val="1"/>
       <w:numFmt w:val="decimal"/>
@@ -30873,6 +31158,7 @@
     <w:lvl w:ilvl="1">
       <w:start w:val="1"/>
       <w:numFmt w:val="none"/>
+      <w:suff w:val="space"/>
       <w:lvlText w:val="1.5.4"/>
       <w:lvlJc w:val="left"/>
       <w:pPr>
@@ -30967,7 +31253,7 @@
       </w:rPr>
     </w:lvl>
   </w:abstractNum>
-  <w:abstractNum w:abstractNumId="55" w15:restartNumberingAfterBreak="0">
+  <w:abstractNum w:abstractNumId="56" w15:restartNumberingAfterBreak="0">
     <w:nsid w:val="6C7C1B2A"/>
     <w:multiLevelType w:val="hybridMultilevel"/>
     <w:tmpl w:val="7F5084B2"/>
@@ -31082,7 +31368,7 @@
       </w:rPr>
     </w:lvl>
   </w:abstractNum>
-  <w:abstractNum w:abstractNumId="56" w15:restartNumberingAfterBreak="0">
+  <w:abstractNum w:abstractNumId="57" w15:restartNumberingAfterBreak="0">
     <w:nsid w:val="6D0B06A1"/>
     <w:multiLevelType w:val="hybridMultilevel"/>
     <w:tmpl w:val="AAEE0656"/>
@@ -31172,7 +31458,7 @@
       </w:pPr>
     </w:lvl>
   </w:abstractNum>
-  <w:abstractNum w:abstractNumId="57" w15:restartNumberingAfterBreak="0">
+  <w:abstractNum w:abstractNumId="58" w15:restartNumberingAfterBreak="0">
     <w:nsid w:val="6ECE1E77"/>
     <w:multiLevelType w:val="hybridMultilevel"/>
     <w:tmpl w:val="C6E27C0C"/>
@@ -31289,7 +31575,7 @@
       </w:rPr>
     </w:lvl>
   </w:abstractNum>
-  <w:abstractNum w:abstractNumId="58" w15:restartNumberingAfterBreak="0">
+  <w:abstractNum w:abstractNumId="59" w15:restartNumberingAfterBreak="0">
     <w:nsid w:val="71A16B67"/>
     <w:multiLevelType w:val="hybridMultilevel"/>
     <w:tmpl w:val="AA32EF98"/>
@@ -31379,7 +31665,7 @@
       </w:pPr>
     </w:lvl>
   </w:abstractNum>
-  <w:abstractNum w:abstractNumId="59" w15:restartNumberingAfterBreak="0">
+  <w:abstractNum w:abstractNumId="60" w15:restartNumberingAfterBreak="0">
     <w:nsid w:val="72F278EE"/>
     <w:multiLevelType w:val="hybridMultilevel"/>
     <w:tmpl w:val="351A7A9C"/>
@@ -31469,7 +31755,7 @@
       </w:pPr>
     </w:lvl>
   </w:abstractNum>
-  <w:abstractNum w:abstractNumId="60" w15:restartNumberingAfterBreak="0">
+  <w:abstractNum w:abstractNumId="61" w15:restartNumberingAfterBreak="0">
     <w:nsid w:val="73A67EF3"/>
     <w:multiLevelType w:val="hybridMultilevel"/>
     <w:tmpl w:val="61CC547A"/>
@@ -31559,7 +31845,7 @@
       </w:pPr>
     </w:lvl>
   </w:abstractNum>
-  <w:abstractNum w:abstractNumId="61" w15:restartNumberingAfterBreak="0">
+  <w:abstractNum w:abstractNumId="62" w15:restartNumberingAfterBreak="0">
     <w:nsid w:val="758E1936"/>
     <w:multiLevelType w:val="hybridMultilevel"/>
     <w:tmpl w:val="7FDA73A8"/>
@@ -31660,7 +31946,7 @@
       </w:pPr>
     </w:lvl>
   </w:abstractNum>
-  <w:abstractNum w:abstractNumId="62" w15:restartNumberingAfterBreak="0">
+  <w:abstractNum w:abstractNumId="63" w15:restartNumberingAfterBreak="0">
     <w:nsid w:val="775C434D"/>
     <w:multiLevelType w:val="hybridMultilevel"/>
     <w:tmpl w:val="1514EC56"/>
@@ -31750,7 +32036,7 @@
       </w:pPr>
     </w:lvl>
   </w:abstractNum>
-  <w:abstractNum w:abstractNumId="63" w15:restartNumberingAfterBreak="0">
+  <w:abstractNum w:abstractNumId="64" w15:restartNumberingAfterBreak="0">
     <w:nsid w:val="7765297A"/>
     <w:multiLevelType w:val="hybridMultilevel"/>
     <w:tmpl w:val="DE3AE1BE"/>
@@ -31854,7 +32140,7 @@
       </w:pPr>
     </w:lvl>
   </w:abstractNum>
-  <w:abstractNum w:abstractNumId="64" w15:restartNumberingAfterBreak="0">
+  <w:abstractNum w:abstractNumId="65" w15:restartNumberingAfterBreak="0">
     <w:nsid w:val="780D4B31"/>
     <w:multiLevelType w:val="hybridMultilevel"/>
     <w:tmpl w:val="21E0180A"/>
@@ -31944,7 +32230,7 @@
       </w:pPr>
     </w:lvl>
   </w:abstractNum>
-  <w:abstractNum w:abstractNumId="65" w15:restartNumberingAfterBreak="0">
+  <w:abstractNum w:abstractNumId="66" w15:restartNumberingAfterBreak="0">
     <w:nsid w:val="78192312"/>
     <w:multiLevelType w:val="hybridMultilevel"/>
     <w:tmpl w:val="277C0296"/>
@@ -32048,7 +32334,7 @@
       </w:pPr>
     </w:lvl>
   </w:abstractNum>
-  <w:abstractNum w:abstractNumId="66" w15:restartNumberingAfterBreak="0">
+  <w:abstractNum w:abstractNumId="67" w15:restartNumberingAfterBreak="0">
     <w:nsid w:val="7A8A629F"/>
     <w:multiLevelType w:val="hybridMultilevel"/>
     <w:tmpl w:val="28B061D2"/>
@@ -32138,7 +32424,7 @@
       </w:pPr>
     </w:lvl>
   </w:abstractNum>
-  <w:abstractNum w:abstractNumId="67" w15:restartNumberingAfterBreak="0">
+  <w:abstractNum w:abstractNumId="68" w15:restartNumberingAfterBreak="0">
     <w:nsid w:val="7AE4443B"/>
     <w:multiLevelType w:val="hybridMultilevel"/>
     <w:tmpl w:val="A042A68C"/>
@@ -32242,7 +32528,7 @@
       </w:pPr>
     </w:lvl>
   </w:abstractNum>
-  <w:abstractNum w:abstractNumId="68" w15:restartNumberingAfterBreak="0">
+  <w:abstractNum w:abstractNumId="69" w15:restartNumberingAfterBreak="0">
     <w:nsid w:val="7FEE1B22"/>
     <w:multiLevelType w:val="multilevel"/>
     <w:tmpl w:val="357C1CFC"/>
@@ -32384,206 +32670,206 @@
       </w:rPr>
     </w:lvl>
   </w:abstractNum>
-  <w:num w:numId="1" w16cid:durableId="710149397">
+  <w:num w:numId="1" w16cid:durableId="1504512487">
     <w:abstractNumId w:val="12"/>
   </w:num>
-  <w:num w:numId="2" w16cid:durableId="2077319020">
+  <w:num w:numId="2" w16cid:durableId="699159755">
+    <w:abstractNumId w:val="50"/>
+  </w:num>
+  <w:num w:numId="3" w16cid:durableId="1898467315">
+    <w:abstractNumId w:val="21"/>
+  </w:num>
+  <w:num w:numId="4" w16cid:durableId="734015489">
+    <w:abstractNumId w:val="56"/>
+  </w:num>
+  <w:num w:numId="5" w16cid:durableId="1450129388">
+    <w:abstractNumId w:val="42"/>
+  </w:num>
+  <w:num w:numId="6" w16cid:durableId="314342404">
+    <w:abstractNumId w:val="2"/>
+  </w:num>
+  <w:num w:numId="7" w16cid:durableId="1242914176">
+    <w:abstractNumId w:val="25"/>
+  </w:num>
+  <w:num w:numId="8" w16cid:durableId="358163189">
+    <w:abstractNumId w:val="37"/>
+  </w:num>
+  <w:num w:numId="9" w16cid:durableId="2001034188">
+    <w:abstractNumId w:val="29"/>
+  </w:num>
+  <w:num w:numId="10" w16cid:durableId="558829946">
+    <w:abstractNumId w:val="45"/>
+  </w:num>
+  <w:num w:numId="11" w16cid:durableId="1654141726">
+    <w:abstractNumId w:val="64"/>
+  </w:num>
+  <w:num w:numId="12" w16cid:durableId="2109882202">
+    <w:abstractNumId w:val="57"/>
+  </w:num>
+  <w:num w:numId="13" w16cid:durableId="1518228416">
+    <w:abstractNumId w:val="33"/>
+  </w:num>
+  <w:num w:numId="14" w16cid:durableId="1025062811">
+    <w:abstractNumId w:val="23"/>
+  </w:num>
+  <w:num w:numId="15" w16cid:durableId="1856263498">
+    <w:abstractNumId w:val="66"/>
+  </w:num>
+  <w:num w:numId="16" w16cid:durableId="1154377937">
+    <w:abstractNumId w:val="68"/>
+  </w:num>
+  <w:num w:numId="17" w16cid:durableId="147016600">
     <w:abstractNumId w:val="49"/>
   </w:num>
-  <w:num w:numId="3" w16cid:durableId="1724938127">
-    <w:abstractNumId w:val="21"/>
+  <w:num w:numId="18" w16cid:durableId="409470071">
+    <w:abstractNumId w:val="48"/>
   </w:num>
-  <w:num w:numId="4" w16cid:durableId="866716394">
+  <w:num w:numId="19" w16cid:durableId="547958362">
+    <w:abstractNumId w:val="13"/>
+  </w:num>
+  <w:num w:numId="20" w16cid:durableId="464003899">
+    <w:abstractNumId w:val="0"/>
+  </w:num>
+  <w:num w:numId="21" w16cid:durableId="1221329494">
+    <w:abstractNumId w:val="27"/>
+  </w:num>
+  <w:num w:numId="22" w16cid:durableId="1434595483">
+    <w:abstractNumId w:val="69"/>
+  </w:num>
+  <w:num w:numId="23" w16cid:durableId="1871335581">
+    <w:abstractNumId w:val="5"/>
+  </w:num>
+  <w:num w:numId="24" w16cid:durableId="1708723274">
+    <w:abstractNumId w:val="8"/>
+  </w:num>
+  <w:num w:numId="25" w16cid:durableId="1187140478">
+    <w:abstractNumId w:val="44"/>
+  </w:num>
+  <w:num w:numId="26" w16cid:durableId="324820368">
+    <w:abstractNumId w:val="3"/>
+  </w:num>
+  <w:num w:numId="27" w16cid:durableId="912932011">
+    <w:abstractNumId w:val="32"/>
+  </w:num>
+  <w:num w:numId="28" w16cid:durableId="599065413">
+    <w:abstractNumId w:val="60"/>
+  </w:num>
+  <w:num w:numId="29" w16cid:durableId="208881403">
+    <w:abstractNumId w:val="11"/>
+  </w:num>
+  <w:num w:numId="30" w16cid:durableId="1998916303">
+    <w:abstractNumId w:val="10"/>
+  </w:num>
+  <w:num w:numId="31" w16cid:durableId="654916541">
+    <w:abstractNumId w:val="16"/>
+  </w:num>
+  <w:num w:numId="32" w16cid:durableId="788285250">
+    <w:abstractNumId w:val="39"/>
+  </w:num>
+  <w:num w:numId="33" w16cid:durableId="1257596011">
+    <w:abstractNumId w:val="34"/>
+  </w:num>
+  <w:num w:numId="34" w16cid:durableId="1113404993">
+    <w:abstractNumId w:val="62"/>
+  </w:num>
+  <w:num w:numId="35" w16cid:durableId="187641260">
+    <w:abstractNumId w:val="36"/>
+  </w:num>
+  <w:num w:numId="36" w16cid:durableId="1734887266">
+    <w:abstractNumId w:val="6"/>
+  </w:num>
+  <w:num w:numId="37" w16cid:durableId="10687085">
+    <w:abstractNumId w:val="20"/>
+  </w:num>
+  <w:num w:numId="38" w16cid:durableId="1525749608">
+    <w:abstractNumId w:val="18"/>
+  </w:num>
+  <w:num w:numId="39" w16cid:durableId="541673313">
+    <w:abstractNumId w:val="4"/>
+  </w:num>
+  <w:num w:numId="40" w16cid:durableId="1879780820">
+    <w:abstractNumId w:val="7"/>
+  </w:num>
+  <w:num w:numId="41" w16cid:durableId="1806192206">
+    <w:abstractNumId w:val="67"/>
+  </w:num>
+  <w:num w:numId="42" w16cid:durableId="579801064">
+    <w:abstractNumId w:val="9"/>
+  </w:num>
+  <w:num w:numId="43" w16cid:durableId="1450468295">
+    <w:abstractNumId w:val="61"/>
+  </w:num>
+  <w:num w:numId="44" w16cid:durableId="1662613631">
     <w:abstractNumId w:val="55"/>
   </w:num>
-  <w:num w:numId="5" w16cid:durableId="2126266380">
+  <w:num w:numId="45" w16cid:durableId="355665098">
+    <w:abstractNumId w:val="52"/>
+  </w:num>
+  <w:num w:numId="46" w16cid:durableId="425619390">
+    <w:abstractNumId w:val="19"/>
+  </w:num>
+  <w:num w:numId="47" w16cid:durableId="1968703681">
+    <w:abstractNumId w:val="40"/>
+  </w:num>
+  <w:num w:numId="48" w16cid:durableId="1067264833">
+    <w:abstractNumId w:val="26"/>
+  </w:num>
+  <w:num w:numId="49" w16cid:durableId="1843273212">
+    <w:abstractNumId w:val="46"/>
+  </w:num>
+  <w:num w:numId="50" w16cid:durableId="46615570">
     <w:abstractNumId w:val="41"/>
   </w:num>
-  <w:num w:numId="6" w16cid:durableId="631907416">
-    <w:abstractNumId w:val="2"/>
-  </w:num>
-  <w:num w:numId="7" w16cid:durableId="487089789">
-    <w:abstractNumId w:val="25"/>
-  </w:num>
-  <w:num w:numId="8" w16cid:durableId="367722512">
-    <w:abstractNumId w:val="37"/>
-  </w:num>
-  <w:num w:numId="9" w16cid:durableId="711267230">
-    <w:abstractNumId w:val="29"/>
-  </w:num>
-  <w:num w:numId="10" w16cid:durableId="1712725572">
-    <w:abstractNumId w:val="44"/>
-  </w:num>
-  <w:num w:numId="11" w16cid:durableId="788937965">
+  <w:num w:numId="51" w16cid:durableId="1589073629">
     <w:abstractNumId w:val="63"/>
   </w:num>
-  <w:num w:numId="12" w16cid:durableId="1621303728">
-    <w:abstractNumId w:val="56"/>
+  <w:num w:numId="52" w16cid:durableId="405881743">
+    <w:abstractNumId w:val="47"/>
   </w:num>
-  <w:num w:numId="13" w16cid:durableId="1785272720">
-    <w:abstractNumId w:val="33"/>
+  <w:num w:numId="53" w16cid:durableId="1637711702">
+    <w:abstractNumId w:val="31"/>
   </w:num>
-  <w:num w:numId="14" w16cid:durableId="23135712">
-    <w:abstractNumId w:val="23"/>
+  <w:num w:numId="54" w16cid:durableId="1130517102">
+    <w:abstractNumId w:val="58"/>
   </w:num>
-  <w:num w:numId="15" w16cid:durableId="1375083554">
+  <w:num w:numId="55" w16cid:durableId="487210956">
+    <w:abstractNumId w:val="28"/>
+  </w:num>
+  <w:num w:numId="56" w16cid:durableId="889193853">
+    <w:abstractNumId w:val="30"/>
+  </w:num>
+  <w:num w:numId="57" w16cid:durableId="1736582264">
+    <w:abstractNumId w:val="15"/>
+  </w:num>
+  <w:num w:numId="58" w16cid:durableId="1075399622">
+    <w:abstractNumId w:val="22"/>
+  </w:num>
+  <w:num w:numId="59" w16cid:durableId="1174682169">
+    <w:abstractNumId w:val="51"/>
+  </w:num>
+  <w:num w:numId="60" w16cid:durableId="1954943496">
+    <w:abstractNumId w:val="1"/>
+  </w:num>
+  <w:num w:numId="61" w16cid:durableId="2141726398">
+    <w:abstractNumId w:val="14"/>
+  </w:num>
+  <w:num w:numId="62" w16cid:durableId="416291574">
+    <w:abstractNumId w:val="53"/>
+  </w:num>
+  <w:num w:numId="63" w16cid:durableId="1484152432">
+    <w:abstractNumId w:val="43"/>
+  </w:num>
+  <w:num w:numId="64" w16cid:durableId="1589119339">
+    <w:abstractNumId w:val="54"/>
+  </w:num>
+  <w:num w:numId="65" w16cid:durableId="339627015">
     <w:abstractNumId w:val="65"/>
   </w:num>
-  <w:num w:numId="16" w16cid:durableId="266038104">
-    <w:abstractNumId w:val="67"/>
-  </w:num>
-  <w:num w:numId="17" w16cid:durableId="541676552">
-    <w:abstractNumId w:val="48"/>
-  </w:num>
-  <w:num w:numId="18" w16cid:durableId="1988892795">
-    <w:abstractNumId w:val="47"/>
-  </w:num>
-  <w:num w:numId="19" w16cid:durableId="234554207">
-    <w:abstractNumId w:val="13"/>
-  </w:num>
-  <w:num w:numId="20" w16cid:durableId="1309826185">
-    <w:abstractNumId w:val="0"/>
-  </w:num>
-  <w:num w:numId="21" w16cid:durableId="589393718">
-    <w:abstractNumId w:val="27"/>
-  </w:num>
-  <w:num w:numId="22" w16cid:durableId="1078676130">
-    <w:abstractNumId w:val="68"/>
-  </w:num>
-  <w:num w:numId="23" w16cid:durableId="554050025">
-    <w:abstractNumId w:val="5"/>
-  </w:num>
-  <w:num w:numId="24" w16cid:durableId="562720535">
-    <w:abstractNumId w:val="8"/>
-  </w:num>
-  <w:num w:numId="25" w16cid:durableId="1369257453">
-    <w:abstractNumId w:val="43"/>
-  </w:num>
-  <w:num w:numId="26" w16cid:durableId="1800877969">
-    <w:abstractNumId w:val="3"/>
-  </w:num>
-  <w:num w:numId="27" w16cid:durableId="1242986141">
-    <w:abstractNumId w:val="32"/>
-  </w:num>
-  <w:num w:numId="28" w16cid:durableId="1520194291">
-    <w:abstractNumId w:val="59"/>
-  </w:num>
-  <w:num w:numId="29" w16cid:durableId="1403990392">
-    <w:abstractNumId w:val="11"/>
-  </w:num>
-  <w:num w:numId="30" w16cid:durableId="349064697">
-    <w:abstractNumId w:val="10"/>
-  </w:num>
-  <w:num w:numId="31" w16cid:durableId="1540707841">
-    <w:abstractNumId w:val="16"/>
-  </w:num>
-  <w:num w:numId="32" w16cid:durableId="1269776485">
-    <w:abstractNumId w:val="38"/>
-  </w:num>
-  <w:num w:numId="33" w16cid:durableId="114905588">
-    <w:abstractNumId w:val="34"/>
-  </w:num>
-  <w:num w:numId="34" w16cid:durableId="46611665">
-    <w:abstractNumId w:val="61"/>
-  </w:num>
-  <w:num w:numId="35" w16cid:durableId="1470904031">
-    <w:abstractNumId w:val="36"/>
-  </w:num>
-  <w:num w:numId="36" w16cid:durableId="541671677">
-    <w:abstractNumId w:val="6"/>
-  </w:num>
-  <w:num w:numId="37" w16cid:durableId="391386797">
-    <w:abstractNumId w:val="20"/>
-  </w:num>
-  <w:num w:numId="38" w16cid:durableId="150995948">
-    <w:abstractNumId w:val="18"/>
-  </w:num>
-  <w:num w:numId="39" w16cid:durableId="3292737">
-    <w:abstractNumId w:val="4"/>
-  </w:num>
-  <w:num w:numId="40" w16cid:durableId="186675256">
-    <w:abstractNumId w:val="7"/>
-  </w:num>
-  <w:num w:numId="41" w16cid:durableId="167798008">
-    <w:abstractNumId w:val="66"/>
-  </w:num>
-  <w:num w:numId="42" w16cid:durableId="470632961">
-    <w:abstractNumId w:val="9"/>
-  </w:num>
-  <w:num w:numId="43" w16cid:durableId="1477602513">
-    <w:abstractNumId w:val="60"/>
-  </w:num>
-  <w:num w:numId="44" w16cid:durableId="794445881">
-    <w:abstractNumId w:val="54"/>
-  </w:num>
-  <w:num w:numId="45" w16cid:durableId="1369069909">
-    <w:abstractNumId w:val="51"/>
-  </w:num>
-  <w:num w:numId="46" w16cid:durableId="819806134">
-    <w:abstractNumId w:val="19"/>
-  </w:num>
-  <w:num w:numId="47" w16cid:durableId="1598102865">
-    <w:abstractNumId w:val="39"/>
-  </w:num>
-  <w:num w:numId="48" w16cid:durableId="651064721">
-    <w:abstractNumId w:val="26"/>
-  </w:num>
-  <w:num w:numId="49" w16cid:durableId="1764646535">
-    <w:abstractNumId w:val="45"/>
-  </w:num>
-  <w:num w:numId="50" w16cid:durableId="1719739919">
-    <w:abstractNumId w:val="40"/>
-  </w:num>
-  <w:num w:numId="51" w16cid:durableId="697774968">
-    <w:abstractNumId w:val="62"/>
-  </w:num>
-  <w:num w:numId="52" w16cid:durableId="234249104">
-    <w:abstractNumId w:val="46"/>
-  </w:num>
-  <w:num w:numId="53" w16cid:durableId="514223236">
-    <w:abstractNumId w:val="31"/>
-  </w:num>
-  <w:num w:numId="54" w16cid:durableId="2128886930">
-    <w:abstractNumId w:val="57"/>
-  </w:num>
-  <w:num w:numId="55" w16cid:durableId="1557744476">
-    <w:abstractNumId w:val="28"/>
-  </w:num>
-  <w:num w:numId="56" w16cid:durableId="359858320">
-    <w:abstractNumId w:val="30"/>
-  </w:num>
-  <w:num w:numId="57" w16cid:durableId="779033548">
-    <w:abstractNumId w:val="15"/>
-  </w:num>
-  <w:num w:numId="58" w16cid:durableId="108358911">
-    <w:abstractNumId w:val="22"/>
-  </w:num>
-  <w:num w:numId="59" w16cid:durableId="660936227">
-    <w:abstractNumId w:val="50"/>
-  </w:num>
-  <w:num w:numId="60" w16cid:durableId="1593588252">
-    <w:abstractNumId w:val="1"/>
-  </w:num>
-  <w:num w:numId="61" w16cid:durableId="419445630">
-    <w:abstractNumId w:val="14"/>
-  </w:num>
-  <w:num w:numId="62" w16cid:durableId="1036271378">
-    <w:abstractNumId w:val="52"/>
-  </w:num>
-  <w:num w:numId="63" w16cid:durableId="1666350580">
-    <w:abstractNumId w:val="42"/>
-  </w:num>
-  <w:num w:numId="64" w16cid:durableId="1783840921">
-    <w:abstractNumId w:val="53"/>
-  </w:num>
-  <w:num w:numId="65" w16cid:durableId="784084616">
-    <w:abstractNumId w:val="64"/>
-  </w:num>
-  <w:num w:numId="66" w16cid:durableId="1263612336">
+  <w:num w:numId="66" w16cid:durableId="305277623">
     <w:abstractNumId w:val="24"/>
   </w:num>
-  <w:num w:numId="67" w16cid:durableId="730076751">
-    <w:abstractNumId w:val="64"/>
+  <w:num w:numId="67" w16cid:durableId="686059322">
+    <w:abstractNumId w:val="65"/>
     <w:lvlOverride w:ilvl="0">
       <w:lvl w:ilvl="0" w:tplc="EDB84DBA">
         <w:start w:val="1"/>
@@ -32688,13 +32974,16 @@
       </w:lvl>
     </w:lvlOverride>
   </w:num>
-  <w:num w:numId="68" w16cid:durableId="1547451732">
-    <w:abstractNumId w:val="58"/>
+  <w:num w:numId="68" w16cid:durableId="2008288704">
+    <w:abstractNumId w:val="59"/>
   </w:num>
-  <w:num w:numId="69" w16cid:durableId="147747682">
+  <w:num w:numId="69" w16cid:durableId="1034187072">
     <w:abstractNumId w:val="35"/>
   </w:num>
-  <w:num w:numId="70" w16cid:durableId="1861581866">
+  <w:num w:numId="70" w16cid:durableId="112137111">
+    <w:abstractNumId w:val="38"/>
+  </w:num>
+  <w:num w:numId="71" w16cid:durableId="853764166">
     <w:abstractNumId w:val="17"/>
   </w:num>
   <w:numIdMacAtCleanup w:val="69"/>
@@ -33741,6 +34030,37 @@
       </w:numPr>
     </w:pPr>
   </w:style>
+  <w:style w:type="paragraph" w:styleId="afb">
+    <w:name w:val="Balloon Text"/>
+    <w:basedOn w:val="a0"/>
+    <w:link w:val="afc"/>
+    <w:uiPriority w:val="99"/>
+    <w:semiHidden/>
+    <w:unhideWhenUsed/>
+    <w:rsid w:val="001F4FA4"/>
+    <w:pPr>
+      <w:spacing w:line="240" w:lineRule="auto"/>
+    </w:pPr>
+    <w:rPr>
+      <w:rFonts w:ascii="Segoe UI" w:hAnsi="Segoe UI" w:cs="Segoe UI"/>
+      <w:sz w:val="18"/>
+      <w:szCs w:val="18"/>
+    </w:rPr>
+  </w:style>
+  <w:style w:type="character" w:customStyle="1" w:styleId="afc">
+    <w:name w:val="Текст выноски Знак"/>
+    <w:basedOn w:val="a1"/>
+    <w:link w:val="afb"/>
+    <w:uiPriority w:val="99"/>
+    <w:semiHidden/>
+    <w:rsid w:val="001F4FA4"/>
+    <w:rPr>
+      <w:rFonts w:ascii="Segoe UI" w:eastAsia="Calibri" w:hAnsi="Segoe UI" w:cs="Segoe UI"/>
+      <w:sz w:val="18"/>
+      <w:szCs w:val="18"/>
+      <w:lang w:eastAsia="en-US"/>
+    </w:rPr>
+  </w:style>
 </w:styles>
 </file>
 
@@ -34044,7 +34364,7 @@
 </file>
 
 <file path=customXml/itemProps1.xml><?xml version="1.0" encoding="utf-8"?>
-<ds:datastoreItem xmlns:ds="http://schemas.openxmlformats.org/officeDocument/2006/customXml" ds:itemID="{C057A95F-C701-49BF-8A7D-25F5ED2F25DA}">
+<ds:datastoreItem xmlns:ds="http://schemas.openxmlformats.org/officeDocument/2006/customXml" ds:itemID="{3EC2B3E7-10E3-4DC4-B8C6-E0525266BAED}">
   <ds:schemaRefs>
     <ds:schemaRef ds:uri="http://schemas.openxmlformats.org/officeDocument/2006/bibliography"/>
   </ds:schemaRefs>

</xml_diff>